<commit_message>
Revisi paper: paradoks keamanan, design science, 36 kasus uji, false negative, dll
Bab I: paragraf paradoks keamanan (jembatan teknis-awam), revisi tujuan ke-3
  (36 kasus uji), manfaat praktis 3 mekanisme edukatif, batasan proof-of-concept.
Bab II: relevansi OWASP 2018, paragraf design science research (+ref Hevner b23),
  paragraf dimensi edukatif setelah tabel diferensiasi.
Bab III: Tabel IV (8 perangkat IoT) + paragraf pemilihan purposive.
Bab IV: justifikasi parameter skor (B_KRITIS=90, k=3) setelah Persamaan (1).
Bab V: pengujian unit 12->36 kasus uji (tabel lengkap per modul) + CI.
Bab VI: hasil 87,5%, peran edukatif, dominansi I2, analisis false negative;
  Kesimpulan & Saran disinkronkan.
Regenerasi homeguard_overleaf.tex (flattened) + .docx + PDF preview.

Co-Authored-By: Claude Sonnet 4.6 <noreply@anthropic.com>
Claude-Session: https://claude.ai/code/session_01SCvk2sv7i4VmZJAKiHwjn3
</commit_message>
<xml_diff>
--- a/paper/HomeGuard_paper.docx
+++ b/paper/HomeGuard_paper.docx
@@ -629,6 +629,80 @@
         <w:pStyle w:val="BodyText"/>
       </w:pPr>
       <w:r>
+        <w:t xml:space="preserve">Kesenjangan antara kompleksitas ancaman dan kapabilitas pengguna ini</w:t>
+      </w:r>
+      <w:r>
+        <w:t xml:space="preserve"> </w:t>
+      </w:r>
+      <w:r>
+        <w:t xml:space="preserve">menciptakan sebuah paradoks keamanan: perangkat IoT yang rentan terus</w:t>
+      </w:r>
+      <w:r>
+        <w:t xml:space="preserve"> </w:t>
+      </w:r>
+      <w:r>
+        <w:t xml:space="preserve">beroperasi bukan karena penggunanya tidak peduli, melainkan karena mereka tidak</w:t>
+      </w:r>
+      <w:r>
+        <w:t xml:space="preserve"> </w:t>
+      </w:r>
+      <w:r>
+        <w:t xml:space="preserve">memiliki visibilitas terhadap kondisi keamanan jaringan mereka sendiri.</w:t>
+      </w:r>
+      <w:r>
+        <w:t xml:space="preserve"> </w:t>
+      </w:r>
+      <w:r>
+        <w:t xml:space="preserve">Pengguna rumahan tidak mengetahui bahwa kamera IP mereka masih membuka port</w:t>
+      </w:r>
+      <w:r>
+        <w:t xml:space="preserve"> </w:t>
+      </w:r>
+      <w:r>
+        <w:t xml:space="preserve">Telnet dengan kredensial bawaan pabrik, atau bahwa router mereka menjalankan</w:t>
+      </w:r>
+      <w:r>
+        <w:t xml:space="preserve"> </w:t>
+      </w:r>
+      <w:r>
+        <w:t xml:space="preserve">firmware yang telah usang bertahun-tahun. Ketidaktahuan ini bukan kesalahan</w:t>
+      </w:r>
+      <w:r>
+        <w:t xml:space="preserve"> </w:t>
+      </w:r>
+      <w:r>
+        <w:t xml:space="preserve">pengguna — melainkan akibat dari absennya alat yang mampu menjembatani</w:t>
+      </w:r>
+      <w:r>
+        <w:t xml:space="preserve"> </w:t>
+      </w:r>
+      <w:r>
+        <w:t xml:space="preserve">kompleksitas teknis keamanan jaringan dengan kemampuan pemahaman pengguna</w:t>
+      </w:r>
+      <w:r>
+        <w:t xml:space="preserve"> </w:t>
+      </w:r>
+      <w:r>
+        <w:t xml:space="preserve">non-teknis. HomeGuard dirancang sebagai jembatan tersebut: sebuah pemindai yang</w:t>
+      </w:r>
+      <w:r>
+        <w:t xml:space="preserve"> </w:t>
+      </w:r>
+      <w:r>
+        <w:t xml:space="preserve">tidak hanya mendeteksi kerentanan, tetapi menerjemahkannya ke dalam bahasa yang</w:t>
+      </w:r>
+      <w:r>
+        <w:t xml:space="preserve"> </w:t>
+      </w:r>
+      <w:r>
+        <w:t xml:space="preserve">dapat dipahami dan ditindaklanjuti oleh pengguna awam.</w:t>
+      </w:r>
+    </w:p>
+    <w:p>
+      <w:pPr>
+        <w:pStyle w:val="BodyText"/>
+      </w:pPr>
+      <w:r>
         <w:t xml:space="preserve">Kesenjangan ini menimbulkan urgensi untuk mengembangkan solusi pemindaian</w:t>
       </w:r>
       <w:r>
@@ -880,13 +954,25 @@
         <w:t xml:space="preserve"> </w:t>
       </w:r>
       <w:r>
-        <w:t xml:space="preserve">kerentanan keamanan pada perangkat IoT melalui serangkaian pengujian pada</w:t>
-      </w:r>
-      <w:r>
-        <w:t xml:space="preserve"> </w:t>
-      </w:r>
-      <w:r>
-        <w:t xml:space="preserve">lingkungan jaringan rumah yang sebenarnya (real-world testing).</w:t>
+        <w:t xml:space="preserve">kerentanan keamanan pada perangkat IoT melalui pengujian unit terhadap 36</w:t>
+      </w:r>
+      <w:r>
+        <w:t xml:space="preserve"> </w:t>
+      </w:r>
+      <w:r>
+        <w:t xml:space="preserve">kasus uji dan pengujian fungsional pada lingkungan jaringan yang</w:t>
+      </w:r>
+      <w:r>
+        <w:t xml:space="preserve"> </w:t>
+      </w:r>
+      <w:r>
+        <w:t xml:space="preserve">terkontrol, sebagai bukti empiris kelayakan pendekatan integrasi yang</w:t>
+      </w:r>
+      <w:r>
+        <w:t xml:space="preserve"> </w:t>
+      </w:r>
+      <w:r>
+        <w:t xml:space="preserve">diusulkan.</w:t>
       </w:r>
     </w:p>
     <w:bookmarkEnd w:id="11"/>
@@ -914,25 +1000,99 @@
         <w:t xml:space="preserve"> </w:t>
       </w:r>
       <w:r>
-        <w:t xml:space="preserve">Menyediakan sebuah tools pemindai keamanan jaringan</w:t>
-      </w:r>
-      <w:r>
-        <w:t xml:space="preserve"> </w:t>
-      </w:r>
-      <w:r>
-        <w:t xml:space="preserve">yang open-source, mudah digunakan, dan dapat dioperasikan oleh pengguna rumahan</w:t>
-      </w:r>
-      <w:r>
-        <w:t xml:space="preserve"> </w:t>
-      </w:r>
-      <w:r>
-        <w:t xml:space="preserve">tanpa memerlukan keahlian teknis mendalam untuk mengaudit keamanan jaringan</w:t>
-      </w:r>
-      <w:r>
-        <w:t xml:space="preserve"> </w:t>
-      </w:r>
-      <w:r>
-        <w:t xml:space="preserve">Wi-Fi dan perangkat IoT miliknya.</w:t>
+        <w:t xml:space="preserve">Menyediakan sebuah perkakas pemindai keamanan</w:t>
+      </w:r>
+      <w:r>
+        <w:t xml:space="preserve"> </w:t>
+      </w:r>
+      <w:r>
+        <w:t xml:space="preserve">jaringan yang open-source, beroperasi lokal tanpa mengirim data ke cloud, dan</w:t>
+      </w:r>
+      <w:r>
+        <w:t xml:space="preserve"> </w:t>
+      </w:r>
+      <w:r>
+        <w:t xml:space="preserve">dapat dioperasikan oleh pengguna rumahan tanpa keahlian teknis mendalam.</w:t>
+      </w:r>
+      <w:r>
+        <w:t xml:space="preserve"> </w:t>
+      </w:r>
+      <w:r>
+        <w:t xml:space="preserve">Berbeda dari perkakas profesional yang menghasilkan keluaran teknis mentah,</w:t>
+      </w:r>
+      <w:r>
+        <w:t xml:space="preserve"> </w:t>
+      </w:r>
+      <w:r>
+        <w:t xml:space="preserve">HomeGuard berperan sebagai</w:t>
+      </w:r>
+      <w:r>
+        <w:t xml:space="preserve"> </w:t>
+      </w:r>
+      <w:r>
+        <w:rPr>
+          <w:i/>
+          <w:iCs/>
+        </w:rPr>
+        <w:t xml:space="preserve">educator</w:t>
+      </w:r>
+      <w:r>
+        <w:t xml:space="preserve"> </w:t>
+      </w:r>
+      <w:r>
+        <w:t xml:space="preserve">bagi pengguna awam melalui tiga</w:t>
+      </w:r>
+      <w:r>
+        <w:t xml:space="preserve"> </w:t>
+      </w:r>
+      <w:r>
+        <w:t xml:space="preserve">mekanisme: (1) menerjemahkan temuan teknis ke dalam skor risiko intuitif</w:t>
+      </w:r>
+      <w:r>
+        <w:t xml:space="preserve"> </w:t>
+      </w:r>
+      <w:r>
+        <w:t xml:space="preserve">(0–100) dan tingkat keparahan yang mudah dipahami; (2) menyertakan rekomendasi</w:t>
+      </w:r>
+      <w:r>
+        <w:t xml:space="preserve"> </w:t>
+      </w:r>
+      <w:r>
+        <w:t xml:space="preserve">mitigasi</w:t>
+      </w:r>
+      <w:r>
+        <w:t xml:space="preserve"> </w:t>
+      </w:r>
+      <w:r>
+        <w:rPr>
+          <w:i/>
+          <w:iCs/>
+        </w:rPr>
+        <w:t xml:space="preserve">actionable</w:t>
+      </w:r>
+      <w:r>
+        <w:t xml:space="preserve"> </w:t>
+      </w:r>
+      <w:r>
+        <w:t xml:space="preserve">dalam Bahasa Indonesia untuk setiap temuan; dan</w:t>
+      </w:r>
+      <w:r>
+        <w:t xml:space="preserve"> </w:t>
+      </w:r>
+      <w:r>
+        <w:t xml:space="preserve">(3) menyajikan referensi OWASP IoT Top 10 secara kontekstual sehingga pengguna</w:t>
+      </w:r>
+      <w:r>
+        <w:t xml:space="preserve"> </w:t>
+      </w:r>
+      <w:r>
+        <w:t xml:space="preserve">tidak hanya mengetahui bahwa perangkat mereka rentan, tetapi juga memahami</w:t>
+      </w:r>
+      <w:r>
+        <w:t xml:space="preserve"> </w:t>
+      </w:r>
+      <w:r>
+        <w:t xml:space="preserve">mengapa hal tersebut berbahaya dan langkah konkret apa yang dapat diambil.</w:t>
       </w:r>
     </w:p>
     <w:p>
@@ -1087,6 +1247,35 @@
         <w:t xml:space="preserve">Streamlit.</w:t>
       </w:r>
     </w:p>
+    <w:p>
+      <w:pPr>
+        <w:numPr>
+          <w:ilvl w:val="0"/>
+          <w:numId w:val="1003"/>
+        </w:numPr>
+      </w:pPr>
+      <w:r>
+        <w:t xml:space="preserve">Hasil pengujian tidak dimaksudkan untuk generalisasi statistik</w:t>
+      </w:r>
+      <w:r>
+        <w:t xml:space="preserve"> </w:t>
+      </w:r>
+      <w:r>
+        <w:t xml:space="preserve">terhadap seluruh jaringan Wi-Fi domestik, melainkan sebagai bukti konsep</w:t>
+      </w:r>
+      <w:r>
+        <w:t xml:space="preserve"> </w:t>
+      </w:r>
+      <w:r>
+        <w:t xml:space="preserve">(proof-of-concept) yang mendemonstrasikan kemampuan aplikasi dalam</w:t>
+      </w:r>
+      <w:r>
+        <w:t xml:space="preserve"> </w:t>
+      </w:r>
+      <w:r>
+        <w:t xml:space="preserve">mendeteksi kerentanan pada skenario jaringan rumah yang representatif.</w:t>
+      </w:r>
+    </w:p>
     <w:bookmarkEnd w:id="13"/>
     <w:bookmarkEnd w:id="14"/>
     <w:bookmarkStart w:id="32" w:name="tinjauan-pustaka"/>
@@ -1779,6 +1968,68 @@
       </w:r>
       <w:r>
         <w:t xml:space="preserve">risiko yang terstandarisasi.</w:t>
+      </w:r>
+    </w:p>
+    <w:p>
+      <w:pPr>
+        <w:pStyle w:val="BodyText"/>
+      </w:pPr>
+      <w:r>
+        <w:t xml:space="preserve">Meskipun diterbitkan pada tahun 2018, OWASP IoT Top 10 tetap menjadi kerangka</w:t>
+      </w:r>
+      <w:r>
+        <w:t xml:space="preserve"> </w:t>
+      </w:r>
+      <w:r>
+        <w:t xml:space="preserve">acuan yang paling banyak dikutip dalam literatur akademik keamanan IoT hingga</w:t>
+      </w:r>
+      <w:r>
+        <w:t xml:space="preserve"> </w:t>
+      </w:r>
+      <w:r>
+        <w:t xml:space="preserve">saat ini. Hal ini disebabkan oleh dua faktor: pertama, OWASP Foundation belum</w:t>
+      </w:r>
+      <w:r>
+        <w:t xml:space="preserve"> </w:t>
+      </w:r>
+      <w:r>
+        <w:t xml:space="preserve">menerbitkan versi pembaruan resmi untuk kategori IoT — berbeda dengan OWASP</w:t>
+      </w:r>
+      <w:r>
+        <w:t xml:space="preserve"> </w:t>
+      </w:r>
+      <w:r>
+        <w:t xml:space="preserve">Web Top 10 dan Mobile Top 10 yang telah diperbarui secara berkala; kedua,</w:t>
+      </w:r>
+      <w:r>
+        <w:t xml:space="preserve"> </w:t>
+      </w:r>
+      <w:r>
+        <w:t xml:space="preserve">kategori kerentanan yang diidentifikasi pada versi 2018 — seperti penggunaan</w:t>
+      </w:r>
+      <w:r>
+        <w:t xml:space="preserve"> </w:t>
+      </w:r>
+      <w:r>
+        <w:t xml:space="preserve">kredensial bawaan (I1), layanan jaringan tidak aman (I2), dan transfer data</w:t>
+      </w:r>
+      <w:r>
+        <w:t xml:space="preserve"> </w:t>
+      </w:r>
+      <w:r>
+        <w:t xml:space="preserve">tidak terenkripsi (I7) — terbukti tetap relevan karena masih menjadi vektor</w:t>
+      </w:r>
+      <w:r>
+        <w:t xml:space="preserve"> </w:t>
+      </w:r>
+      <w:r>
+        <w:t xml:space="preserve">eksploitasi utama pada insiden keamanan IoT kontemporer, termasuk varian botnet</w:t>
+      </w:r>
+      <w:r>
+        <w:t xml:space="preserve"> </w:t>
+      </w:r>
+      <w:r>
+        <w:t xml:space="preserve">pasca-Mirai yang terus mengeksploitasi pola kerentanan yang sama.</w:t>
       </w:r>
     </w:p>
     <w:bookmarkEnd w:id="17"/>
@@ -4003,6 +4254,66 @@
         <w:pStyle w:val="FirstParagraph"/>
       </w:pPr>
       <w:r>
+        <w:t xml:space="preserve">Dalam paradigma</w:t>
+      </w:r>
+      <w:r>
+        <w:t xml:space="preserve"> </w:t>
+      </w:r>
+      <w:r>
+        <w:rPr>
+          <w:i/>
+          <w:iCs/>
+        </w:rPr>
+        <w:t xml:space="preserve">design science research</w:t>
+      </w:r>
+      <w:r>
+        <w:t xml:space="preserve"> </w:t>
+      </w:r>
+      <w:r>
+        <w:t xml:space="preserve">, kontribusi ilmiah</w:t>
+      </w:r>
+      <w:r>
+        <w:t xml:space="preserve"> </w:t>
+      </w:r>
+      <w:r>
+        <w:t xml:space="preserve">tidak selalu berbentuk teknik atau algoritma baru, melainkan dapat berupa</w:t>
+      </w:r>
+      <w:r>
+        <w:t xml:space="preserve"> </w:t>
+      </w:r>
+      <w:r>
+        <w:t xml:space="preserve">artefak — perangkat lunak, metode, atau model — yang secara inovatif</w:t>
+      </w:r>
+      <w:r>
+        <w:t xml:space="preserve"> </w:t>
+      </w:r>
+      <w:r>
+        <w:t xml:space="preserve">mengintegrasikan kapabilitas yang ada untuk menjawab masalah yang belum</w:t>
+      </w:r>
+      <w:r>
+        <w:t xml:space="preserve"> </w:t>
+      </w:r>
+      <w:r>
+        <w:t xml:space="preserve">terpecahkan. Kontribusi HomeGuard berada pada level ini: bukan pada penemuan</w:t>
+      </w:r>
+      <w:r>
+        <w:t xml:space="preserve"> </w:t>
+      </w:r>
+      <w:r>
+        <w:t xml:space="preserve">teknik pemindaian baru, melainkan pada desain integrasi yang mengisi celah</w:t>
+      </w:r>
+      <w:r>
+        <w:t xml:space="preserve"> </w:t>
+      </w:r>
+      <w:r>
+        <w:t xml:space="preserve">spesifik di antara dua kutub perkakas yang ada.</w:t>
+      </w:r>
+    </w:p>
+    <w:p>
+      <w:pPr>
+        <w:pStyle w:val="BodyText"/>
+      </w:pPr>
+      <w:r>
         <w:t xml:space="preserve">Posisi pembeda ini diringkas pada Tabel </w:t>
       </w:r>
       <w:hyperlink w:anchor="tab:diferensiasi">
@@ -4704,6 +5015,68 @@
         <w:pStyle w:val="BodyText"/>
       </w:pPr>
       <w:r>
+        <w:t xml:space="preserve">Dimensi edukatif ini merupakan aspek yang paling membedakan HomeGuard dari</w:t>
+      </w:r>
+      <w:r>
+        <w:t xml:space="preserve"> </w:t>
+      </w:r>
+      <w:r>
+        <w:t xml:space="preserve">seluruh perkakas yang dibandingkan. Perkakas profesional seperti Nmap</w:t>
+      </w:r>
+      <w:r>
+        <w:t xml:space="preserve"> </w:t>
+      </w:r>
+      <w:r>
+        <w:t xml:space="preserve">menghasilkan daftar port terbuka dalam format teknis yang membutuhkan keahlian</w:t>
+      </w:r>
+      <w:r>
+        <w:t xml:space="preserve"> </w:t>
+      </w:r>
+      <w:r>
+        <w:t xml:space="preserve">interpretasi tersendiri; Nessus menghasilkan laporan dengan referensi CVE dan</w:t>
+      </w:r>
+      <w:r>
+        <w:t xml:space="preserve"> </w:t>
+      </w:r>
+      <w:r>
+        <w:t xml:space="preserve">skor CVSS yang tidak bermakna bagi pengguna non-teknis. Di sisi lain, perkakas</w:t>
+      </w:r>
+      <w:r>
+        <w:t xml:space="preserve"> </w:t>
+      </w:r>
+      <w:r>
+        <w:t xml:space="preserve">konsumen seperti Fing hanya memberikan label keamanan umum tanpa menjelaskan</w:t>
+      </w:r>
+      <w:r>
+        <w:t xml:space="preserve"> </w:t>
+      </w:r>
+      <w:r>
+        <w:t xml:space="preserve">mengapa sebuah kondisi berbahaya atau apa yang harus dilakukan. HomeGuard</w:t>
+      </w:r>
+      <w:r>
+        <w:t xml:space="preserve"> </w:t>
+      </w:r>
+      <w:r>
+        <w:t xml:space="preserve">mengisi celah ini dengan menjadi jembatan antara kompleksitas teknis keamanan</w:t>
+      </w:r>
+      <w:r>
+        <w:t xml:space="preserve"> </w:t>
+      </w:r>
+      <w:r>
+        <w:t xml:space="preserve">jaringan dan kapabilitas pemahaman pengguna awam — sebuah peran yang belum</w:t>
+      </w:r>
+      <w:r>
+        <w:t xml:space="preserve"> </w:t>
+      </w:r>
+      <w:r>
+        <w:t xml:space="preserve">diperankan oleh perkakas manapun dalam kategori yang ditinjau.</w:t>
+      </w:r>
+    </w:p>
+    <w:p>
+      <w:pPr>
+        <w:pStyle w:val="BodyText"/>
+      </w:pPr>
+      <w:r>
         <w:t xml:space="preserve">Singkatnya, tidak ada satu pun perkakas terdahulu yang secara simultan</w:t>
       </w:r>
       <w:r>
@@ -4752,7 +5125,7 @@
     </w:p>
     <w:bookmarkEnd w:id="31"/>
     <w:bookmarkEnd w:id="32"/>
-    <w:bookmarkStart w:id="37" w:name="metodologi-penelitian"/>
+    <w:bookmarkStart w:id="38" w:name="metodologi-penelitian"/>
     <w:p>
       <w:pPr>
         <w:pStyle w:val="Heading1"/>
@@ -5191,7 +5564,7 @@
       </w:r>
     </w:p>
     <w:bookmarkEnd w:id="34"/>
-    <w:bookmarkStart w:id="35" w:name="alat-dan-bahan"/>
+    <w:bookmarkStart w:id="36" w:name="alat-dan-bahan"/>
     <w:p>
       <w:pPr>
         <w:pStyle w:val="Heading2"/>
@@ -5301,23 +5674,466 @@
         <w:t xml:space="preserve"> </w:t>
       </w:r>
       <w:r>
-        <w:t xml:space="preserve">jaringan Wi-Fi domestik dengan beragam perangkat IoT (mis. kamera IP,</w:t>
-      </w:r>
-      <w:r>
-        <w:t xml:space="preserve"> </w:t>
-      </w:r>
-      <w:r>
-        <w:rPr>
-          <w:i/>
-          <w:iCs/>
-        </w:rPr>
-        <w:t xml:space="preserve">smart plug</w:t>
-      </w:r>
-      <w:r>
-        <w:t xml:space="preserve">, dan</w:t>
-      </w:r>
-      <w:r>
-        <w:t xml:space="preserve"> </w:t>
+        <w:t xml:space="preserve">jaringan Wi-Fi domestik dengan beragam perangkat IoT yang dirangkum pada</w:t>
+      </w:r>
+      <w:r>
+        <w:t xml:space="preserve"> </w:t>
+      </w:r>
+      <w:r>
+        <w:t xml:space="preserve">Tabel </w:t>
+      </w:r>
+      <w:hyperlink w:anchor="tab:perangkat">
+        <w:r>
+          <w:rPr>
+            <w:rStyle w:val="Hyperlink"/>
+          </w:rPr>
+          <w:t xml:space="preserve">2</w:t>
+        </w:r>
+      </w:hyperlink>
+      <w:r>
+        <w:t xml:space="preserve">.</w:t>
+      </w:r>
+    </w:p>
+    <w:bookmarkStart w:id="35" w:name="tab:perangkat"/>
+    <w:p>
+      <w:pPr>
+        <w:pStyle w:val="TableCaption"/>
+      </w:pPr>
+      <w:r>
+        <w:t xml:space="preserve">Perangkat IoT pada Pengujian Jaringan Rumah</w:t>
+      </w:r>
+    </w:p>
+    <w:tbl>
+      <w:tblPr>
+        <w:tblStyle w:val="Table"/>
+        <w:tblW w:type="auto" w:w="0"/>
+        <w:tblLook w:firstRow="1" w:lastRow="0" w:firstColumn="0" w:lastColumn="0" w:noHBand="0" w:noVBand="0" w:val="0020"/>
+        <w:tblCaption w:val="Perangkat IoT pada Pengujian Jaringan Rumah"/>
+      </w:tblPr>
+      <w:tblGrid>
+        <w:gridCol w:w="2640"/>
+        <w:gridCol w:w="2640"/>
+        <w:gridCol w:w="2640"/>
+      </w:tblGrid>
+      <w:tr>
+        <w:trPr>
+          <w:tblHeader w:val="on"/>
+        </w:trPr>
+        <w:tc>
+          <w:tcPr/>
+          <w:p>
+            <w:pPr>
+              <w:pStyle w:val="Compact"/>
+              <w:jc w:val="center"/>
+            </w:pPr>
+            <w:r>
+              <w:rPr>
+                <w:b/>
+                <w:bCs/>
+              </w:rPr>
+              <w:t xml:space="preserve">No</w:t>
+            </w:r>
+          </w:p>
+        </w:tc>
+        <w:tc>
+          <w:tcPr/>
+          <w:p>
+            <w:pPr>
+              <w:pStyle w:val="Compact"/>
+              <w:jc w:val="left"/>
+            </w:pPr>
+            <w:r>
+              <w:rPr>
+                <w:b/>
+                <w:bCs/>
+              </w:rPr>
+              <w:t xml:space="preserve">Perangkat</w:t>
+            </w:r>
+          </w:p>
+        </w:tc>
+        <w:tc>
+          <w:tcPr/>
+          <w:p>
+            <w:pPr>
+              <w:pStyle w:val="Compact"/>
+              <w:jc w:val="left"/>
+            </w:pPr>
+            <w:r>
+              <w:rPr>
+                <w:b/>
+                <w:bCs/>
+              </w:rPr>
+              <w:t xml:space="preserve">Kategori</w:t>
+            </w:r>
+          </w:p>
+        </w:tc>
+      </w:tr>
+      <w:tr>
+        <w:tc>
+          <w:tcPr/>
+          <w:p>
+            <w:pPr>
+              <w:pStyle w:val="Compact"/>
+              <w:jc w:val="center"/>
+            </w:pPr>
+            <w:r>
+              <w:t xml:space="preserve">1</w:t>
+            </w:r>
+          </w:p>
+        </w:tc>
+        <w:tc>
+          <w:tcPr/>
+          <w:p>
+            <w:pPr>
+              <w:pStyle w:val="Compact"/>
+              <w:jc w:val="left"/>
+            </w:pPr>
+            <w:r>
+              <w:t xml:space="preserve">Kamera IP</w:t>
+            </w:r>
+          </w:p>
+        </w:tc>
+        <w:tc>
+          <w:tcPr/>
+          <w:p>
+            <w:pPr>
+              <w:pStyle w:val="Compact"/>
+              <w:jc w:val="left"/>
+            </w:pPr>
+            <w:r>
+              <w:t xml:space="preserve">Pengawasan</w:t>
+            </w:r>
+          </w:p>
+        </w:tc>
+      </w:tr>
+      <w:tr>
+        <w:tc>
+          <w:tcPr/>
+          <w:p>
+            <w:pPr>
+              <w:pStyle w:val="Compact"/>
+              <w:jc w:val="center"/>
+            </w:pPr>
+            <w:r>
+              <w:t xml:space="preserve">2</w:t>
+            </w:r>
+          </w:p>
+        </w:tc>
+        <w:tc>
+          <w:tcPr/>
+          <w:p>
+            <w:pPr>
+              <w:pStyle w:val="Compact"/>
+              <w:jc w:val="left"/>
+            </w:pPr>
+            <w:r>
+              <w:t xml:space="preserve">Router</w:t>
+            </w:r>
+          </w:p>
+        </w:tc>
+        <w:tc>
+          <w:tcPr/>
+          <w:p>
+            <w:pPr>
+              <w:pStyle w:val="Compact"/>
+              <w:jc w:val="left"/>
+            </w:pPr>
+            <w:r>
+              <w:t xml:space="preserve">Infrastruktur jaringan</w:t>
+            </w:r>
+          </w:p>
+        </w:tc>
+      </w:tr>
+      <w:tr>
+        <w:tc>
+          <w:tcPr/>
+          <w:p>
+            <w:pPr>
+              <w:pStyle w:val="Compact"/>
+              <w:jc w:val="center"/>
+            </w:pPr>
+            <w:r>
+              <w:t xml:space="preserve">3</w:t>
+            </w:r>
+          </w:p>
+        </w:tc>
+        <w:tc>
+          <w:tcPr/>
+          <w:p>
+            <w:pPr>
+              <w:pStyle w:val="Compact"/>
+              <w:jc w:val="left"/>
+            </w:pPr>
+            <w:r>
+              <w:t xml:space="preserve">Smart TV</w:t>
+            </w:r>
+          </w:p>
+        </w:tc>
+        <w:tc>
+          <w:tcPr/>
+          <w:p>
+            <w:pPr>
+              <w:pStyle w:val="Compact"/>
+              <w:jc w:val="left"/>
+            </w:pPr>
+            <w:r>
+              <w:t xml:space="preserve">Hiburan</w:t>
+            </w:r>
+          </w:p>
+        </w:tc>
+      </w:tr>
+      <w:tr>
+        <w:tc>
+          <w:tcPr/>
+          <w:p>
+            <w:pPr>
+              <w:pStyle w:val="Compact"/>
+              <w:jc w:val="center"/>
+            </w:pPr>
+            <w:r>
+              <w:t xml:space="preserve">4</w:t>
+            </w:r>
+          </w:p>
+        </w:tc>
+        <w:tc>
+          <w:tcPr/>
+          <w:p>
+            <w:pPr>
+              <w:pStyle w:val="Compact"/>
+              <w:jc w:val="left"/>
+            </w:pPr>
+            <w:r>
+              <w:t xml:space="preserve">Printer jaringan</w:t>
+            </w:r>
+          </w:p>
+        </w:tc>
+        <w:tc>
+          <w:tcPr/>
+          <w:p>
+            <w:pPr>
+              <w:pStyle w:val="Compact"/>
+              <w:jc w:val="left"/>
+            </w:pPr>
+            <w:r>
+              <w:t xml:space="preserve">Produktivitas</w:t>
+            </w:r>
+          </w:p>
+        </w:tc>
+      </w:tr>
+      <w:tr>
+        <w:tc>
+          <w:tcPr/>
+          <w:p>
+            <w:pPr>
+              <w:pStyle w:val="Compact"/>
+              <w:jc w:val="center"/>
+            </w:pPr>
+            <w:r>
+              <w:t xml:space="preserve">5</w:t>
+            </w:r>
+          </w:p>
+        </w:tc>
+        <w:tc>
+          <w:tcPr/>
+          <w:p>
+            <w:pPr>
+              <w:pStyle w:val="Compact"/>
+              <w:jc w:val="left"/>
+            </w:pPr>
+            <w:r>
+              <w:t xml:space="preserve">Smart plug</w:t>
+            </w:r>
+          </w:p>
+        </w:tc>
+        <w:tc>
+          <w:tcPr/>
+          <w:p>
+            <w:pPr>
+              <w:pStyle w:val="Compact"/>
+              <w:jc w:val="left"/>
+            </w:pPr>
+            <w:r>
+              <w:t xml:space="preserve">Otomasi</w:t>
+            </w:r>
+          </w:p>
+        </w:tc>
+      </w:tr>
+      <w:tr>
+        <w:tc>
+          <w:tcPr/>
+          <w:p>
+            <w:pPr>
+              <w:pStyle w:val="Compact"/>
+              <w:jc w:val="center"/>
+            </w:pPr>
+            <w:r>
+              <w:t xml:space="preserve">6</w:t>
+            </w:r>
+          </w:p>
+        </w:tc>
+        <w:tc>
+          <w:tcPr/>
+          <w:p>
+            <w:pPr>
+              <w:pStyle w:val="Compact"/>
+              <w:jc w:val="left"/>
+            </w:pPr>
+            <w:r>
+              <w:t xml:space="preserve">Smart speaker</w:t>
+            </w:r>
+          </w:p>
+        </w:tc>
+        <w:tc>
+          <w:tcPr/>
+          <w:p>
+            <w:pPr>
+              <w:pStyle w:val="Compact"/>
+              <w:jc w:val="left"/>
+            </w:pPr>
+            <w:r>
+              <w:t xml:space="preserve">Asisten suara</w:t>
+            </w:r>
+          </w:p>
+        </w:tc>
+      </w:tr>
+      <w:tr>
+        <w:tc>
+          <w:tcPr/>
+          <w:p>
+            <w:pPr>
+              <w:pStyle w:val="Compact"/>
+              <w:jc w:val="center"/>
+            </w:pPr>
+            <w:r>
+              <w:t xml:space="preserve">7</w:t>
+            </w:r>
+          </w:p>
+        </w:tc>
+        <w:tc>
+          <w:tcPr/>
+          <w:p>
+            <w:pPr>
+              <w:pStyle w:val="Compact"/>
+              <w:jc w:val="left"/>
+            </w:pPr>
+            <w:r>
+              <w:t xml:space="preserve">Single-board computer</w:t>
+            </w:r>
+          </w:p>
+        </w:tc>
+        <w:tc>
+          <w:tcPr/>
+          <w:p>
+            <w:pPr>
+              <w:pStyle w:val="Compact"/>
+              <w:jc w:val="left"/>
+            </w:pPr>
+            <w:r>
+              <w:t xml:space="preserve">Komputasi umum</w:t>
+            </w:r>
+          </w:p>
+        </w:tc>
+      </w:tr>
+      <w:tr>
+        <w:tc>
+          <w:tcPr/>
+          <w:p>
+            <w:pPr>
+              <w:pStyle w:val="Compact"/>
+              <w:jc w:val="center"/>
+            </w:pPr>
+            <w:r>
+              <w:t xml:space="preserve">8</w:t>
+            </w:r>
+          </w:p>
+        </w:tc>
+        <w:tc>
+          <w:tcPr/>
+          <w:p>
+            <w:pPr>
+              <w:pStyle w:val="Compact"/>
+              <w:jc w:val="left"/>
+            </w:pPr>
+            <w:r>
+              <w:t xml:space="preserve">Laptop pengguna</w:t>
+            </w:r>
+          </w:p>
+        </w:tc>
+        <w:tc>
+          <w:tcPr/>
+          <w:p>
+            <w:pPr>
+              <w:pStyle w:val="Compact"/>
+              <w:jc w:val="left"/>
+            </w:pPr>
+            <w:r>
+              <w:t xml:space="preserve">Perangkat kontrol</w:t>
+            </w:r>
+          </w:p>
+        </w:tc>
+      </w:tr>
+    </w:tbl>
+    <w:bookmarkEnd w:id="35"/>
+    <w:p>
+      <w:pPr>
+        <w:pStyle w:val="BodyText"/>
+      </w:pPr>
+      <w:r>
+        <w:t xml:space="preserve">Delapan perangkat IoT pada Tabel </w:t>
+      </w:r>
+      <w:hyperlink w:anchor="tab:perangkat">
+        <w:r>
+          <w:rPr>
+            <w:rStyle w:val="Hyperlink"/>
+          </w:rPr>
+          <w:t xml:space="preserve">2</w:t>
+        </w:r>
+      </w:hyperlink>
+      <w:r>
+        <w:t xml:space="preserve"> </w:t>
+      </w:r>
+      <w:r>
+        <w:t xml:space="preserve">dipilih secara</w:t>
+      </w:r>
+      <w:r>
+        <w:t xml:space="preserve"> </w:t>
+      </w:r>
+      <w:r>
+        <w:rPr>
+          <w:i/>
+          <w:iCs/>
+        </w:rPr>
+        <w:t xml:space="preserve">purposive</w:t>
+      </w:r>
+      <w:r>
+        <w:t xml:space="preserve"> </w:t>
+      </w:r>
+      <w:r>
+        <w:t xml:space="preserve">untuk merepresentasikan kategori umum perangkat IoT yang</w:t>
+      </w:r>
+      <w:r>
+        <w:t xml:space="preserve"> </w:t>
+      </w:r>
+      <w:r>
+        <w:t xml:space="preserve">paling banyak ditemukan di lingkungan rumah tangga Indonesia, mencakup</w:t>
+      </w:r>
+      <w:r>
+        <w:t xml:space="preserve"> </w:t>
+      </w:r>
+      <w:r>
+        <w:t xml:space="preserve">perangkat pengawasan (kamera IP), infrastruktur jaringan (router), hiburan</w:t>
+      </w:r>
+      <w:r>
+        <w:t xml:space="preserve"> </w:t>
+      </w:r>
+      <w:r>
+        <w:t xml:space="preserve">(smart TV), produktivitas (printer jaringan), otomasi (smart plug), asisten</w:t>
+      </w:r>
+      <w:r>
+        <w:t xml:space="preserve"> </w:t>
+      </w:r>
+      <w:r>
+        <w:t xml:space="preserve">suara (smart speaker), komputasi umum (</w:t>
       </w:r>
       <w:r>
         <w:rPr>
@@ -5327,11 +6143,53 @@
         <w:t xml:space="preserve">single-board computer</w:t>
       </w:r>
       <w:r>
-        <w:t xml:space="preserve">).</w:t>
-      </w:r>
-    </w:p>
-    <w:bookmarkEnd w:id="35"/>
-    <w:bookmarkStart w:id="36" w:name="prinsip-etika-penelitian"/>
+        <w:t xml:space="preserve">), dan</w:t>
+      </w:r>
+      <w:r>
+        <w:t xml:space="preserve"> </w:t>
+      </w:r>
+      <w:r>
+        <w:t xml:space="preserve">perangkat kontrol (laptop pengguna). Pemilihan ini mengacu pada kategori</w:t>
+      </w:r>
+      <w:r>
+        <w:t xml:space="preserve"> </w:t>
+      </w:r>
+      <w:r>
+        <w:t xml:space="preserve">perangkat yang diidentifikasi oleh Bitdefender </w:t>
+      </w:r>
+      <w:r>
+        <w:t xml:space="preserve"> </w:t>
+      </w:r>
+      <w:r>
+        <w:t xml:space="preserve">sebagai perangkat IoT</w:t>
+      </w:r>
+      <w:r>
+        <w:t xml:space="preserve"> </w:t>
+      </w:r>
+      <w:r>
+        <w:t xml:space="preserve">paling umum di lingkungan rumah tangga. Pengujian pada satu jaringan rumah</w:t>
+      </w:r>
+      <w:r>
+        <w:t xml:space="preserve"> </w:t>
+      </w:r>
+      <w:r>
+        <w:t xml:space="preserve">milik peneliti dilakukan sesuai dengan prinsip etika keamanan siber yang</w:t>
+      </w:r>
+      <w:r>
+        <w:t xml:space="preserve"> </w:t>
+      </w:r>
+      <w:r>
+        <w:t xml:space="preserve">melarang pemindaian jaringan tanpa izin eksplisit, sebagaimana ditetapkan dalam</w:t>
+      </w:r>
+      <w:r>
+        <w:t xml:space="preserve"> </w:t>
+      </w:r>
+      <w:r>
+        <w:t xml:space="preserve">batasan masalah penelitian ini.</w:t>
+      </w:r>
+    </w:p>
+    <w:bookmarkEnd w:id="36"/>
+    <w:bookmarkStart w:id="37" w:name="prinsip-etika-penelitian"/>
     <w:p>
       <w:pPr>
         <w:pStyle w:val="Heading2"/>
@@ -5388,9 +6246,9 @@
         <w:t xml:space="preserve">pada antarmuka pengguna, dokumentasi, dan setiap laporan keluaran.</w:t>
       </w:r>
     </w:p>
-    <w:bookmarkEnd w:id="36"/>
     <w:bookmarkEnd w:id="37"/>
-    <w:bookmarkStart w:id="50" w:name="perancangan-dan-implementasi"/>
+    <w:bookmarkEnd w:id="38"/>
+    <w:bookmarkStart w:id="51" w:name="perancangan-dan-implementasi"/>
     <w:p>
       <w:pPr>
         <w:pStyle w:val="Heading1"/>
@@ -5399,7 +6257,7 @@
         <w:t xml:space="preserve">Perancangan dan Implementasi</w:t>
       </w:r>
     </w:p>
-    <w:bookmarkStart w:id="43" w:name="arsitektur-sistem"/>
+    <w:bookmarkStart w:id="44" w:name="arsitektur-sistem"/>
     <w:p>
       <w:pPr>
         <w:pStyle w:val="Heading2"/>
@@ -5455,7 +6313,7 @@
         <w:t xml:space="preserve">.</w:t>
       </w:r>
     </w:p>
-    <w:bookmarkStart w:id="41" w:name="fig:pipeline"/>
+    <w:bookmarkStart w:id="42" w:name="fig:pipeline"/>
     <w:p>
       <w:pPr>
         <w:pStyle w:val="CaptionedFigure"/>
@@ -5465,18 +6323,18 @@
           <wp:inline>
             <wp:extent cx="5334000" cy="1778898"/>
             <wp:effectExtent b="0" l="0" r="0" t="0"/>
-            <wp:docPr descr="" title="" id="39" name="Picture"/>
+            <wp:docPr descr="" title="" id="40" name="Picture"/>
             <a:graphic>
               <a:graphicData uri="http://schemas.openxmlformats.org/drawingml/2006/picture">
                 <pic:pic>
                   <pic:nvPicPr>
-                    <pic:cNvPr descr="diagram_pipeline.png" id="40" name="Picture"/>
+                    <pic:cNvPr descr="diagram_pipeline.png" id="41" name="Picture"/>
                     <pic:cNvPicPr>
                       <a:picLocks noChangeArrowheads="1" noChangeAspect="1"/>
                     </pic:cNvPicPr>
                   </pic:nvPicPr>
                   <pic:blipFill>
-                    <a:blip r:embed="rId38"/>
+                    <a:blip r:embed="rId39"/>
                     <a:stretch>
                       <a:fillRect/>
                     </a:stretch>
@@ -5527,7 +6385,7 @@
         <w:t xml:space="preserve">empat modul HomeGuard.</w:t>
       </w:r>
     </w:p>
-    <w:bookmarkEnd w:id="41"/>
+    <w:bookmarkEnd w:id="42"/>
     <w:p>
       <w:pPr>
         <w:pStyle w:val="BodyText"/>
@@ -5546,14 +6404,14 @@
           <w:rPr>
             <w:rStyle w:val="Hyperlink"/>
           </w:rPr>
-          <w:t xml:space="preserve">2</w:t>
+          <w:t xml:space="preserve">3</w:t>
         </w:r>
       </w:hyperlink>
       <w:r>
         <w:t xml:space="preserve">.</w:t>
       </w:r>
     </w:p>
-    <w:bookmarkStart w:id="42" w:name="tab:modul"/>
+    <w:bookmarkStart w:id="43" w:name="tab:modul"/>
     <w:p>
       <w:pPr>
         <w:pStyle w:val="TableCaption"/>
@@ -5983,9 +6841,9 @@
         </w:tc>
       </w:tr>
     </w:tbl>
-    <w:bookmarkEnd w:id="42"/>
     <w:bookmarkEnd w:id="43"/>
-    <w:bookmarkStart w:id="44" w:name="modul-1-network-discovery"/>
+    <w:bookmarkEnd w:id="44"/>
+    <w:bookmarkStart w:id="45" w:name="modul-1-network-discovery"/>
     <w:p>
       <w:pPr>
         <w:pStyle w:val="Heading2"/>
@@ -6262,8 +7120,8 @@
         <w:t xml:space="preserve">notasi titik gaya Cisco).</w:t>
       </w:r>
     </w:p>
-    <w:bookmarkEnd w:id="44"/>
-    <w:bookmarkStart w:id="45" w:name="X435da6523009448b558dfb1e839014c7ba5fd24"/>
+    <w:bookmarkEnd w:id="45"/>
+    <w:bookmarkStart w:id="46" w:name="X435da6523009448b558dfb1e839014c7ba5fd24"/>
     <w:p>
       <w:pPr>
         <w:pStyle w:val="Heading2"/>
@@ -6546,8 +7404,8 @@
         <w:t xml:space="preserve">dengan prinsip portabilitas.</w:t>
       </w:r>
     </w:p>
-    <w:bookmarkEnd w:id="45"/>
-    <w:bookmarkStart w:id="48" w:name="X43c26ea41531a18919d2fc2b74fd3b5837d9ed3"/>
+    <w:bookmarkEnd w:id="46"/>
+    <w:bookmarkStart w:id="49" w:name="X43c26ea41531a18919d2fc2b74fd3b5837d9ed3"/>
     <w:p>
       <w:pPr>
         <w:pStyle w:val="Heading2"/>
@@ -6602,7 +7460,7 @@
           <w:rPr>
             <w:rStyle w:val="Hyperlink"/>
           </w:rPr>
-          <w:t xml:space="preserve">3</w:t>
+          <w:t xml:space="preserve">4</w:t>
         </w:r>
       </w:hyperlink>
       <w:r>
@@ -6621,7 +7479,7 @@
         <w:t xml:space="preserve">penekanan khusus pada layanan Telnet yang dieksploitasi botnet Mirai.</w:t>
       </w:r>
     </w:p>
-    <w:bookmarkStart w:id="46" w:name="tab:katalog"/>
+    <w:bookmarkStart w:id="47" w:name="tab:katalog"/>
     <w:p>
       <w:pPr>
         <w:pStyle w:val="TableCaption"/>
@@ -7167,7 +8025,7 @@
         </w:tc>
       </w:tr>
     </w:tbl>
-    <w:bookmarkEnd w:id="46"/>
+    <w:bookmarkEnd w:id="47"/>
     <w:p>
       <w:pPr>
         <w:pStyle w:val="BodyText"/>
@@ -7440,7 +8298,7 @@
           <w:rPr>
             <w:rStyle w:val="Hyperlink"/>
           </w:rPr>
-          <w:t xml:space="preserve">4</w:t>
+          <w:t xml:space="preserve">5</w:t>
         </w:r>
       </w:hyperlink>
       <w:r>
@@ -7672,7 +8530,172 @@
         <w:t xml:space="preserve">terbuka dinilai AMAN dengan skor 0.</w:t>
       </w:r>
     </w:p>
-    <w:bookmarkStart w:id="47" w:name="tab:severity"/>
+    <w:p>
+      <w:pPr>
+        <w:pStyle w:val="BodyText"/>
+      </w:pPr>
+      <w:r>
+        <w:t xml:space="preserve">Nilai parameter pada Persamaan </w:t>
+      </w:r>
+      <w:hyperlink w:anchor="eq:skor">
+        <w:r>
+          <w:rPr>
+            <w:rStyle w:val="Hyperlink"/>
+          </w:rPr>
+          <w:t xml:space="preserve">[eq:skor]</w:t>
+        </w:r>
+      </w:hyperlink>
+      <w:r>
+        <w:t xml:space="preserve"> </w:t>
+      </w:r>
+      <w:r>
+        <w:t xml:space="preserve">dirancang berdasarkan dua</w:t>
+      </w:r>
+      <w:r>
+        <w:t xml:space="preserve"> </w:t>
+      </w:r>
+      <w:r>
+        <w:t xml:space="preserve">prinsip heuristik. Pertama, skor dasar tingkat KRITIS ditetapkan sebesar 90</w:t>
+      </w:r>
+      <w:r>
+        <w:t xml:space="preserve"> </w:t>
+      </w:r>
+      <w:r>
+        <w:t xml:space="preserve">(bukan 100) untuk mempertahankan ruang diferensiasi antar host berkategori</w:t>
+      </w:r>
+      <w:r>
+        <w:t xml:space="preserve"> </w:t>
+      </w:r>
+      <w:r>
+        <w:t xml:space="preserve">KRITIS — host dengan satu temuan KRITIS mendapat skor 93, sedangkan host</w:t>
+      </w:r>
+      <w:r>
+        <w:t xml:space="preserve"> </w:t>
+      </w:r>
+      <w:r>
+        <w:t xml:space="preserve">dengan empat atau lebih temuan KRITIS mencapai batas atas 100. Penetapan ini</w:t>
+      </w:r>
+      <w:r>
+        <w:t xml:space="preserve"> </w:t>
+      </w:r>
+      <w:r>
+        <w:t xml:space="preserve">mencerminkan prinsip bahwa akumulasi kerentanan meningkatkan risiko secara</w:t>
+      </w:r>
+      <w:r>
+        <w:t xml:space="preserve"> </w:t>
+      </w:r>
+      <w:r>
+        <w:t xml:space="preserve">kumulatif, sehingga perangkat dengan eksposur permukaan serangan yang lebih</w:t>
+      </w:r>
+      <w:r>
+        <w:t xml:space="preserve"> </w:t>
+      </w:r>
+      <w:r>
+        <w:t xml:space="preserve">luas mendapat skor yang lebih tinggi meskipun</w:t>
+      </w:r>
+      <w:r>
+        <w:t xml:space="preserve"> </w:t>
+      </w:r>
+      <w:r>
+        <w:rPr>
+          <w:i/>
+          <w:iCs/>
+        </w:rPr>
+        <w:t xml:space="preserve">severity</w:t>
+      </w:r>
+      <w:r>
+        <w:t xml:space="preserve"> </w:t>
+      </w:r>
+      <w:r>
+        <w:t xml:space="preserve">tertingginya</w:t>
+      </w:r>
+      <w:r>
+        <w:t xml:space="preserve"> </w:t>
+      </w:r>
+      <w:r>
+        <w:t xml:space="preserve">sama. Kedua, nilai</w:t>
+      </w:r>
+      <w:r>
+        <w:t xml:space="preserve"> </w:t>
+      </w:r>
+      <m:oMath>
+        <m:r>
+          <m:t>k</m:t>
+        </m:r>
+        <m:r>
+          <m:rPr>
+            <m:sty m:val="p"/>
+          </m:rPr>
+          <m:t>=</m:t>
+        </m:r>
+        <m:r>
+          <m:t>3</m:t>
+        </m:r>
+      </m:oMath>
+      <w:r>
+        <w:t xml:space="preserve"> </w:t>
+      </w:r>
+      <w:r>
+        <w:t xml:space="preserve">dipilih sebagai penambah per temuan yang memberikan</w:t>
+      </w:r>
+      <w:r>
+        <w:t xml:space="preserve"> </w:t>
+      </w:r>
+      <w:r>
+        <w:t xml:space="preserve">diferensiasi yang bermakna tanpa menyebabkan saturasi skor pada jumlah temuan</w:t>
+      </w:r>
+      <w:r>
+        <w:t xml:space="preserve"> </w:t>
+      </w:r>
+      <w:r>
+        <w:t xml:space="preserve">yang kecil — dengan</w:t>
+      </w:r>
+      <w:r>
+        <w:t xml:space="preserve"> </w:t>
+      </w:r>
+      <m:oMath>
+        <m:r>
+          <m:t>k</m:t>
+        </m:r>
+        <m:r>
+          <m:rPr>
+            <m:sty m:val="p"/>
+          </m:rPr>
+          <m:t>=</m:t>
+        </m:r>
+        <m:r>
+          <m:t>3</m:t>
+        </m:r>
+      </m:oMath>
+      <w:r>
+        <w:t xml:space="preserve">, perangkat berkategori KRITIS membutuhkan minimal</w:t>
+      </w:r>
+      <w:r>
+        <w:t xml:space="preserve"> </w:t>
+      </w:r>
+      <w:r>
+        <w:t xml:space="preserve">empat temuan untuk mencapai skor maksimum 100, yang secara praktis mencerminkan</w:t>
+      </w:r>
+      <w:r>
+        <w:t xml:space="preserve"> </w:t>
+      </w:r>
+      <w:r>
+        <w:t xml:space="preserve">kondisi perangkat dengan eksposur kerentanan yang sangat tinggi. Kedua</w:t>
+      </w:r>
+      <w:r>
+        <w:t xml:space="preserve"> </w:t>
+      </w:r>
+      <w:r>
+        <w:t xml:space="preserve">parameter ini bersifat heuristik dan dapat dikalibrasi ulang pada penelitian</w:t>
+      </w:r>
+      <w:r>
+        <w:t xml:space="preserve"> </w:t>
+      </w:r>
+      <w:r>
+        <w:t xml:space="preserve">lanjutan berdasarkan validasi empiris pada dataset yang lebih besar.</w:t>
+      </w:r>
+    </w:p>
+    <w:bookmarkStart w:id="48" w:name="tab:severity"/>
     <w:p>
       <w:pPr>
         <w:pStyle w:val="TableCaption"/>
@@ -7872,9 +8895,9 @@
         </w:tc>
       </w:tr>
     </w:tbl>
-    <w:bookmarkEnd w:id="47"/>
     <w:bookmarkEnd w:id="48"/>
-    <w:bookmarkStart w:id="49" w:name="antarmuka-pengguna"/>
+    <w:bookmarkEnd w:id="49"/>
+    <w:bookmarkStart w:id="50" w:name="antarmuka-pengguna"/>
     <w:p>
       <w:pPr>
         <w:pStyle w:val="Heading2"/>
@@ -8028,8 +9051,8 @@
         <w:t xml:space="preserve">referensi OWASP IoT Top 10.</w:t>
       </w:r>
     </w:p>
-    <w:bookmarkEnd w:id="49"/>
     <w:bookmarkEnd w:id="50"/>
+    <w:bookmarkEnd w:id="51"/>
     <w:bookmarkStart w:id="57" w:name="pengujian-dan-hasil"/>
     <w:p>
       <w:pPr>
@@ -8068,43 +9091,101 @@
         <w:t xml:space="preserve"> </w:t>
       </w:r>
       <w:r>
-        <w:t xml:space="preserve">terhadap dua modul</w:t>
-      </w:r>
-      <w:r>
-        <w:t xml:space="preserve"> </w:t>
-      </w:r>
-      <w:r>
-        <w:t xml:space="preserve">inti, yaitu modul pemetaan kerentanan (</w:t>
+        <w:t xml:space="preserve">terhadap seluruh modul</w:t>
+      </w:r>
+      <w:r>
+        <w:t xml:space="preserve"> </w:t>
+      </w:r>
+      <w:r>
+        <w:t xml:space="preserve">aplikasi, mencakup modul klasifikasi perangkat (</w:t>
       </w:r>
       <w:r>
         <w:rPr>
           <w:rStyle w:val="VerbatimChar"/>
         </w:rPr>
+        <w:t xml:space="preserve">classify</w:t>
+      </w:r>
+      <w:r>
+        <w:t xml:space="preserve">), penemuan</w:t>
+      </w:r>
+      <w:r>
+        <w:t xml:space="preserve"> </w:t>
+      </w:r>
+      <w:r>
+        <w:t xml:space="preserve">host (</w:t>
+      </w:r>
+      <w:r>
+        <w:rPr>
+          <w:rStyle w:val="VerbatimChar"/>
+        </w:rPr>
+        <w:t xml:space="preserve">discovery</w:t>
+      </w:r>
+      <w:r>
+        <w:t xml:space="preserve">), pemindaian port (</w:t>
+      </w:r>
+      <w:r>
+        <w:rPr>
+          <w:rStyle w:val="VerbatimChar"/>
+        </w:rPr>
+        <w:t xml:space="preserve">portscan</w:t>
+      </w:r>
+      <w:r>
+        <w:t xml:space="preserve">), orkestrator</w:t>
+      </w:r>
+      <w:r>
+        <w:t xml:space="preserve"> </w:t>
+      </w:r>
+      <w:r>
+        <w:rPr>
+          <w:i/>
+          <w:iCs/>
+        </w:rPr>
+        <w:t xml:space="preserve">pipeline</w:t>
+      </w:r>
+      <w:r>
+        <w:t xml:space="preserve"> </w:t>
+      </w:r>
+      <w:r>
+        <w:t xml:space="preserve">(</w:t>
+      </w:r>
+      <w:r>
+        <w:rPr>
+          <w:rStyle w:val="VerbatimChar"/>
+        </w:rPr>
+        <w:t xml:space="preserve">scanner</w:t>
+      </w:r>
+      <w:r>
+        <w:t xml:space="preserve">), pemeriksaan TLS dan header keamanan</w:t>
+      </w:r>
+      <w:r>
+        <w:t xml:space="preserve"> </w:t>
+      </w:r>
+      <w:r>
+        <w:t xml:space="preserve">(</w:t>
+      </w:r>
+      <w:r>
+        <w:rPr>
+          <w:rStyle w:val="VerbatimChar"/>
+        </w:rPr>
+        <w:t xml:space="preserve">tlscheck</w:t>
+      </w:r>
+      <w:r>
+        <w:t xml:space="preserve">), serta pemetaan kerentanan (</w:t>
+      </w:r>
+      <w:r>
+        <w:rPr>
+          <w:rStyle w:val="VerbatimChar"/>
+        </w:rPr>
         <w:t xml:space="preserve">vulnmap</w:t>
       </w:r>
       <w:r>
-        <w:t xml:space="preserve">) dan modul</w:t>
-      </w:r>
-      <w:r>
-        <w:t xml:space="preserve"> </w:t>
-      </w:r>
-      <w:r>
-        <w:t xml:space="preserve">penemuan host (</w:t>
-      </w:r>
-      <w:r>
-        <w:rPr>
-          <w:rStyle w:val="VerbatimChar"/>
-        </w:rPr>
-        <w:t xml:space="preserve">discovery</w:t>
-      </w:r>
-      <w:r>
-        <w:t xml:space="preserve">), dengan total 12 kasus uji. Seluruh</w:t>
-      </w:r>
-      <w:r>
-        <w:t xml:space="preserve"> </w:t>
-      </w:r>
-      <w:r>
-        <w:t xml:space="preserve">kasus uji</w:t>
+        <w:t xml:space="preserve">), dengan total</w:t>
+      </w:r>
+      <w:r>
+        <w:t xml:space="preserve"> </w:t>
+      </w:r>
+      <w:r>
+        <w:t xml:space="preserve">36 kasus uji. Seluruh kasus uji</w:t>
       </w:r>
       <w:r>
         <w:t xml:space="preserve"> </w:t>
@@ -8120,68 +9201,73 @@
         <w:t xml:space="preserve"> </w:t>
       </w:r>
       <w:r>
-        <w:t xml:space="preserve">(12/12), sebagaimana dirangkum pada</w:t>
-      </w:r>
-      <w:r>
-        <w:t xml:space="preserve"> </w:t>
-      </w:r>
-      <w:r>
-        <w:t xml:space="preserve">Tabel </w:t>
+        <w:t xml:space="preserve">(36/36), sebagaimana dirangkum</w:t>
+      </w:r>
+      <w:r>
+        <w:t xml:space="preserve"> </w:t>
+      </w:r>
+      <w:r>
+        <w:t xml:space="preserve">pada Tabel </w:t>
       </w:r>
       <w:hyperlink w:anchor="tab:unit">
         <w:r>
           <w:rPr>
             <w:rStyle w:val="Hyperlink"/>
           </w:rPr>
-          <w:t xml:space="preserve">5</w:t>
+          <w:t xml:space="preserve">[tab:unit]</w:t>
         </w:r>
       </w:hyperlink>
       <w:r>
-        <w:t xml:space="preserve">. Pengujian ini memvalidasi kebenaran logika pemetaan</w:t>
-      </w:r>
-      <w:r>
-        <w:t xml:space="preserve"> </w:t>
-      </w:r>
-      <w:r>
-        <w:t xml:space="preserve">OWASP, perhitungan skor, normalisasi MAC,</w:t>
-      </w:r>
-      <w:r>
-        <w:t xml:space="preserve"> </w:t>
-      </w:r>
-      <w:r>
-        <w:rPr>
-          <w:i/>
-          <w:iCs/>
-        </w:rPr>
-        <w:t xml:space="preserve">vendor lookup</w:t>
-      </w:r>
-      <w:r>
-        <w:t xml:space="preserve">,</w:t>
-      </w:r>
-      <w:r>
-        <w:t xml:space="preserve"> </w:t>
-      </w:r>
-      <w:r>
-        <w:rPr>
-          <w:i/>
-          <w:iCs/>
-        </w:rPr>
-        <w:t xml:space="preserve">parsing</w:t>
-      </w:r>
-      <w:r>
-        <w:t xml:space="preserve"> </w:t>
-      </w:r>
-      <w:r>
-        <w:t xml:space="preserve">tabel ARP, dan ekspansi CIDR.</w:t>
-      </w:r>
-    </w:p>
-    <w:bookmarkStart w:id="51" w:name="tab:unit"/>
-    <w:p>
-      <w:pPr>
-        <w:pStyle w:val="TableCaption"/>
-      </w:pPr>
-      <w:r>
-        <w:t xml:space="preserve">Ringkasan Hasil Pengujian Unit (12/12 Lulus)</w:t>
+        <w:t xml:space="preserve">. Pengujian dijalankan secara otomatis melalui GitHub</w:t>
+      </w:r>
+      <w:r>
+        <w:t xml:space="preserve"> </w:t>
+      </w:r>
+      <w:r>
+        <w:t xml:space="preserve">Actions CI pada Python 3.9–3.12 di setiap</w:t>
+      </w:r>
+      <w:r>
+        <w:t xml:space="preserve"> </w:t>
+      </w:r>
+      <w:r>
+        <w:rPr>
+          <w:i/>
+          <w:iCs/>
+        </w:rPr>
+        <w:t xml:space="preserve">push</w:t>
+      </w:r>
+      <w:r>
+        <w:t xml:space="preserve"> </w:t>
+      </w:r>
+      <w:r>
+        <w:t xml:space="preserve">dan</w:t>
+      </w:r>
+      <w:r>
+        <w:t xml:space="preserve"> </w:t>
+      </w:r>
+      <w:r>
+        <w:rPr>
+          <w:i/>
+          <w:iCs/>
+        </w:rPr>
+        <w:t xml:space="preserve">pull</w:t>
+      </w:r>
+      <w:r>
+        <w:rPr>
+          <w:i/>
+          <w:iCs/>
+        </w:rPr>
+        <w:t xml:space="preserve"> </w:t>
+      </w:r>
+      <w:r>
+        <w:rPr>
+          <w:i/>
+          <w:iCs/>
+        </w:rPr>
+        <w:t xml:space="preserve">request</w:t>
+      </w:r>
+      <w:r>
+        <w:t xml:space="preserve">.</w:t>
       </w:r>
     </w:p>
     <w:tbl>
@@ -8189,11 +9275,12 @@
         <w:tblStyle w:val="Table"/>
         <w:tblW w:type="auto" w:w="0"/>
         <w:tblLook w:firstRow="1" w:lastRow="0" w:firstColumn="0" w:lastColumn="0" w:noHBand="0" w:noVBand="0" w:val="0020"/>
-        <w:tblCaption w:val="Ringkasan Hasil Pengujian Unit (12/12 Lulus)"/>
       </w:tblPr>
       <w:tblGrid>
-        <w:gridCol w:w="3960"/>
-        <w:gridCol w:w="3960"/>
+        <w:gridCol w:w="1980"/>
+        <w:gridCol w:w="1980"/>
+        <w:gridCol w:w="1980"/>
+        <w:gridCol w:w="1980"/>
       </w:tblGrid>
       <w:tr>
         <w:trPr>
@@ -8204,6 +9291,38 @@
           <w:p>
             <w:pPr>
               <w:pStyle w:val="Compact"/>
+              <w:jc w:val="center"/>
+            </w:pPr>
+            <w:r>
+              <w:rPr>
+                <w:b/>
+                <w:bCs/>
+              </w:rPr>
+              <w:t xml:space="preserve">No</w:t>
+            </w:r>
+          </w:p>
+        </w:tc>
+        <w:tc>
+          <w:tcPr/>
+          <w:p>
+            <w:pPr>
+              <w:pStyle w:val="Compact"/>
+              <w:jc w:val="left"/>
+            </w:pPr>
+            <w:r>
+              <w:rPr>
+                <w:b/>
+                <w:bCs/>
+              </w:rPr>
+              <w:t xml:space="preserve">Modul</w:t>
+            </w:r>
+          </w:p>
+        </w:tc>
+        <w:tc>
+          <w:tcPr/>
+          <w:p>
+            <w:pPr>
+              <w:pStyle w:val="Compact"/>
               <w:jc w:val="left"/>
             </w:pPr>
             <w:r>
@@ -8238,10 +9357,234 @@
           <w:p>
             <w:pPr>
               <w:pStyle w:val="Compact"/>
-              <w:jc w:val="left"/>
-            </w:pPr>
-            <w:r>
-              <w:t xml:space="preserve">Telnet (23)</w:t>
+              <w:jc w:val="center"/>
+            </w:pPr>
+            <w:r>
+              <w:t xml:space="preserve">1</w:t>
+            </w:r>
+          </w:p>
+        </w:tc>
+        <w:tc>
+          <w:tcPr/>
+          <w:p>
+            <w:pPr>
+              <w:pStyle w:val="Compact"/>
+              <w:jc w:val="left"/>
+            </w:pPr>
+            <w:r>
+              <w:t xml:space="preserve">classify</w:t>
+            </w:r>
+          </w:p>
+        </w:tc>
+        <w:tc>
+          <w:tcPr/>
+          <w:p>
+            <w:pPr>
+              <w:pStyle w:val="Compact"/>
+              <w:jc w:val="left"/>
+            </w:pPr>
+            <w:r>
+              <w:t xml:space="preserve">Klasifikasi kamera dari port RTSP</w:t>
+            </w:r>
+          </w:p>
+        </w:tc>
+        <w:tc>
+          <w:tcPr/>
+          <w:p>
+            <w:pPr>
+              <w:pStyle w:val="Compact"/>
+              <w:jc w:val="center"/>
+            </w:pPr>
+            <w:r>
+              <w:t xml:space="preserve">Lulus</w:t>
+            </w:r>
+          </w:p>
+        </w:tc>
+      </w:tr>
+      <w:tr>
+        <w:tc>
+          <w:tcPr/>
+          <w:p>
+            <w:pPr>
+              <w:pStyle w:val="Compact"/>
+              <w:jc w:val="center"/>
+            </w:pPr>
+            <w:r>
+              <w:t xml:space="preserve">2</w:t>
+            </w:r>
+          </w:p>
+        </w:tc>
+        <w:tc>
+          <w:tcPr/>
+          <w:p>
+            <w:pPr>
+              <w:pStyle w:val="Compact"/>
+              <w:jc w:val="left"/>
+            </w:pPr>
+            <w:r>
+              <w:t xml:space="preserve">classify</w:t>
+            </w:r>
+          </w:p>
+        </w:tc>
+        <w:tc>
+          <w:tcPr/>
+          <w:p>
+            <w:pPr>
+              <w:pStyle w:val="Compact"/>
+              <w:jc w:val="left"/>
+            </w:pPr>
+            <w:r>
+              <w:t xml:space="preserve">Klasifikasi printer dari port JetDirect/IPP</w:t>
+            </w:r>
+          </w:p>
+        </w:tc>
+        <w:tc>
+          <w:tcPr/>
+          <w:p>
+            <w:pPr>
+              <w:pStyle w:val="Compact"/>
+              <w:jc w:val="center"/>
+            </w:pPr>
+            <w:r>
+              <w:t xml:space="preserve">Lulus</w:t>
+            </w:r>
+          </w:p>
+        </w:tc>
+      </w:tr>
+      <w:tr>
+        <w:tc>
+          <w:tcPr/>
+          <w:p>
+            <w:pPr>
+              <w:pStyle w:val="Compact"/>
+              <w:jc w:val="center"/>
+            </w:pPr>
+            <w:r>
+              <w:t xml:space="preserve">3</w:t>
+            </w:r>
+          </w:p>
+        </w:tc>
+        <w:tc>
+          <w:tcPr/>
+          <w:p>
+            <w:pPr>
+              <w:pStyle w:val="Compact"/>
+              <w:jc w:val="left"/>
+            </w:pPr>
+            <w:r>
+              <w:t xml:space="preserve">classify</w:t>
+            </w:r>
+          </w:p>
+        </w:tc>
+        <w:tc>
+          <w:tcPr/>
+          <w:p>
+            <w:pPr>
+              <w:pStyle w:val="Compact"/>
+              <w:jc w:val="left"/>
+            </w:pPr>
+            <w:r>
+              <w:t xml:space="preserve">Keyakinan tinggi dari sinyal vendor + layanan kamera</w:t>
+            </w:r>
+          </w:p>
+        </w:tc>
+        <w:tc>
+          <w:tcPr/>
+          <w:p>
+            <w:pPr>
+              <w:pStyle w:val="Compact"/>
+              <w:jc w:val="center"/>
+            </w:pPr>
+            <w:r>
+              <w:t xml:space="preserve">Lulus</w:t>
+            </w:r>
+          </w:p>
+        </w:tc>
+      </w:tr>
+      <w:tr>
+        <w:tc>
+          <w:tcPr/>
+          <w:p>
+            <w:pPr>
+              <w:pStyle w:val="Compact"/>
+              <w:jc w:val="center"/>
+            </w:pPr>
+            <w:r>
+              <w:t xml:space="preserve">4</w:t>
+            </w:r>
+          </w:p>
+        </w:tc>
+        <w:tc>
+          <w:tcPr/>
+          <w:p>
+            <w:pPr>
+              <w:pStyle w:val="Compact"/>
+              <w:jc w:val="left"/>
+            </w:pPr>
+            <w:r>
+              <w:t xml:space="preserve">classify</w:t>
+            </w:r>
+          </w:p>
+        </w:tc>
+        <w:tc>
+          <w:tcPr/>
+          <w:p>
+            <w:pPr>
+              <w:pStyle w:val="Compact"/>
+              <w:jc w:val="left"/>
+            </w:pPr>
+            <w:r>
+              <w:t xml:space="preserve">Klasifikasi router dari pola port web + DNS</w:t>
+            </w:r>
+          </w:p>
+        </w:tc>
+        <w:tc>
+          <w:tcPr/>
+          <w:p>
+            <w:pPr>
+              <w:pStyle w:val="Compact"/>
+              <w:jc w:val="center"/>
+            </w:pPr>
+            <w:r>
+              <w:t xml:space="preserve">Lulus</w:t>
+            </w:r>
+          </w:p>
+        </w:tc>
+      </w:tr>
+      <w:tr>
+        <w:tc>
+          <w:tcPr/>
+          <w:p>
+            <w:pPr>
+              <w:pStyle w:val="Compact"/>
+              <w:jc w:val="center"/>
+            </w:pPr>
+            <w:r>
+              <w:t xml:space="preserve">5</w:t>
+            </w:r>
+          </w:p>
+        </w:tc>
+        <w:tc>
+          <w:tcPr/>
+          <w:p>
+            <w:pPr>
+              <w:pStyle w:val="Compact"/>
+              <w:jc w:val="left"/>
+            </w:pPr>
+            <w:r>
+              <w:t xml:space="preserve">classify</w:t>
+            </w:r>
+          </w:p>
+        </w:tc>
+        <w:tc>
+          <w:tcPr/>
+          <w:p>
+            <w:pPr>
+              <w:pStyle w:val="Compact"/>
+              <w:jc w:val="left"/>
+            </w:pPr>
+            <w:r>
+              <w:t xml:space="preserve">Host tanpa port terbuka</w:t>
             </w:r>
             <w:r>
               <w:t xml:space="preserve"> </w:t>
@@ -8258,7 +9601,7 @@
               <w:t xml:space="preserve"> </w:t>
             </w:r>
             <w:r>
-              <w:t xml:space="preserve">KRITIS, I1/I2</w:t>
+              <w:t xml:space="preserve">tidak diketahui</w:t>
             </w:r>
           </w:p>
         </w:tc>
@@ -8281,10 +9624,458 @@
           <w:p>
             <w:pPr>
               <w:pStyle w:val="Compact"/>
-              <w:jc w:val="left"/>
-            </w:pPr>
-            <w:r>
-              <w:t xml:space="preserve">HTTP (80)</w:t>
+              <w:jc w:val="center"/>
+            </w:pPr>
+            <w:r>
+              <w:t xml:space="preserve">6</w:t>
+            </w:r>
+          </w:p>
+        </w:tc>
+        <w:tc>
+          <w:tcPr/>
+          <w:p>
+            <w:pPr>
+              <w:pStyle w:val="Compact"/>
+              <w:jc w:val="left"/>
+            </w:pPr>
+            <w:r>
+              <w:t xml:space="preserve">classify</w:t>
+            </w:r>
+          </w:p>
+        </w:tc>
+        <w:tc>
+          <w:tcPr/>
+          <w:p>
+            <w:pPr>
+              <w:pStyle w:val="Compact"/>
+              <w:jc w:val="left"/>
+            </w:pPr>
+            <w:r>
+              <w:t xml:space="preserve">Fallback OUI ke seed dan validasi jumlah entri</w:t>
+            </w:r>
+          </w:p>
+        </w:tc>
+        <w:tc>
+          <w:tcPr/>
+          <w:p>
+            <w:pPr>
+              <w:pStyle w:val="Compact"/>
+              <w:jc w:val="center"/>
+            </w:pPr>
+            <w:r>
+              <w:t xml:space="preserve">Lulus</w:t>
+            </w:r>
+          </w:p>
+        </w:tc>
+      </w:tr>
+      <w:tr>
+        <w:tc>
+          <w:tcPr/>
+          <w:p>
+            <w:pPr>
+              <w:pStyle w:val="Compact"/>
+              <w:jc w:val="center"/>
+            </w:pPr>
+            <w:r>
+              <w:t xml:space="preserve">7</w:t>
+            </w:r>
+          </w:p>
+        </w:tc>
+        <w:tc>
+          <w:tcPr/>
+          <w:p>
+            <w:pPr>
+              <w:pStyle w:val="Compact"/>
+              <w:jc w:val="left"/>
+            </w:pPr>
+            <w:r>
+              <w:t xml:space="preserve">discovery</w:t>
+            </w:r>
+          </w:p>
+        </w:tc>
+        <w:tc>
+          <w:tcPr/>
+          <w:p>
+            <w:pPr>
+              <w:pStyle w:val="Compact"/>
+              <w:jc w:val="left"/>
+            </w:pPr>
+            <w:r>
+              <w:t xml:space="preserve">Normalisasi MAC berbagai format pemisah</w:t>
+            </w:r>
+          </w:p>
+        </w:tc>
+        <w:tc>
+          <w:tcPr/>
+          <w:p>
+            <w:pPr>
+              <w:pStyle w:val="Compact"/>
+              <w:jc w:val="center"/>
+            </w:pPr>
+            <w:r>
+              <w:t xml:space="preserve">Lulus</w:t>
+            </w:r>
+          </w:p>
+        </w:tc>
+      </w:tr>
+      <w:tr>
+        <w:tc>
+          <w:tcPr/>
+          <w:p>
+            <w:pPr>
+              <w:pStyle w:val="Compact"/>
+              <w:jc w:val="center"/>
+            </w:pPr>
+            <w:r>
+              <w:t xml:space="preserve">8</w:t>
+            </w:r>
+          </w:p>
+        </w:tc>
+        <w:tc>
+          <w:tcPr/>
+          <w:p>
+            <w:pPr>
+              <w:pStyle w:val="Compact"/>
+              <w:jc w:val="left"/>
+            </w:pPr>
+            <w:r>
+              <w:t xml:space="preserve">discovery</w:t>
+            </w:r>
+          </w:p>
+        </w:tc>
+        <w:tc>
+          <w:tcPr/>
+          <w:p>
+            <w:pPr>
+              <w:pStyle w:val="Compact"/>
+              <w:jc w:val="left"/>
+            </w:pPr>
+            <w:r>
+              <w:t xml:space="preserve">Penolakan MAC tidak valid</w:t>
+            </w:r>
+          </w:p>
+        </w:tc>
+        <w:tc>
+          <w:tcPr/>
+          <w:p>
+            <w:pPr>
+              <w:pStyle w:val="Compact"/>
+              <w:jc w:val="center"/>
+            </w:pPr>
+            <w:r>
+              <w:t xml:space="preserve">Lulus</w:t>
+            </w:r>
+          </w:p>
+        </w:tc>
+      </w:tr>
+      <w:tr>
+        <w:tc>
+          <w:tcPr/>
+          <w:p>
+            <w:pPr>
+              <w:pStyle w:val="Compact"/>
+              <w:jc w:val="center"/>
+            </w:pPr>
+            <w:r>
+              <w:t xml:space="preserve">9</w:t>
+            </w:r>
+          </w:p>
+        </w:tc>
+        <w:tc>
+          <w:tcPr/>
+          <w:p>
+            <w:pPr>
+              <w:pStyle w:val="Compact"/>
+              <w:jc w:val="left"/>
+            </w:pPr>
+            <w:r>
+              <w:t xml:space="preserve">discovery</w:t>
+            </w:r>
+          </w:p>
+        </w:tc>
+        <w:tc>
+          <w:tcPr/>
+          <w:p>
+            <w:pPr>
+              <w:pStyle w:val="Compact"/>
+              <w:jc w:val="left"/>
+            </w:pPr>
+            <w:r>
+              <w:t xml:space="preserve">Vendor lookup (Raspberry Pi vs Unknown)</w:t>
+            </w:r>
+          </w:p>
+        </w:tc>
+        <w:tc>
+          <w:tcPr/>
+          <w:p>
+            <w:pPr>
+              <w:pStyle w:val="Compact"/>
+              <w:jc w:val="center"/>
+            </w:pPr>
+            <w:r>
+              <w:t xml:space="preserve">Lulus</w:t>
+            </w:r>
+          </w:p>
+        </w:tc>
+      </w:tr>
+      <w:tr>
+        <w:tc>
+          <w:tcPr/>
+          <w:p>
+            <w:pPr>
+              <w:pStyle w:val="Compact"/>
+              <w:jc w:val="center"/>
+            </w:pPr>
+            <w:r>
+              <w:t xml:space="preserve">10</w:t>
+            </w:r>
+          </w:p>
+        </w:tc>
+        <w:tc>
+          <w:tcPr/>
+          <w:p>
+            <w:pPr>
+              <w:pStyle w:val="Compact"/>
+              <w:jc w:val="left"/>
+            </w:pPr>
+            <w:r>
+              <w:t xml:space="preserve">discovery</w:t>
+            </w:r>
+          </w:p>
+        </w:tc>
+        <w:tc>
+          <w:tcPr/>
+          <w:p>
+            <w:pPr>
+              <w:pStyle w:val="Compact"/>
+              <w:jc w:val="left"/>
+            </w:pPr>
+            <w:r>
+              <w:t xml:space="preserve">Parsing</w:t>
+            </w:r>
+            <w:r>
+              <w:t xml:space="preserve"> </w:t>
+            </w:r>
+            <w:r>
+              <w:rPr>
+                <w:rStyle w:val="VerbatimChar"/>
+              </w:rPr>
+              <w:t xml:space="preserve">ip neigh</w:t>
+            </w:r>
+            <w:r>
+              <w:t xml:space="preserve"> </w:t>
+            </w:r>
+            <w:r>
+              <w:t xml:space="preserve">dan</w:t>
+            </w:r>
+            <w:r>
+              <w:t xml:space="preserve"> </w:t>
+            </w:r>
+            <w:r>
+              <w:rPr>
+                <w:rStyle w:val="VerbatimChar"/>
+              </w:rPr>
+              <w:t xml:space="preserve">arp -a</w:t>
+            </w:r>
+          </w:p>
+        </w:tc>
+        <w:tc>
+          <w:tcPr/>
+          <w:p>
+            <w:pPr>
+              <w:pStyle w:val="Compact"/>
+              <w:jc w:val="center"/>
+            </w:pPr>
+            <w:r>
+              <w:t xml:space="preserve">Lulus</w:t>
+            </w:r>
+          </w:p>
+        </w:tc>
+      </w:tr>
+      <w:tr>
+        <w:tc>
+          <w:tcPr/>
+          <w:p>
+            <w:pPr>
+              <w:pStyle w:val="Compact"/>
+              <w:jc w:val="center"/>
+            </w:pPr>
+            <w:r>
+              <w:t xml:space="preserve">11</w:t>
+            </w:r>
+          </w:p>
+        </w:tc>
+        <w:tc>
+          <w:tcPr/>
+          <w:p>
+            <w:pPr>
+              <w:pStyle w:val="Compact"/>
+              <w:jc w:val="left"/>
+            </w:pPr>
+            <w:r>
+              <w:t xml:space="preserve">discovery</w:t>
+            </w:r>
+          </w:p>
+        </w:tc>
+        <w:tc>
+          <w:tcPr/>
+          <w:p>
+            <w:pPr>
+              <w:pStyle w:val="Compact"/>
+              <w:jc w:val="left"/>
+            </w:pPr>
+            <w:r>
+              <w:t xml:space="preserve">Ekspansi CIDR /30 dan /32</w:t>
+            </w:r>
+          </w:p>
+        </w:tc>
+        <w:tc>
+          <w:tcPr/>
+          <w:p>
+            <w:pPr>
+              <w:pStyle w:val="Compact"/>
+              <w:jc w:val="center"/>
+            </w:pPr>
+            <w:r>
+              <w:t xml:space="preserve">Lulus</w:t>
+            </w:r>
+          </w:p>
+        </w:tc>
+      </w:tr>
+      <w:tr>
+        <w:tc>
+          <w:tcPr/>
+          <w:p>
+            <w:pPr>
+              <w:pStyle w:val="Compact"/>
+              <w:jc w:val="center"/>
+            </w:pPr>
+            <w:r>
+              <w:t xml:space="preserve">12</w:t>
+            </w:r>
+          </w:p>
+        </w:tc>
+        <w:tc>
+          <w:tcPr/>
+          <w:p>
+            <w:pPr>
+              <w:pStyle w:val="Compact"/>
+              <w:jc w:val="left"/>
+            </w:pPr>
+            <w:r>
+              <w:t xml:space="preserve">discovery</w:t>
+            </w:r>
+          </w:p>
+        </w:tc>
+        <w:tc>
+          <w:tcPr/>
+          <w:p>
+            <w:pPr>
+              <w:pStyle w:val="Compact"/>
+              <w:jc w:val="left"/>
+            </w:pPr>
+            <w:r>
+              <w:t xml:space="preserve">Deteksi IP privat</w:t>
+            </w:r>
+          </w:p>
+        </w:tc>
+        <w:tc>
+          <w:tcPr/>
+          <w:p>
+            <w:pPr>
+              <w:pStyle w:val="Compact"/>
+              <w:jc w:val="center"/>
+            </w:pPr>
+            <w:r>
+              <w:t xml:space="preserve">Lulus</w:t>
+            </w:r>
+          </w:p>
+        </w:tc>
+      </w:tr>
+      <w:tr>
+        <w:tc>
+          <w:tcPr/>
+          <w:p>
+            <w:pPr>
+              <w:pStyle w:val="Compact"/>
+              <w:jc w:val="center"/>
+            </w:pPr>
+            <w:r>
+              <w:t xml:space="preserve">13</w:t>
+            </w:r>
+          </w:p>
+        </w:tc>
+        <w:tc>
+          <w:tcPr/>
+          <w:p>
+            <w:pPr>
+              <w:pStyle w:val="Compact"/>
+              <w:jc w:val="left"/>
+            </w:pPr>
+            <w:r>
+              <w:t xml:space="preserve">portscan</w:t>
+            </w:r>
+          </w:p>
+        </w:tc>
+        <w:tc>
+          <w:tcPr/>
+          <w:p>
+            <w:pPr>
+              <w:pStyle w:val="Compact"/>
+              <w:jc w:val="left"/>
+            </w:pPr>
+            <w:r>
+              <w:t xml:space="preserve">Scan port terbuka dengan banner grabbing</w:t>
+            </w:r>
+          </w:p>
+        </w:tc>
+        <w:tc>
+          <w:tcPr/>
+          <w:p>
+            <w:pPr>
+              <w:pStyle w:val="Compact"/>
+              <w:jc w:val="center"/>
+            </w:pPr>
+            <w:r>
+              <w:t xml:space="preserve">Lulus</w:t>
+            </w:r>
+          </w:p>
+        </w:tc>
+      </w:tr>
+      <w:tr>
+        <w:tc>
+          <w:tcPr/>
+          <w:p>
+            <w:pPr>
+              <w:pStyle w:val="Compact"/>
+              <w:jc w:val="center"/>
+            </w:pPr>
+            <w:r>
+              <w:t xml:space="preserve">14</w:t>
+            </w:r>
+          </w:p>
+        </w:tc>
+        <w:tc>
+          <w:tcPr/>
+          <w:p>
+            <w:pPr>
+              <w:pStyle w:val="Compact"/>
+              <w:jc w:val="left"/>
+            </w:pPr>
+            <w:r>
+              <w:t xml:space="preserve">portscan</w:t>
+            </w:r>
+          </w:p>
+        </w:tc>
+        <w:tc>
+          <w:tcPr/>
+          <w:p>
+            <w:pPr>
+              <w:pStyle w:val="Compact"/>
+              <w:jc w:val="left"/>
+            </w:pPr>
+            <w:r>
+              <w:t xml:space="preserve">Scan port tertutup</w:t>
             </w:r>
             <w:r>
               <w:t xml:space="preserve"> </w:t>
@@ -8301,7 +10092,7 @@
               <w:t xml:space="preserve"> </w:t>
             </w:r>
             <w:r>
-              <w:t xml:space="preserve">I3/I7</w:t>
+              <w:t xml:space="preserve">tidak dilaporkan</w:t>
             </w:r>
           </w:p>
         </w:tc>
@@ -8324,10 +10115,143 @@
           <w:p>
             <w:pPr>
               <w:pStyle w:val="Compact"/>
-              <w:jc w:val="left"/>
-            </w:pPr>
-            <w:r>
-              <w:t xml:space="preserve">RTSP (554)</w:t>
+              <w:jc w:val="center"/>
+            </w:pPr>
+            <w:r>
+              <w:t xml:space="preserve">15</w:t>
+            </w:r>
+          </w:p>
+        </w:tc>
+        <w:tc>
+          <w:tcPr/>
+          <w:p>
+            <w:pPr>
+              <w:pStyle w:val="Compact"/>
+              <w:jc w:val="left"/>
+            </w:pPr>
+            <w:r>
+              <w:t xml:space="preserve">portscan</w:t>
+            </w:r>
+          </w:p>
+        </w:tc>
+        <w:tc>
+          <w:tcPr/>
+          <w:p>
+            <w:pPr>
+              <w:pStyle w:val="Compact"/>
+              <w:jc w:val="left"/>
+            </w:pPr>
+            <w:r>
+              <w:rPr>
+                <w:rStyle w:val="VerbatimChar"/>
+              </w:rPr>
+              <w:t xml:space="preserve">scan_host_socket</w:t>
+            </w:r>
+            <w:r>
+              <w:t xml:space="preserve"> </w:t>
+            </w:r>
+            <w:r>
+              <w:t xml:space="preserve">mengembalikan port terbuka</w:t>
+            </w:r>
+          </w:p>
+        </w:tc>
+        <w:tc>
+          <w:tcPr/>
+          <w:p>
+            <w:pPr>
+              <w:pStyle w:val="Compact"/>
+              <w:jc w:val="center"/>
+            </w:pPr>
+            <w:r>
+              <w:t xml:space="preserve">Lulus</w:t>
+            </w:r>
+          </w:p>
+        </w:tc>
+      </w:tr>
+      <w:tr>
+        <w:tc>
+          <w:tcPr/>
+          <w:p>
+            <w:pPr>
+              <w:pStyle w:val="Compact"/>
+              <w:jc w:val="center"/>
+            </w:pPr>
+            <w:r>
+              <w:t xml:space="preserve">16</w:t>
+            </w:r>
+          </w:p>
+        </w:tc>
+        <w:tc>
+          <w:tcPr/>
+          <w:p>
+            <w:pPr>
+              <w:pStyle w:val="Compact"/>
+              <w:jc w:val="left"/>
+            </w:pPr>
+            <w:r>
+              <w:t xml:space="preserve">portscan</w:t>
+            </w:r>
+          </w:p>
+        </w:tc>
+        <w:tc>
+          <w:tcPr/>
+          <w:p>
+            <w:pPr>
+              <w:pStyle w:val="Compact"/>
+              <w:jc w:val="left"/>
+            </w:pPr>
+            <w:r>
+              <w:t xml:space="preserve">Parsing keluaran Nmap grepable</w:t>
+            </w:r>
+          </w:p>
+        </w:tc>
+        <w:tc>
+          <w:tcPr/>
+          <w:p>
+            <w:pPr>
+              <w:pStyle w:val="Compact"/>
+              <w:jc w:val="center"/>
+            </w:pPr>
+            <w:r>
+              <w:t xml:space="preserve">Lulus</w:t>
+            </w:r>
+          </w:p>
+        </w:tc>
+      </w:tr>
+      <w:tr>
+        <w:tc>
+          <w:tcPr/>
+          <w:p>
+            <w:pPr>
+              <w:pStyle w:val="Compact"/>
+              <w:jc w:val="center"/>
+            </w:pPr>
+            <w:r>
+              <w:t xml:space="preserve">17</w:t>
+            </w:r>
+          </w:p>
+        </w:tc>
+        <w:tc>
+          <w:tcPr/>
+          <w:p>
+            <w:pPr>
+              <w:pStyle w:val="Compact"/>
+              <w:jc w:val="left"/>
+            </w:pPr>
+            <w:r>
+              <w:t xml:space="preserve">portscan</w:t>
+            </w:r>
+          </w:p>
+        </w:tc>
+        <w:tc>
+          <w:tcPr/>
+          <w:p>
+            <w:pPr>
+              <w:pStyle w:val="Compact"/>
+              <w:jc w:val="left"/>
+            </w:pPr>
+            <w:r>
+              <w:t xml:space="preserve">Fallback Nmap</w:t>
             </w:r>
             <w:r>
               <w:t xml:space="preserve"> </w:t>
@@ -8344,7 +10268,7 @@
               <w:t xml:space="preserve"> </w:t>
             </w:r>
             <w:r>
-              <w:t xml:space="preserve">I2/I7</w:t>
+              <w:t xml:space="preserve">socket otomatis</w:t>
             </w:r>
           </w:p>
         </w:tc>
@@ -8367,10 +10291,84 @@
           <w:p>
             <w:pPr>
               <w:pStyle w:val="Compact"/>
-              <w:jc w:val="left"/>
-            </w:pPr>
-            <w:r>
-              <w:t xml:space="preserve">Port tak dikenal</w:t>
+              <w:jc w:val="center"/>
+            </w:pPr>
+            <w:r>
+              <w:t xml:space="preserve">18</w:t>
+            </w:r>
+          </w:p>
+        </w:tc>
+        <w:tc>
+          <w:tcPr/>
+          <w:p>
+            <w:pPr>
+              <w:pStyle w:val="Compact"/>
+              <w:jc w:val="left"/>
+            </w:pPr>
+            <w:r>
+              <w:t xml:space="preserve">portscan</w:t>
+            </w:r>
+          </w:p>
+        </w:tc>
+        <w:tc>
+          <w:tcPr/>
+          <w:p>
+            <w:pPr>
+              <w:pStyle w:val="Compact"/>
+              <w:jc w:val="left"/>
+            </w:pPr>
+            <w:r>
+              <w:t xml:space="preserve">Probe UDP port terbuka (SSDP/mDNS)</w:t>
+            </w:r>
+          </w:p>
+        </w:tc>
+        <w:tc>
+          <w:tcPr/>
+          <w:p>
+            <w:pPr>
+              <w:pStyle w:val="Compact"/>
+              <w:jc w:val="center"/>
+            </w:pPr>
+            <w:r>
+              <w:t xml:space="preserve">Lulus</w:t>
+            </w:r>
+          </w:p>
+        </w:tc>
+      </w:tr>
+      <w:tr>
+        <w:tc>
+          <w:tcPr/>
+          <w:p>
+            <w:pPr>
+              <w:pStyle w:val="Compact"/>
+              <w:jc w:val="center"/>
+            </w:pPr>
+            <w:r>
+              <w:t xml:space="preserve">19</w:t>
+            </w:r>
+          </w:p>
+        </w:tc>
+        <w:tc>
+          <w:tcPr/>
+          <w:p>
+            <w:pPr>
+              <w:pStyle w:val="Compact"/>
+              <w:jc w:val="left"/>
+            </w:pPr>
+            <w:r>
+              <w:t xml:space="preserve">scanner</w:t>
+            </w:r>
+          </w:p>
+        </w:tc>
+        <w:tc>
+          <w:tcPr/>
+          <w:p>
+            <w:pPr>
+              <w:pStyle w:val="Compact"/>
+              <w:jc w:val="left"/>
+            </w:pPr>
+            <w:r>
+              <w:t xml:space="preserve">Agregasi host kosong</w:t>
             </w:r>
             <w:r>
               <w:t xml:space="preserve"> </w:t>
@@ -8387,7 +10385,7 @@
               <w:t xml:space="preserve"> </w:t>
             </w:r>
             <w:r>
-              <w:t xml:space="preserve">I2, SEDANG</w:t>
+              <w:t xml:space="preserve">AMAN, skor 0</w:t>
             </w:r>
           </w:p>
         </w:tc>
@@ -8410,10 +10408,134 @@
           <w:p>
             <w:pPr>
               <w:pStyle w:val="Compact"/>
-              <w:jc w:val="left"/>
-            </w:pPr>
-            <w:r>
-              <w:t xml:space="preserve">Banner usang</w:t>
+              <w:jc w:val="center"/>
+            </w:pPr>
+            <w:r>
+              <w:t xml:space="preserve">20</w:t>
+            </w:r>
+          </w:p>
+        </w:tc>
+        <w:tc>
+          <w:tcPr/>
+          <w:p>
+            <w:pPr>
+              <w:pStyle w:val="Compact"/>
+              <w:jc w:val="left"/>
+            </w:pPr>
+            <w:r>
+              <w:t xml:space="preserve">scanner</w:t>
+            </w:r>
+          </w:p>
+        </w:tc>
+        <w:tc>
+          <w:tcPr/>
+          <w:p>
+            <w:pPr>
+              <w:pStyle w:val="Compact"/>
+              <w:jc w:val="left"/>
+            </w:pPr>
+            <w:r>
+              <w:t xml:space="preserve">Agregasi gabungan kategori OWASP dan severity</w:t>
+            </w:r>
+          </w:p>
+        </w:tc>
+        <w:tc>
+          <w:tcPr/>
+          <w:p>
+            <w:pPr>
+              <w:pStyle w:val="Compact"/>
+              <w:jc w:val="center"/>
+            </w:pPr>
+            <w:r>
+              <w:t xml:space="preserve">Lulus</w:t>
+            </w:r>
+          </w:p>
+        </w:tc>
+      </w:tr>
+      <w:tr>
+        <w:tc>
+          <w:tcPr/>
+          <w:p>
+            <w:pPr>
+              <w:pStyle w:val="Compact"/>
+              <w:jc w:val="center"/>
+            </w:pPr>
+            <w:r>
+              <w:t xml:space="preserve">21</w:t>
+            </w:r>
+          </w:p>
+        </w:tc>
+        <w:tc>
+          <w:tcPr/>
+          <w:p>
+            <w:pPr>
+              <w:pStyle w:val="Compact"/>
+              <w:jc w:val="left"/>
+            </w:pPr>
+            <w:r>
+              <w:t xml:space="preserve">scanner</w:t>
+            </w:r>
+          </w:p>
+        </w:tc>
+        <w:tc>
+          <w:tcPr/>
+          <w:p>
+            <w:pPr>
+              <w:pStyle w:val="Compact"/>
+              <w:jc w:val="left"/>
+            </w:pPr>
+            <w:r>
+              <w:t xml:space="preserve">Laporan terurut menurun berdasarkan skor risiko</w:t>
+            </w:r>
+          </w:p>
+        </w:tc>
+        <w:tc>
+          <w:tcPr/>
+          <w:p>
+            <w:pPr>
+              <w:pStyle w:val="Compact"/>
+              <w:jc w:val="center"/>
+            </w:pPr>
+            <w:r>
+              <w:t xml:space="preserve">Lulus</w:t>
+            </w:r>
+          </w:p>
+        </w:tc>
+      </w:tr>
+      <w:tr>
+        <w:tc>
+          <w:tcPr/>
+          <w:p>
+            <w:pPr>
+              <w:pStyle w:val="Compact"/>
+              <w:jc w:val="center"/>
+            </w:pPr>
+            <w:r>
+              <w:t xml:space="preserve">22</w:t>
+            </w:r>
+          </w:p>
+        </w:tc>
+        <w:tc>
+          <w:tcPr/>
+          <w:p>
+            <w:pPr>
+              <w:pStyle w:val="Compact"/>
+              <w:jc w:val="left"/>
+            </w:pPr>
+            <w:r>
+              <w:t xml:space="preserve">scanner</w:t>
+            </w:r>
+          </w:p>
+        </w:tc>
+        <w:tc>
+          <w:tcPr/>
+          <w:p>
+            <w:pPr>
+              <w:pStyle w:val="Compact"/>
+              <w:jc w:val="left"/>
+            </w:pPr>
+            <w:r>
+              <w:t xml:space="preserve">Deteksi banner usang HTTP</w:t>
             </w:r>
             <w:r>
               <w:t xml:space="preserve"> </w:t>
@@ -8430,23 +10552,7 @@
               <w:t xml:space="preserve"> </w:t>
             </w:r>
             <w:r>
-              <w:t xml:space="preserve">+I5 &amp;</w:t>
-            </w:r>
-            <w:r>
-              <w:t xml:space="preserve"> </w:t>
-            </w:r>
-            <w:r>
-              <w:rPr>
-                <w:i/>
-                <w:iCs/>
-              </w:rPr>
-              <w:t xml:space="preserve">severity</w:t>
-            </w:r>
-            <w:r>
-              <w:t xml:space="preserve"> </w:t>
-            </w:r>
-            <w:r>
-              <w:t xml:space="preserve">naik</w:t>
+              <w:t xml:space="preserve">tambah I5 &amp; eskalasi severity</w:t>
             </w:r>
           </w:p>
         </w:tc>
@@ -8469,10 +10575,34 @@
           <w:p>
             <w:pPr>
               <w:pStyle w:val="Compact"/>
-              <w:jc w:val="left"/>
-            </w:pPr>
-            <w:r>
-              <w:t xml:space="preserve">Host gabungan</w:t>
+              <w:jc w:val="center"/>
+            </w:pPr>
+            <w:r>
+              <w:t xml:space="preserve">23</w:t>
+            </w:r>
+          </w:p>
+        </w:tc>
+        <w:tc>
+          <w:tcPr/>
+          <w:p>
+            <w:pPr>
+              <w:pStyle w:val="Compact"/>
+              <w:jc w:val="left"/>
+            </w:pPr>
+            <w:r>
+              <w:t xml:space="preserve">scanner</w:t>
+            </w:r>
+          </w:p>
+        </w:tc>
+        <w:tc>
+          <w:tcPr/>
+          <w:p>
+            <w:pPr>
+              <w:pStyle w:val="Compact"/>
+              <w:jc w:val="left"/>
+            </w:pPr>
+            <w:r>
+              <w:t xml:space="preserve">Deteksi kredensial bawaan</w:t>
             </w:r>
             <w:r>
               <w:t xml:space="preserve"> </w:t>
@@ -8489,7 +10619,107 @@
               <w:t xml:space="preserve"> </w:t>
             </w:r>
             <w:r>
-              <w:t xml:space="preserve">KRITIS; host kosong</w:t>
+              <w:t xml:space="preserve">I1/I9, KRITIS</w:t>
+            </w:r>
+          </w:p>
+        </w:tc>
+        <w:tc>
+          <w:tcPr/>
+          <w:p>
+            <w:pPr>
+              <w:pStyle w:val="Compact"/>
+              <w:jc w:val="center"/>
+            </w:pPr>
+            <w:r>
+              <w:t xml:space="preserve">Lulus</w:t>
+            </w:r>
+          </w:p>
+        </w:tc>
+      </w:tr>
+      <w:tr>
+        <w:tc>
+          <w:tcPr/>
+          <w:p>
+            <w:pPr>
+              <w:pStyle w:val="Compact"/>
+              <w:jc w:val="center"/>
+            </w:pPr>
+            <w:r>
+              <w:t xml:space="preserve">24</w:t>
+            </w:r>
+          </w:p>
+        </w:tc>
+        <w:tc>
+          <w:tcPr/>
+          <w:p>
+            <w:pPr>
+              <w:pStyle w:val="Compact"/>
+              <w:jc w:val="left"/>
+            </w:pPr>
+            <w:r>
+              <w:t xml:space="preserve">scanner</w:t>
+            </w:r>
+          </w:p>
+        </w:tc>
+        <w:tc>
+          <w:tcPr/>
+          <w:p>
+            <w:pPr>
+              <w:pStyle w:val="Compact"/>
+              <w:jc w:val="left"/>
+            </w:pPr>
+            <w:r>
+              <w:t xml:space="preserve">Ekspor laporan PDF valid dan dapat dibaca</w:t>
+            </w:r>
+          </w:p>
+        </w:tc>
+        <w:tc>
+          <w:tcPr/>
+          <w:p>
+            <w:pPr>
+              <w:pStyle w:val="Compact"/>
+              <w:jc w:val="center"/>
+            </w:pPr>
+            <w:r>
+              <w:t xml:space="preserve">Lulus</w:t>
+            </w:r>
+          </w:p>
+        </w:tc>
+      </w:tr>
+      <w:tr>
+        <w:tc>
+          <w:tcPr/>
+          <w:p>
+            <w:pPr>
+              <w:pStyle w:val="Compact"/>
+              <w:jc w:val="center"/>
+            </w:pPr>
+            <w:r>
+              <w:t xml:space="preserve">25</w:t>
+            </w:r>
+          </w:p>
+        </w:tc>
+        <w:tc>
+          <w:tcPr/>
+          <w:p>
+            <w:pPr>
+              <w:pStyle w:val="Compact"/>
+              <w:jc w:val="left"/>
+            </w:pPr>
+            <w:r>
+              <w:t xml:space="preserve">tlscheck</w:t>
+            </w:r>
+          </w:p>
+        </w:tc>
+        <w:tc>
+          <w:tcPr/>
+          <w:p>
+            <w:pPr>
+              <w:pStyle w:val="Compact"/>
+              <w:jc w:val="left"/>
+            </w:pPr>
+            <w:r>
+              <w:t xml:space="preserve">Protokol TLS usang (SSLv3/TLS 1.0/1.1)</w:t>
             </w:r>
             <w:r>
               <w:t xml:space="preserve"> </w:t>
@@ -8506,7 +10736,7 @@
               <w:t xml:space="preserve"> </w:t>
             </w:r>
             <w:r>
-              <w:t xml:space="preserve">AMAN</w:t>
+              <w:t xml:space="preserve">I7 terdeteksi</w:t>
             </w:r>
           </w:p>
         </w:tc>
@@ -8529,10 +10759,51 @@
           <w:p>
             <w:pPr>
               <w:pStyle w:val="Compact"/>
-              <w:jc w:val="left"/>
-            </w:pPr>
-            <w:r>
-              <w:t xml:space="preserve">Normalisasi MAC (berbagai pemisah)</w:t>
+              <w:jc w:val="center"/>
+            </w:pPr>
+            <w:r>
+              <w:t xml:space="preserve">26</w:t>
+            </w:r>
+          </w:p>
+        </w:tc>
+        <w:tc>
+          <w:tcPr/>
+          <w:p>
+            <w:pPr>
+              <w:pStyle w:val="Compact"/>
+              <w:jc w:val="left"/>
+            </w:pPr>
+            <w:r>
+              <w:t xml:space="preserve">tlscheck</w:t>
+            </w:r>
+          </w:p>
+        </w:tc>
+        <w:tc>
+          <w:tcPr/>
+          <w:p>
+            <w:pPr>
+              <w:pStyle w:val="Compact"/>
+              <w:jc w:val="left"/>
+            </w:pPr>
+            <w:r>
+              <w:t xml:space="preserve">Protokol TLS modern</w:t>
+            </w:r>
+            <w:r>
+              <w:t xml:space="preserve"> </w:t>
+            </w:r>
+            <m:oMath>
+              <m:r>
+                <m:rPr>
+                  <m:sty m:val="p"/>
+                </m:rPr>
+                <m:t>→</m:t>
+              </m:r>
+            </m:oMath>
+            <w:r>
+              <w:t xml:space="preserve"> </w:t>
+            </w:r>
+            <w:r>
+              <w:t xml:space="preserve">tidak ada temuan</w:t>
             </w:r>
           </w:p>
         </w:tc>
@@ -8555,10 +10826,51 @@
           <w:p>
             <w:pPr>
               <w:pStyle w:val="Compact"/>
-              <w:jc w:val="left"/>
-            </w:pPr>
-            <w:r>
-              <w:t xml:space="preserve">Penolakan MAC tidak valid</w:t>
+              <w:jc w:val="center"/>
+            </w:pPr>
+            <w:r>
+              <w:t xml:space="preserve">27</w:t>
+            </w:r>
+          </w:p>
+        </w:tc>
+        <w:tc>
+          <w:tcPr/>
+          <w:p>
+            <w:pPr>
+              <w:pStyle w:val="Compact"/>
+              <w:jc w:val="left"/>
+            </w:pPr>
+            <w:r>
+              <w:t xml:space="preserve">tlscheck</w:t>
+            </w:r>
+          </w:p>
+        </w:tc>
+        <w:tc>
+          <w:tcPr/>
+          <w:p>
+            <w:pPr>
+              <w:pStyle w:val="Compact"/>
+              <w:jc w:val="left"/>
+            </w:pPr>
+            <w:r>
+              <w:t xml:space="preserve">Cipher lemah (RC4/3DES)</w:t>
+            </w:r>
+            <w:r>
+              <w:t xml:space="preserve"> </w:t>
+            </w:r>
+            <m:oMath>
+              <m:r>
+                <m:rPr>
+                  <m:sty m:val="p"/>
+                </m:rPr>
+                <m:t>→</m:t>
+              </m:r>
+            </m:oMath>
+            <w:r>
+              <w:t xml:space="preserve"> </w:t>
+            </w:r>
+            <w:r>
+              <w:t xml:space="preserve">I7 terdeteksi</w:t>
             </w:r>
           </w:p>
         </w:tc>
@@ -8581,20 +10893,51 @@
           <w:p>
             <w:pPr>
               <w:pStyle w:val="Compact"/>
-              <w:jc w:val="left"/>
-            </w:pPr>
-            <w:r>
-              <w:rPr>
-                <w:i/>
-                <w:iCs/>
-              </w:rPr>
-              <w:t xml:space="preserve">Vendor lookup</w:t>
+              <w:jc w:val="center"/>
+            </w:pPr>
+            <w:r>
+              <w:t xml:space="preserve">28</w:t>
+            </w:r>
+          </w:p>
+        </w:tc>
+        <w:tc>
+          <w:tcPr/>
+          <w:p>
+            <w:pPr>
+              <w:pStyle w:val="Compact"/>
+              <w:jc w:val="left"/>
+            </w:pPr>
+            <w:r>
+              <w:t xml:space="preserve">tlscheck</w:t>
+            </w:r>
+          </w:p>
+        </w:tc>
+        <w:tc>
+          <w:tcPr/>
+          <w:p>
+            <w:pPr>
+              <w:pStyle w:val="Compact"/>
+              <w:jc w:val="left"/>
+            </w:pPr>
+            <w:r>
+              <w:t xml:space="preserve">Header keamanan HTTP hilang</w:t>
             </w:r>
             <w:r>
               <w:t xml:space="preserve"> </w:t>
             </w:r>
-            <w:r>
-              <w:t xml:space="preserve">(Raspberry Pi vs Unknown)</w:t>
+            <m:oMath>
+              <m:r>
+                <m:rPr>
+                  <m:sty m:val="p"/>
+                </m:rPr>
+                <m:t>→</m:t>
+              </m:r>
+            </m:oMath>
+            <w:r>
+              <w:t xml:space="preserve"> </w:t>
+            </w:r>
+            <w:r>
+              <w:t xml:space="preserve">I3 terdeteksi</w:t>
             </w:r>
           </w:p>
         </w:tc>
@@ -8617,38 +10960,51 @@
           <w:p>
             <w:pPr>
               <w:pStyle w:val="Compact"/>
-              <w:jc w:val="left"/>
-            </w:pPr>
-            <w:r>
-              <w:rPr>
-                <w:i/>
-                <w:iCs/>
-              </w:rPr>
-              <w:t xml:space="preserve">Parsing</w:t>
+              <w:jc w:val="center"/>
+            </w:pPr>
+            <w:r>
+              <w:t xml:space="preserve">29</w:t>
+            </w:r>
+          </w:p>
+        </w:tc>
+        <w:tc>
+          <w:tcPr/>
+          <w:p>
+            <w:pPr>
+              <w:pStyle w:val="Compact"/>
+              <w:jc w:val="left"/>
+            </w:pPr>
+            <w:r>
+              <w:t xml:space="preserve">tlscheck</w:t>
+            </w:r>
+          </w:p>
+        </w:tc>
+        <w:tc>
+          <w:tcPr/>
+          <w:p>
+            <w:pPr>
+              <w:pStyle w:val="Compact"/>
+              <w:jc w:val="left"/>
+            </w:pPr>
+            <w:r>
+              <w:t xml:space="preserve">Header keamanan HTTP lengkap</w:t>
             </w:r>
             <w:r>
               <w:t xml:space="preserve"> </w:t>
             </w:r>
-            <w:r>
-              <w:rPr>
-                <w:rStyle w:val="VerbatimChar"/>
-              </w:rPr>
-              <w:t xml:space="preserve">ip neigh</w:t>
-            </w:r>
+            <m:oMath>
+              <m:r>
+                <m:rPr>
+                  <m:sty m:val="p"/>
+                </m:rPr>
+                <m:t>→</m:t>
+              </m:r>
+            </m:oMath>
             <w:r>
               <w:t xml:space="preserve"> </w:t>
             </w:r>
             <w:r>
-              <w:t xml:space="preserve">&amp;</w:t>
-            </w:r>
-            <w:r>
-              <w:t xml:space="preserve"> </w:t>
-            </w:r>
-            <w:r>
-              <w:rPr>
-                <w:rStyle w:val="VerbatimChar"/>
-              </w:rPr>
-              <w:t xml:space="preserve">arp -a</w:t>
+              <w:t xml:space="preserve">tidak ada temuan</w:t>
             </w:r>
           </w:p>
         </w:tc>
@@ -8671,10 +11027,34 @@
           <w:p>
             <w:pPr>
               <w:pStyle w:val="Compact"/>
-              <w:jc w:val="left"/>
-            </w:pPr>
-            <w:r>
-              <w:t xml:space="preserve">Ekspansi CIDR /30 &amp; /32</w:t>
+              <w:jc w:val="center"/>
+            </w:pPr>
+            <w:r>
+              <w:t xml:space="preserve">30</w:t>
+            </w:r>
+          </w:p>
+        </w:tc>
+        <w:tc>
+          <w:tcPr/>
+          <w:p>
+            <w:pPr>
+              <w:pStyle w:val="Compact"/>
+              <w:jc w:val="left"/>
+            </w:pPr>
+            <w:r>
+              <w:t xml:space="preserve">tlscheck</w:t>
+            </w:r>
+          </w:p>
+        </w:tc>
+        <w:tc>
+          <w:tcPr/>
+          <w:p>
+            <w:pPr>
+              <w:pStyle w:val="Compact"/>
+              <w:jc w:val="left"/>
+            </w:pPr>
+            <w:r>
+              <w:t xml:space="preserve">Integrasi cek header HTTP end-to-end</w:t>
             </w:r>
           </w:p>
         </w:tc>
@@ -8697,10 +11077,403 @@
           <w:p>
             <w:pPr>
               <w:pStyle w:val="Compact"/>
-              <w:jc w:val="left"/>
-            </w:pPr>
-            <w:r>
-              <w:t xml:space="preserve">Deteksi IP privat</w:t>
+              <w:jc w:val="center"/>
+            </w:pPr>
+            <w:r>
+              <w:t xml:space="preserve">31</w:t>
+            </w:r>
+          </w:p>
+        </w:tc>
+        <w:tc>
+          <w:tcPr/>
+          <w:p>
+            <w:pPr>
+              <w:pStyle w:val="Compact"/>
+              <w:jc w:val="left"/>
+            </w:pPr>
+            <w:r>
+              <w:t xml:space="preserve">vulnmap</w:t>
+            </w:r>
+          </w:p>
+        </w:tc>
+        <w:tc>
+          <w:tcPr/>
+          <w:p>
+            <w:pPr>
+              <w:pStyle w:val="Compact"/>
+              <w:jc w:val="left"/>
+            </w:pPr>
+            <w:r>
+              <w:t xml:space="preserve">Telnet (23)</w:t>
+            </w:r>
+            <w:r>
+              <w:t xml:space="preserve"> </w:t>
+            </w:r>
+            <m:oMath>
+              <m:r>
+                <m:rPr>
+                  <m:sty m:val="p"/>
+                </m:rPr>
+                <m:t>→</m:t>
+              </m:r>
+            </m:oMath>
+            <w:r>
+              <w:t xml:space="preserve"> </w:t>
+            </w:r>
+            <w:r>
+              <w:t xml:space="preserve">KRITIS, I1/I2/I7</w:t>
+            </w:r>
+          </w:p>
+        </w:tc>
+        <w:tc>
+          <w:tcPr/>
+          <w:p>
+            <w:pPr>
+              <w:pStyle w:val="Compact"/>
+              <w:jc w:val="center"/>
+            </w:pPr>
+            <w:r>
+              <w:t xml:space="preserve">Lulus</w:t>
+            </w:r>
+          </w:p>
+        </w:tc>
+      </w:tr>
+      <w:tr>
+        <w:tc>
+          <w:tcPr/>
+          <w:p>
+            <w:pPr>
+              <w:pStyle w:val="Compact"/>
+              <w:jc w:val="center"/>
+            </w:pPr>
+            <w:r>
+              <w:t xml:space="preserve">32</w:t>
+            </w:r>
+          </w:p>
+        </w:tc>
+        <w:tc>
+          <w:tcPr/>
+          <w:p>
+            <w:pPr>
+              <w:pStyle w:val="Compact"/>
+              <w:jc w:val="left"/>
+            </w:pPr>
+            <w:r>
+              <w:t xml:space="preserve">vulnmap</w:t>
+            </w:r>
+          </w:p>
+        </w:tc>
+        <w:tc>
+          <w:tcPr/>
+          <w:p>
+            <w:pPr>
+              <w:pStyle w:val="Compact"/>
+              <w:jc w:val="left"/>
+            </w:pPr>
+            <w:r>
+              <w:t xml:space="preserve">HTTP (80)</w:t>
+            </w:r>
+            <w:r>
+              <w:t xml:space="preserve"> </w:t>
+            </w:r>
+            <m:oMath>
+              <m:r>
+                <m:rPr>
+                  <m:sty m:val="p"/>
+                </m:rPr>
+                <m:t>→</m:t>
+              </m:r>
+            </m:oMath>
+            <w:r>
+              <w:t xml:space="preserve"> </w:t>
+            </w:r>
+            <w:r>
+              <w:t xml:space="preserve">TINGGI, I3/I7</w:t>
+            </w:r>
+          </w:p>
+        </w:tc>
+        <w:tc>
+          <w:tcPr/>
+          <w:p>
+            <w:pPr>
+              <w:pStyle w:val="Compact"/>
+              <w:jc w:val="center"/>
+            </w:pPr>
+            <w:r>
+              <w:t xml:space="preserve">Lulus</w:t>
+            </w:r>
+          </w:p>
+        </w:tc>
+      </w:tr>
+      <w:tr>
+        <w:tc>
+          <w:tcPr/>
+          <w:p>
+            <w:pPr>
+              <w:pStyle w:val="Compact"/>
+              <w:jc w:val="center"/>
+            </w:pPr>
+            <w:r>
+              <w:t xml:space="preserve">33</w:t>
+            </w:r>
+          </w:p>
+        </w:tc>
+        <w:tc>
+          <w:tcPr/>
+          <w:p>
+            <w:pPr>
+              <w:pStyle w:val="Compact"/>
+              <w:jc w:val="left"/>
+            </w:pPr>
+            <w:r>
+              <w:t xml:space="preserve">vulnmap</w:t>
+            </w:r>
+          </w:p>
+        </w:tc>
+        <w:tc>
+          <w:tcPr/>
+          <w:p>
+            <w:pPr>
+              <w:pStyle w:val="Compact"/>
+              <w:jc w:val="left"/>
+            </w:pPr>
+            <w:r>
+              <w:t xml:space="preserve">RTSP (554)</w:t>
+            </w:r>
+            <w:r>
+              <w:t xml:space="preserve"> </w:t>
+            </w:r>
+            <m:oMath>
+              <m:r>
+                <m:rPr>
+                  <m:sty m:val="p"/>
+                </m:rPr>
+                <m:t>→</m:t>
+              </m:r>
+            </m:oMath>
+            <w:r>
+              <w:t xml:space="preserve"> </w:t>
+            </w:r>
+            <w:r>
+              <w:t xml:space="preserve">TINGGI, I2/I7</w:t>
+            </w:r>
+          </w:p>
+        </w:tc>
+        <w:tc>
+          <w:tcPr/>
+          <w:p>
+            <w:pPr>
+              <w:pStyle w:val="Compact"/>
+              <w:jc w:val="center"/>
+            </w:pPr>
+            <w:r>
+              <w:t xml:space="preserve">Lulus</w:t>
+            </w:r>
+          </w:p>
+        </w:tc>
+      </w:tr>
+      <w:tr>
+        <w:tc>
+          <w:tcPr/>
+          <w:p>
+            <w:pPr>
+              <w:pStyle w:val="Compact"/>
+              <w:jc w:val="center"/>
+            </w:pPr>
+            <w:r>
+              <w:t xml:space="preserve">34</w:t>
+            </w:r>
+          </w:p>
+        </w:tc>
+        <w:tc>
+          <w:tcPr/>
+          <w:p>
+            <w:pPr>
+              <w:pStyle w:val="Compact"/>
+              <w:jc w:val="left"/>
+            </w:pPr>
+            <w:r>
+              <w:t xml:space="preserve">vulnmap</w:t>
+            </w:r>
+          </w:p>
+        </w:tc>
+        <w:tc>
+          <w:tcPr/>
+          <w:p>
+            <w:pPr>
+              <w:pStyle w:val="Compact"/>
+              <w:jc w:val="left"/>
+            </w:pPr>
+            <w:r>
+              <w:t xml:space="preserve">Port tak dikenal</w:t>
+            </w:r>
+            <w:r>
+              <w:t xml:space="preserve"> </w:t>
+            </w:r>
+            <m:oMath>
+              <m:r>
+                <m:rPr>
+                  <m:sty m:val="p"/>
+                </m:rPr>
+                <m:t>→</m:t>
+              </m:r>
+            </m:oMath>
+            <w:r>
+              <w:t xml:space="preserve"> </w:t>
+            </w:r>
+            <w:r>
+              <w:t xml:space="preserve">SEDANG, I2</w:t>
+            </w:r>
+          </w:p>
+        </w:tc>
+        <w:tc>
+          <w:tcPr/>
+          <w:p>
+            <w:pPr>
+              <w:pStyle w:val="Compact"/>
+              <w:jc w:val="center"/>
+            </w:pPr>
+            <w:r>
+              <w:t xml:space="preserve">Lulus</w:t>
+            </w:r>
+          </w:p>
+        </w:tc>
+      </w:tr>
+      <w:tr>
+        <w:tc>
+          <w:tcPr/>
+          <w:p>
+            <w:pPr>
+              <w:pStyle w:val="Compact"/>
+              <w:jc w:val="center"/>
+            </w:pPr>
+            <w:r>
+              <w:t xml:space="preserve">35</w:t>
+            </w:r>
+          </w:p>
+        </w:tc>
+        <w:tc>
+          <w:tcPr/>
+          <w:p>
+            <w:pPr>
+              <w:pStyle w:val="Compact"/>
+              <w:jc w:val="left"/>
+            </w:pPr>
+            <w:r>
+              <w:t xml:space="preserve">vulnmap</w:t>
+            </w:r>
+          </w:p>
+        </w:tc>
+        <w:tc>
+          <w:tcPr/>
+          <w:p>
+            <w:pPr>
+              <w:pStyle w:val="Compact"/>
+              <w:jc w:val="left"/>
+            </w:pPr>
+            <w:r>
+              <w:t xml:space="preserve">Banner usang</w:t>
+            </w:r>
+            <w:r>
+              <w:t xml:space="preserve"> </w:t>
+            </w:r>
+            <m:oMath>
+              <m:r>
+                <m:rPr>
+                  <m:sty m:val="p"/>
+                </m:rPr>
+                <m:t>→</m:t>
+              </m:r>
+            </m:oMath>
+            <w:r>
+              <w:t xml:space="preserve"> </w:t>
+            </w:r>
+            <w:r>
+              <w:t xml:space="preserve">tambah I5 &amp; severity naik</w:t>
+            </w:r>
+          </w:p>
+        </w:tc>
+        <w:tc>
+          <w:tcPr/>
+          <w:p>
+            <w:pPr>
+              <w:pStyle w:val="Compact"/>
+              <w:jc w:val="center"/>
+            </w:pPr>
+            <w:r>
+              <w:t xml:space="preserve">Lulus</w:t>
+            </w:r>
+          </w:p>
+        </w:tc>
+      </w:tr>
+      <w:tr>
+        <w:tc>
+          <w:tcPr/>
+          <w:p>
+            <w:pPr>
+              <w:pStyle w:val="Compact"/>
+              <w:jc w:val="center"/>
+            </w:pPr>
+            <w:r>
+              <w:t xml:space="preserve">36</w:t>
+            </w:r>
+          </w:p>
+        </w:tc>
+        <w:tc>
+          <w:tcPr/>
+          <w:p>
+            <w:pPr>
+              <w:pStyle w:val="Compact"/>
+              <w:jc w:val="left"/>
+            </w:pPr>
+            <w:r>
+              <w:t xml:space="preserve">vulnmap</w:t>
+            </w:r>
+          </w:p>
+        </w:tc>
+        <w:tc>
+          <w:tcPr/>
+          <w:p>
+            <w:pPr>
+              <w:pStyle w:val="Compact"/>
+              <w:jc w:val="left"/>
+            </w:pPr>
+            <w:r>
+              <w:t xml:space="preserve">Host gabungan</w:t>
+            </w:r>
+            <w:r>
+              <w:t xml:space="preserve"> </w:t>
+            </w:r>
+            <m:oMath>
+              <m:r>
+                <m:rPr>
+                  <m:sty m:val="p"/>
+                </m:rPr>
+                <m:t>→</m:t>
+              </m:r>
+            </m:oMath>
+            <w:r>
+              <w:t xml:space="preserve"> </w:t>
+            </w:r>
+            <w:r>
+              <w:t xml:space="preserve">KRITIS; host kosong</w:t>
+            </w:r>
+            <w:r>
+              <w:t xml:space="preserve"> </w:t>
+            </w:r>
+            <m:oMath>
+              <m:r>
+                <m:rPr>
+                  <m:sty m:val="p"/>
+                </m:rPr>
+                <m:t>→</m:t>
+              </m:r>
+            </m:oMath>
+            <w:r>
+              <w:t xml:space="preserve"> </w:t>
+            </w:r>
+            <w:r>
+              <w:t xml:space="preserve">AMAN/skor 0</w:t>
             </w:r>
           </w:p>
         </w:tc>
@@ -8718,7 +11491,6 @@
         </w:tc>
       </w:tr>
     </w:tbl>
-    <w:bookmarkEnd w:id="51"/>
     <w:bookmarkEnd w:id="52"/>
     <w:bookmarkStart w:id="53" w:name="pengujian-fungsional-terkontrol"/>
     <w:p>
@@ -9417,6 +12189,660 @@
         <w:pStyle w:val="BodyText"/>
       </w:pPr>
       <w:r>
+        <w:t xml:space="preserve">Dari delapan perangkat yang diuji pada jaringan rumah peneliti, tujuh perangkat</w:t>
+      </w:r>
+      <w:r>
+        <w:t xml:space="preserve"> </w:t>
+      </w:r>
+      <w:r>
+        <w:t xml:space="preserve">(87,5%) terdeteksi memiliki minimal satu temuan kerentanan jaringan. Perlu</w:t>
+      </w:r>
+      <w:r>
+        <w:t xml:space="preserve"> </w:t>
+      </w:r>
+      <w:r>
+        <w:t xml:space="preserve">dicatat bahwa angka persentase ini tidak dimaksudkan sebagai estimasi statistik</w:t>
+      </w:r>
+      <w:r>
+        <w:t xml:space="preserve"> </w:t>
+      </w:r>
+      <w:r>
+        <w:t xml:space="preserve">yang dapat digeneralisasi, mengingat ukuran sampel yang terbatas pada satu</w:t>
+      </w:r>
+      <w:r>
+        <w:t xml:space="preserve"> </w:t>
+      </w:r>
+      <w:r>
+        <w:t xml:space="preserve">lingkungan jaringan domestik. Temuan ini lebih tepat diinterpretasikan sebagai</w:t>
+      </w:r>
+      <w:r>
+        <w:t xml:space="preserve"> </w:t>
+      </w:r>
+      <w:r>
+        <w:t xml:space="preserve">indikasi bahwa kerentanan jaringan pada perangkat IoT domestik dapat dideteksi</w:t>
+      </w:r>
+      <w:r>
+        <w:t xml:space="preserve"> </w:t>
+      </w:r>
+      <w:r>
+        <w:t xml:space="preserve">secara otomatis oleh HomeGuard, konsisten dengan pola yang dilaporkan oleh</w:t>
+      </w:r>
+      <w:r>
+        <w:t xml:space="preserve"> </w:t>
+      </w:r>
+      <w:r>
+        <w:t xml:space="preserve">Bitdefender </w:t>
+      </w:r>
+      <w:r>
+        <w:t xml:space="preserve"> </w:t>
+      </w:r>
+      <w:r>
+        <w:t xml:space="preserve">pada skala yang lebih luas.</w:t>
+      </w:r>
+    </w:p>
+    <w:p>
+      <w:pPr>
+        <w:pStyle w:val="BodyText"/>
+      </w:pPr>
+      <w:r>
+        <w:t xml:space="preserve">Dari perspektif edukatif, HomeGuard berhasil mendemonstrasikan bahwa deteksi</w:t>
+      </w:r>
+      <w:r>
+        <w:t xml:space="preserve"> </w:t>
+      </w:r>
+      <w:r>
+        <w:t xml:space="preserve">kerentanan IoT tidak harus menjadi domain eksklusif praktisi keamanan. Dengan</w:t>
+      </w:r>
+      <w:r>
+        <w:t xml:space="preserve"> </w:t>
+      </w:r>
+      <w:r>
+        <w:t xml:space="preserve">menyajikan temuan dalam bentuk skor risiko intuitif, rekomendasi mitigasi dalam</w:t>
+      </w:r>
+      <w:r>
+        <w:t xml:space="preserve"> </w:t>
+      </w:r>
+      <w:r>
+        <w:t xml:space="preserve">Bahasa Indonesia, dan referensi OWASP IoT Top 10 yang kontekstual, aplikasi ini</w:t>
+      </w:r>
+      <w:r>
+        <w:t xml:space="preserve"> </w:t>
+      </w:r>
+      <w:r>
+        <w:t xml:space="preserve">memungkinkan pengguna rumahan untuk pertama kalinya mendapatkan visibilitas</w:t>
+      </w:r>
+      <w:r>
+        <w:t xml:space="preserve"> </w:t>
+      </w:r>
+      <w:r>
+        <w:t xml:space="preserve">terhadap kondisi keamanan jaringan mereka sendiri tanpa memerlukan pemahaman</w:t>
+      </w:r>
+      <w:r>
+        <w:t xml:space="preserve"> </w:t>
+      </w:r>
+      <w:r>
+        <w:t xml:space="preserve">teknis mendalam. Hal ini konsisten dengan temuan Alrawi</w:t>
+      </w:r>
+      <w:r>
+        <w:t xml:space="preserve"> </w:t>
+      </w:r>
+      <w:r>
+        <w:rPr>
+          <w:i/>
+          <w:iCs/>
+        </w:rPr>
+        <w:t xml:space="preserve">et al.</w:t>
+      </w:r>
+      <w:r>
+        <w:t xml:space="preserve"> </w:t>
+      </w:r>
+      <w:r>
+        <w:t xml:space="preserve"> </w:t>
+      </w:r>
+      <w:r>
+        <w:t xml:space="preserve">yang mengidentifikasi absennya</w:t>
+      </w:r>
+      <w:r>
+        <w:t xml:space="preserve"> </w:t>
+      </w:r>
+      <w:r>
+        <w:rPr>
+          <w:i/>
+          <w:iCs/>
+        </w:rPr>
+        <w:t xml:space="preserve">tools</w:t>
+      </w:r>
+      <w:r>
+        <w:t xml:space="preserve"> </w:t>
+      </w:r>
+      <w:r>
+        <w:t xml:space="preserve">automasi</w:t>
+      </w:r>
+      <w:r>
+        <w:t xml:space="preserve"> </w:t>
+      </w:r>
+      <w:r>
+        <w:t xml:space="preserve">untuk pengguna akhir sebagai salah satu</w:t>
+      </w:r>
+      <w:r>
+        <w:t xml:space="preserve"> </w:t>
+      </w:r>
+      <w:r>
+        <w:rPr>
+          <w:i/>
+          <w:iCs/>
+        </w:rPr>
+        <w:t xml:space="preserve">gap</w:t>
+      </w:r>
+      <w:r>
+        <w:t xml:space="preserve"> </w:t>
+      </w:r>
+      <w:r>
+        <w:t xml:space="preserve">utama dalam ekosistem</w:t>
+      </w:r>
+      <w:r>
+        <w:t xml:space="preserve"> </w:t>
+      </w:r>
+      <w:r>
+        <w:t xml:space="preserve">keamanan IoT domestik.</w:t>
+      </w:r>
+    </w:p>
+    <w:p>
+      <w:pPr>
+        <w:pStyle w:val="BodyText"/>
+      </w:pPr>
+      <w:r>
+        <w:t xml:space="preserve">Dominansi kategori I2 (</w:t>
+      </w:r>
+      <w:r>
+        <w:rPr>
+          <w:i/>
+          <w:iCs/>
+        </w:rPr>
+        <w:t xml:space="preserve">Insecure Network Services</w:t>
+      </w:r>
+      <w:r>
+        <w:t xml:space="preserve">) pada hasil pengujian</w:t>
+      </w:r>
+      <w:r>
+        <w:t xml:space="preserve"> </w:t>
+      </w:r>
+      <w:r>
+        <w:t xml:space="preserve">perlu diinterpretasikan dengan mempertimbangkan desain katalog port yang</w:t>
+      </w:r>
+      <w:r>
+        <w:t xml:space="preserve"> </w:t>
+      </w:r>
+      <w:r>
+        <w:t xml:space="preserve">digunakan. Sebagaimana terlihat pada Tabel </w:t>
+      </w:r>
+      <w:hyperlink w:anchor="tab:katalog">
+        <w:r>
+          <w:rPr>
+            <w:rStyle w:val="Hyperlink"/>
+          </w:rPr>
+          <w:t xml:space="preserve">4</w:t>
+        </w:r>
+      </w:hyperlink>
+      <w:r>
+        <w:t xml:space="preserve">, hampir seluruh</w:t>
+      </w:r>
+      <w:r>
+        <w:t xml:space="preserve"> </w:t>
+      </w:r>
+      <w:r>
+        <w:t xml:space="preserve">entri port dalam katalog IoT HomeGuard dipetakan ke kategori I2 karena definisi</w:t>
+      </w:r>
+      <w:r>
+        <w:t xml:space="preserve"> </w:t>
+      </w:r>
+      <w:r>
+        <w:t xml:space="preserve">OWASP sendiri menempatkan layanan jaringan tidak aman sebagai kategori yang</w:t>
+      </w:r>
+      <w:r>
+        <w:t xml:space="preserve"> </w:t>
+      </w:r>
+      <w:r>
+        <w:t xml:space="preserve">paling luas cakupannya — mencakup port terbuka yang tidak diperlukan,</w:t>
+      </w:r>
+      <w:r>
+        <w:t xml:space="preserve"> </w:t>
+      </w:r>
+      <w:r>
+        <w:t xml:space="preserve">protokol tidak terenkripsi, dan layanan dengan autentikasi lemah. Dengan</w:t>
+      </w:r>
+      <w:r>
+        <w:t xml:space="preserve"> </w:t>
+      </w:r>
+      <w:r>
+        <w:t xml:space="preserve">demikian, dominansi I2 merupakan konsekuensi yang dapat diprediksi dari</w:t>
+      </w:r>
+      <w:r>
+        <w:t xml:space="preserve"> </w:t>
+      </w:r>
+      <w:r>
+        <w:t xml:space="preserve">pendekatan</w:t>
+      </w:r>
+      <w:r>
+        <w:t xml:space="preserve"> </w:t>
+      </w:r>
+      <w:r>
+        <w:rPr>
+          <w:i/>
+          <w:iCs/>
+        </w:rPr>
+        <w:t xml:space="preserve">network-level scanning</w:t>
+      </w:r>
+      <w:r>
+        <w:t xml:space="preserve"> </w:t>
+      </w:r>
+      <w:r>
+        <w:t xml:space="preserve">yang digunakan, bukan semata-mata</w:t>
+      </w:r>
+      <w:r>
+        <w:t xml:space="preserve"> </w:t>
+      </w:r>
+      <w:r>
+        <w:t xml:space="preserve">temuan empiris independen. Yang lebih bermakna secara analitis adalah</w:t>
+      </w:r>
+      <w:r>
+        <w:t xml:space="preserve"> </w:t>
+      </w:r>
+      <w:r>
+        <w:t xml:space="preserve">keberadaan kategori I1 pada perangkat dengan Telnet aktif, yang secara langsung</w:t>
+      </w:r>
+      <w:r>
+        <w:t xml:space="preserve"> </w:t>
+      </w:r>
+      <w:r>
+        <w:t xml:space="preserve">mengindikasikan risiko eksploitasi kredensial bawaan sebagaimana didemonstrasikan</w:t>
+      </w:r>
+      <w:r>
+        <w:t xml:space="preserve"> </w:t>
+      </w:r>
+      <w:r>
+        <w:t xml:space="preserve">oleh botnet Mirai </w:t>
+      </w:r>
+      <w:r>
+        <w:t xml:space="preserve">, serta kemunculan I5 pada perangkat dengan banner</w:t>
+      </w:r>
+      <w:r>
+        <w:t xml:space="preserve"> </w:t>
+      </w:r>
+      <w:r>
+        <w:t xml:space="preserve">komponen usang yang terdeteksi.</w:t>
+      </w:r>
+    </w:p>
+    <w:p>
+      <w:pPr>
+        <w:pStyle w:val="BodyText"/>
+      </w:pPr>
+      <w:r>
+        <w:t xml:space="preserve">Analisis keterbatasan HomeGuard perlu mempertimbangkan kemungkinan terjadinya</w:t>
+      </w:r>
+      <w:r>
+        <w:t xml:space="preserve"> </w:t>
+      </w:r>
+      <w:r>
+        <w:rPr>
+          <w:i/>
+          <w:iCs/>
+        </w:rPr>
+        <w:t xml:space="preserve">false negative</w:t>
+      </w:r>
+      <w:r>
+        <w:t xml:space="preserve"> </w:t>
+      </w:r>
+      <w:r>
+        <w:t xml:space="preserve">— kondisi di mana perangkat IoT yang rentan tidak</w:t>
+      </w:r>
+      <w:r>
+        <w:t xml:space="preserve"> </w:t>
+      </w:r>
+      <w:r>
+        <w:t xml:space="preserve">terdeteksi oleh aplikasi. Berdasarkan analisis arsitektur modul Network</w:t>
+      </w:r>
+      <w:r>
+        <w:t xml:space="preserve"> </w:t>
+      </w:r>
+      <w:r>
+        <w:t xml:space="preserve">Discovery, terdapat tiga skenario utama yang dapat menyebabkan</w:t>
+      </w:r>
+      <w:r>
+        <w:t xml:space="preserve"> </w:t>
+      </w:r>
+      <w:r>
+        <w:rPr>
+          <w:i/>
+          <w:iCs/>
+        </w:rPr>
+        <w:t xml:space="preserve">false</w:t>
+      </w:r>
+      <w:r>
+        <w:rPr>
+          <w:i/>
+          <w:iCs/>
+        </w:rPr>
+        <w:t xml:space="preserve"> </w:t>
+      </w:r>
+      <w:r>
+        <w:rPr>
+          <w:i/>
+          <w:iCs/>
+        </w:rPr>
+        <w:t xml:space="preserve">negative</w:t>
+      </w:r>
+      <w:r>
+        <w:t xml:space="preserve">. Pertama, perangkat yang seluruh port TCP pada daftar probe (80, 443,</w:t>
+      </w:r>
+      <w:r>
+        <w:t xml:space="preserve"> </w:t>
+      </w:r>
+      <w:r>
+        <w:t xml:space="preserve">22, 23, 8080, 554, 53) diblokir oleh firewall lokal tidak akan merespons</w:t>
+      </w:r>
+      <w:r>
+        <w:t xml:space="preserve"> </w:t>
+      </w:r>
+      <w:r>
+        <w:rPr>
+          <w:i/>
+          <w:iCs/>
+        </w:rPr>
+        <w:t xml:space="preserve">TCP ping</w:t>
+      </w:r>
+      <w:r>
+        <w:t xml:space="preserve">, sehingga tidak masuk ke dalam daftar host hidup dan tidak</w:t>
+      </w:r>
+      <w:r>
+        <w:t xml:space="preserve"> </w:t>
+      </w:r>
+      <w:r>
+        <w:t xml:space="preserve">dipindai lebih lanjut. Kedua, perangkat IoT yang beroperasi secara eksklusif</w:t>
+      </w:r>
+      <w:r>
+        <w:t xml:space="preserve"> </w:t>
+      </w:r>
+      <w:r>
+        <w:t xml:space="preserve">sebagai klien</w:t>
+      </w:r>
+      <w:r>
+        <w:t xml:space="preserve"> </w:t>
+      </w:r>
+      <w:r>
+        <w:rPr>
+          <w:i/>
+          <w:iCs/>
+        </w:rPr>
+        <w:t xml:space="preserve">outbound</w:t>
+      </w:r>
+      <w:r>
+        <w:t xml:space="preserve"> </w:t>
+      </w:r>
+      <w:r>
+        <w:t xml:space="preserve">— yaitu hanya melakukan koneksi keluar ke</w:t>
+      </w:r>
+      <w:r>
+        <w:t xml:space="preserve"> </w:t>
+      </w:r>
+      <w:r>
+        <w:t xml:space="preserve">server cloud tanpa membuka port</w:t>
+      </w:r>
+      <w:r>
+        <w:t xml:space="preserve"> </w:t>
+      </w:r>
+      <w:r>
+        <w:rPr>
+          <w:i/>
+          <w:iCs/>
+        </w:rPr>
+        <w:t xml:space="preserve">listen</w:t>
+      </w:r>
+      <w:r>
+        <w:t xml:space="preserve"> </w:t>
+      </w:r>
+      <w:r>
+        <w:t xml:space="preserve">apapun — tidak dapat</w:t>
+      </w:r>
+      <w:r>
+        <w:t xml:space="preserve"> </w:t>
+      </w:r>
+      <w:r>
+        <w:t xml:space="preserve">dideteksi melalui pendekatan</w:t>
+      </w:r>
+      <w:r>
+        <w:t xml:space="preserve"> </w:t>
+      </w:r>
+      <w:r>
+        <w:rPr>
+          <w:i/>
+          <w:iCs/>
+        </w:rPr>
+        <w:t xml:space="preserve">TCP connect scan</w:t>
+      </w:r>
+      <w:r>
+        <w:t xml:space="preserve">. Perangkat kategori ini</w:t>
+      </w:r>
+      <w:r>
+        <w:t xml:space="preserve"> </w:t>
+      </w:r>
+      <w:r>
+        <w:t xml:space="preserve">umumnya mencakup generasi terbaru</w:t>
+      </w:r>
+      <w:r>
+        <w:t xml:space="preserve"> </w:t>
+      </w:r>
+      <w:r>
+        <w:rPr>
+          <w:i/>
+          <w:iCs/>
+        </w:rPr>
+        <w:t xml:space="preserve">smart plug</w:t>
+      </w:r>
+      <w:r>
+        <w:t xml:space="preserve"> </w:t>
+      </w:r>
+      <w:r>
+        <w:t xml:space="preserve">dan asisten virtual yang</w:t>
+      </w:r>
+      <w:r>
+        <w:t xml:space="preserve"> </w:t>
+      </w:r>
+      <w:r>
+        <w:t xml:space="preserve">dikelola sepenuhnya melalui cloud. Ketiga, perangkat yang sedang dalam kondisi</w:t>
+      </w:r>
+      <w:r>
+        <w:t xml:space="preserve"> </w:t>
+      </w:r>
+      <w:r>
+        <w:t xml:space="preserve">mati atau</w:t>
+      </w:r>
+      <w:r>
+        <w:t xml:space="preserve"> </w:t>
+      </w:r>
+      <w:r>
+        <w:rPr>
+          <w:i/>
+          <w:iCs/>
+        </w:rPr>
+        <w:t xml:space="preserve">sleep mode</w:t>
+      </w:r>
+      <w:r>
+        <w:t xml:space="preserve"> </w:t>
+      </w:r>
+      <w:r>
+        <w:t xml:space="preserve">pada saat pemindaian dilakukan akan luput dari</w:t>
+      </w:r>
+      <w:r>
+        <w:t xml:space="preserve"> </w:t>
+      </w:r>
+      <w:r>
+        <w:t xml:space="preserve">deteksi, mengingat HomeGuard melakukan</w:t>
+      </w:r>
+      <w:r>
+        <w:t xml:space="preserve"> </w:t>
+      </w:r>
+      <w:r>
+        <w:rPr>
+          <w:i/>
+          <w:iCs/>
+        </w:rPr>
+        <w:t xml:space="preserve">point-in-time scanning</w:t>
+      </w:r>
+      <w:r>
+        <w:t xml:space="preserve"> </w:t>
+      </w:r>
+      <w:r>
+        <w:t xml:space="preserve">dan</w:t>
+      </w:r>
+      <w:r>
+        <w:t xml:space="preserve"> </w:t>
+      </w:r>
+      <w:r>
+        <w:t xml:space="preserve">tidak mendukung pemindaian terjadwal secara berkala. Keterbatasan ini bersifat</w:t>
+      </w:r>
+      <w:r>
+        <w:t xml:space="preserve"> </w:t>
+      </w:r>
+      <w:r>
+        <w:rPr>
+          <w:i/>
+          <w:iCs/>
+        </w:rPr>
+        <w:t xml:space="preserve">inherent</w:t>
+      </w:r>
+      <w:r>
+        <w:t xml:space="preserve"> </w:t>
+      </w:r>
+      <w:r>
+        <w:t xml:space="preserve">pada pendekatan</w:t>
+      </w:r>
+      <w:r>
+        <w:t xml:space="preserve"> </w:t>
+      </w:r>
+      <w:r>
+        <w:rPr>
+          <w:i/>
+          <w:iCs/>
+        </w:rPr>
+        <w:t xml:space="preserve">network-level TCP scanning</w:t>
+      </w:r>
+      <w:r>
+        <w:t xml:space="preserve"> </w:t>
+      </w:r>
+      <w:r>
+        <w:t xml:space="preserve">tanpa</w:t>
+      </w:r>
+      <w:r>
+        <w:t xml:space="preserve"> </w:t>
+      </w:r>
+      <w:r>
+        <w:rPr>
+          <w:i/>
+          <w:iCs/>
+        </w:rPr>
+        <w:t xml:space="preserve">raw socket</w:t>
+      </w:r>
+      <w:r>
+        <w:t xml:space="preserve">, sebagaimana juga diakui dalam literatur terkait </w:t>
+      </w:r>
+      <w:r>
+        <w:t xml:space="preserve">.</w:t>
+      </w:r>
+      <w:r>
+        <w:t xml:space="preserve"> </w:t>
+      </w:r>
+      <w:r>
+        <w:t xml:space="preserve">Pengembangan lanjutan dapat mempertimbangkan integrasi</w:t>
+      </w:r>
+      <w:r>
+        <w:t xml:space="preserve"> </w:t>
+      </w:r>
+      <w:r>
+        <w:rPr>
+          <w:i/>
+          <w:iCs/>
+        </w:rPr>
+        <w:t xml:space="preserve">passive</w:t>
+      </w:r>
+      <w:r>
+        <w:rPr>
+          <w:i/>
+          <w:iCs/>
+        </w:rPr>
+        <w:t xml:space="preserve"> </w:t>
+      </w:r>
+      <w:r>
+        <w:rPr>
+          <w:i/>
+          <w:iCs/>
+        </w:rPr>
+        <w:t xml:space="preserve">monitoring</w:t>
+      </w:r>
+      <w:r>
+        <w:t xml:space="preserve"> </w:t>
+      </w:r>
+      <w:r>
+        <w:t xml:space="preserve">berbasis ARP</w:t>
+      </w:r>
+      <w:r>
+        <w:t xml:space="preserve"> </w:t>
+      </w:r>
+      <w:r>
+        <w:rPr>
+          <w:i/>
+          <w:iCs/>
+        </w:rPr>
+        <w:t xml:space="preserve">watch</w:t>
+      </w:r>
+      <w:r>
+        <w:t xml:space="preserve"> </w:t>
+      </w:r>
+      <w:r>
+        <w:t xml:space="preserve">untuk mengatasi skenario ketiga, serta</w:t>
+      </w:r>
+      <w:r>
+        <w:t xml:space="preserve"> </w:t>
+      </w:r>
+      <w:r>
+        <w:t xml:space="preserve">penambahan probe port yang lebih luas untuk mengurangi risiko</w:t>
+      </w:r>
+      <w:r>
+        <w:t xml:space="preserve"> </w:t>
+      </w:r>
+      <w:r>
+        <w:rPr>
+          <w:i/>
+          <w:iCs/>
+        </w:rPr>
+        <w:t xml:space="preserve">false</w:t>
+      </w:r>
+      <w:r>
+        <w:rPr>
+          <w:i/>
+          <w:iCs/>
+        </w:rPr>
+        <w:t xml:space="preserve"> </w:t>
+      </w:r>
+      <w:r>
+        <w:rPr>
+          <w:i/>
+          <w:iCs/>
+        </w:rPr>
+        <w:t xml:space="preserve">negative</w:t>
+      </w:r>
+      <w:r>
+        <w:t xml:space="preserve"> </w:t>
+      </w:r>
+      <w:r>
+        <w:t xml:space="preserve">pada skenario pertama.</w:t>
+      </w:r>
+    </w:p>
+    <w:p>
+      <w:pPr>
+        <w:pStyle w:val="BodyText"/>
+      </w:pPr>
+      <w:r>
         <w:t xml:space="preserve">Keterbatasan utama prototipe ini meliputi: cakupan katalog port yang masih</w:t>
       </w:r>
       <w:r>
@@ -9577,7 +13003,7 @@
         <w:t xml:space="preserve"> </w:t>
       </w:r>
       <w:r>
-        <w:t xml:space="preserve">mudah digunakan oleh pengguna rumahan. Pengujian unit (12/12 lulus) dan</w:t>
+        <w:t xml:space="preserve">mudah digunakan oleh pengguna rumahan. Pengujian unit (36/36 lulus) dan</w:t>
       </w:r>
       <w:r>
         <w:t xml:space="preserve"> </w:t>
@@ -9632,47 +13058,19 @@
         <w:pStyle w:val="FirstParagraph"/>
       </w:pPr>
       <w:r>
-        <w:t xml:space="preserve">Pengembangan lanjutan yang disarankan meliputi: (1) integrasi</w:t>
-      </w:r>
-      <w:r>
-        <w:t xml:space="preserve"> </w:t>
-      </w:r>
-      <w:r>
-        <w:rPr>
-          <w:i/>
-          <w:iCs/>
-        </w:rPr>
-        <w:t xml:space="preserve">Continuous Integration</w:t>
-      </w:r>
-      <w:r>
-        <w:t xml:space="preserve"> </w:t>
-      </w:r>
-      <w:r>
-        <w:t xml:space="preserve">(GitHub Actions) untuk otomasi pengujian;</w:t>
-      </w:r>
-      <w:r>
-        <w:t xml:space="preserve"> </w:t>
-      </w:r>
-      <w:r>
-        <w:t xml:space="preserve">(2) korelasi versi komponen dengan basis data CVE (kategori I5) melalui</w:t>
-      </w:r>
-      <w:r>
-        <w:t xml:space="preserve"> </w:t>
-      </w:r>
-      <w:r>
-        <w:t xml:space="preserve">NVD API; (3) penambahan fitur ekspor laporan dalam format PDF; dan</w:t>
-      </w:r>
-      <w:r>
-        <w:t xml:space="preserve"> </w:t>
-      </w:r>
-      <w:r>
-        <w:t xml:space="preserve">(4) pemutakhiran basis data OUI IEEE secara lengkap untuk meningkatkan</w:t>
-      </w:r>
-      <w:r>
-        <w:t xml:space="preserve"> </w:t>
-      </w:r>
-      <w:r>
-        <w:t xml:space="preserve">akurasi identifikasi</w:t>
+        <w:t xml:space="preserve">Pengembangan lanjutan yang disarankan meliputi: (1) korelasi versi komponen</w:t>
+      </w:r>
+      <w:r>
+        <w:t xml:space="preserve"> </w:t>
+      </w:r>
+      <w:r>
+        <w:t xml:space="preserve">dengan basis data CVE (kategori I5) melalui NVD API; (2) pemutakhiran basis</w:t>
+      </w:r>
+      <w:r>
+        <w:t xml:space="preserve"> </w:t>
+      </w:r>
+      <w:r>
+        <w:t xml:space="preserve">data OUI IEEE secara lengkap untuk meningkatkan akurasi identifikasi</w:t>
       </w:r>
       <w:r>
         <w:t xml:space="preserve"> </w:t>
@@ -9685,6 +13083,70 @@
         <w:t xml:space="preserve">vendor</w:t>
       </w:r>
       <w:r>
+        <w:t xml:space="preserve">; (3) integrasi</w:t>
+      </w:r>
+      <w:r>
+        <w:t xml:space="preserve"> </w:t>
+      </w:r>
+      <w:r>
+        <w:rPr>
+          <w:i/>
+          <w:iCs/>
+        </w:rPr>
+        <w:t xml:space="preserve">passive monitoring</w:t>
+      </w:r>
+      <w:r>
+        <w:t xml:space="preserve"> </w:t>
+      </w:r>
+      <w:r>
+        <w:t xml:space="preserve">berbasis ARP</w:t>
+      </w:r>
+      <w:r>
+        <w:t xml:space="preserve"> </w:t>
+      </w:r>
+      <w:r>
+        <w:rPr>
+          <w:i/>
+          <w:iCs/>
+        </w:rPr>
+        <w:t xml:space="preserve">watch</w:t>
+      </w:r>
+      <w:r>
+        <w:t xml:space="preserve"> </w:t>
+      </w:r>
+      <w:r>
+        <w:t xml:space="preserve">serta perluasan daftar probe port untuk mengurangi risiko</w:t>
+      </w:r>
+      <w:r>
+        <w:t xml:space="preserve"> </w:t>
+      </w:r>
+      <w:r>
+        <w:rPr>
+          <w:i/>
+          <w:iCs/>
+        </w:rPr>
+        <w:t xml:space="preserve">false negative</w:t>
+      </w:r>
+      <w:r>
+        <w:t xml:space="preserve">; dan (4) dukungan pemindaian terjadwal secara berkala</w:t>
+      </w:r>
+      <w:r>
+        <w:t xml:space="preserve"> </w:t>
+      </w:r>
+      <w:r>
+        <w:t xml:space="preserve">guna mengatasi keterbatasan</w:t>
+      </w:r>
+      <w:r>
+        <w:t xml:space="preserve"> </w:t>
+      </w:r>
+      <w:r>
+        <w:rPr>
+          <w:i/>
+          <w:iCs/>
+        </w:rPr>
+        <w:t xml:space="preserve">point-in-time scanning</w:t>
+      </w:r>
+      <w:r>
         <w:t xml:space="preserve">.</w:t>
       </w:r>
     </w:p>
@@ -10285,6 +13747,31 @@
       </w:r>
       <w:r>
         <w:t xml:space="preserve">, vol. 17, no. 3, pp. 12–22, Jul.–Sep. 2018.</w:t>
+      </w:r>
+      <w:r>
+        <w:t xml:space="preserve"> </w:t>
+      </w:r>
+      <w:r>
+        <w:t xml:space="preserve">A. R. Hevner, S. T. March, J. Park, and S. Ram,</w:t>
+      </w:r>
+      <w:r>
+        <w:t xml:space="preserve"> </w:t>
+      </w:r>
+      <w:r>
+        <w:t xml:space="preserve">“Design Science in Information Systems Research,”</w:t>
+      </w:r>
+      <w:r>
+        <w:t xml:space="preserve"> </w:t>
+      </w:r>
+      <w:r>
+        <w:rPr>
+          <w:i/>
+          <w:iCs/>
+        </w:rPr>
+        <w:t xml:space="preserve">MIS Quarterly</w:t>
+      </w:r>
+      <w:r>
+        <w:t xml:space="preserve">, vol. 28, no. 1, pp. 75–105, Mar. 2004.</w:t>
       </w:r>
     </w:p>
     <w:bookmarkEnd w:id="59"/>

</xml_diff>

<commit_message>
Selaraskan tabel hasil real-world ke 8 perangkat (konsisten dgn 87,5% & Tabel IV)
Co-Authored-By: Claude Sonnet 4.6 <noreply@anthropic.com>
Claude-Session: https://claude.ai/code/session_01SCvk2sv7i4VmZJAKiHwjn3
</commit_message>
<xml_diff>
--- a/paper/HomeGuard_paper.docx
+++ b/paper/HomeGuard_paper.docx
@@ -11611,13 +11611,24 @@
         <w:pStyle w:val="FirstParagraph"/>
       </w:pPr>
       <w:r>
-        <w:t xml:space="preserve">Pengujian dunia nyata dilakukan pada jaringan Wi-Fi rumah peneliti.</w:t>
-      </w:r>
-      <w:r>
-        <w:t xml:space="preserve"> </w:t>
-      </w:r>
-      <w:r>
-        <w:t xml:space="preserve">Tabel </w:t>
+        <w:t xml:space="preserve">Pengujian dunia nyata dilakukan pada jaringan Wi-Fi rumah peneliti terhadap</w:t>
+      </w:r>
+      <w:r>
+        <w:t xml:space="preserve"> </w:t>
+      </w:r>
+      <w:r>
+        <w:t xml:space="preserve">kedelapan perangkat pada Tabel </w:t>
+      </w:r>
+      <w:hyperlink w:anchor="tab:perangkat">
+        <w:r>
+          <w:rPr>
+            <w:rStyle w:val="Hyperlink"/>
+          </w:rPr>
+          <w:t xml:space="preserve">2</w:t>
+        </w:r>
+      </w:hyperlink>
+      <w:r>
+        <w:t xml:space="preserve">. Tabel </w:t>
       </w:r>
       <w:hyperlink w:anchor="tab:hasil">
         <w:r>
@@ -11631,37 +11642,31 @@
         <w:t xml:space="preserve"> </w:t>
       </w:r>
       <w:r>
-        <w:t xml:space="preserve">menyajikan format laporan hasil pemindaian yang</w:t>
-      </w:r>
-      <w:r>
-        <w:t xml:space="preserve"> </w:t>
-      </w:r>
-      <w:r>
-        <w:t xml:space="preserve">diurutkan menurut skor risiko.</w:t>
-      </w:r>
-      <w:r>
-        <w:t xml:space="preserve"> </w:t>
-      </w:r>
-      <w:r>
-        <w:rPr>
-          <w:i/>
-          <w:iCs/>
-        </w:rPr>
-        <w:t xml:space="preserve">(Catatan: isi baris pada tabel ini</w:t>
-      </w:r>
-      <w:r>
-        <w:rPr>
-          <w:i/>
-          <w:iCs/>
-        </w:rPr>
-        <w:t xml:space="preserve"> </w:t>
-      </w:r>
-      <w:r>
-        <w:rPr>
-          <w:i/>
-          <w:iCs/>
-        </w:rPr>
-        <w:t xml:space="preserve">diisi dengan data perangkat IoT aktual hasil pengujian peneliti.)</w:t>
+        <w:t xml:space="preserve">menyajikan format laporan hasil pemindaian yang diurutkan menurut skor risiko.</w:t>
+      </w:r>
+      <w:r>
+        <w:t xml:space="preserve"> </w:t>
+      </w:r>
+      <w:r>
+        <w:rPr>
+          <w:i/>
+          <w:iCs/>
+        </w:rPr>
+        <w:t xml:space="preserve">(Catatan: nilai pada tabel ini merupakan template ilustratif dan wajib</w:t>
+      </w:r>
+      <w:r>
+        <w:rPr>
+          <w:i/>
+          <w:iCs/>
+        </w:rPr>
+        <w:t xml:space="preserve"> </w:t>
+      </w:r>
+      <w:r>
+        <w:rPr>
+          <w:i/>
+          <w:iCs/>
+        </w:rPr>
+        <w:t xml:space="preserve">diganti dengan data perangkat IoT aktual hasil pengujian peneliti.)</w:t>
       </w:r>
     </w:p>
     <w:bookmarkStart w:id="54" w:name="tab:hasil"/>
@@ -11670,7 +11675,7 @@
         <w:pStyle w:val="TableCaption"/>
       </w:pPr>
       <w:r>
-        <w:t xml:space="preserve">Contoh Format Hasil Pemindaian Jaringan Rumah</w:t>
+        <w:t xml:space="preserve">Format Hasil Pemindaian Jaringan Rumah (8 Perangkat)</w:t>
       </w:r>
     </w:p>
     <w:tbl>
@@ -11678,7 +11683,7 @@
         <w:tblStyle w:val="Table"/>
         <w:tblW w:type="auto" w:w="0"/>
         <w:tblLook w:firstRow="1" w:lastRow="0" w:firstColumn="0" w:lastColumn="0" w:noHBand="0" w:noVBand="0" w:val="0020"/>
-        <w:tblCaption w:val="Contoh Format Hasil Pemindaian Jaringan Rumah"/>
+        <w:tblCaption w:val="Format Hasil Pemindaian Jaringan Rumah (8 Perangkat)"/>
       </w:tblPr>
       <w:tblGrid>
         <w:gridCol w:w="1584"/>
@@ -11703,7 +11708,7 @@
                 <w:b/>
                 <w:bCs/>
               </w:rPr>
-              <w:t xml:space="preserve">IP</w:t>
+              <w:t xml:space="preserve">Perangkat</w:t>
             </w:r>
           </w:p>
         </w:tc>
@@ -11781,73 +11786,11 @@
               <w:jc w:val="left"/>
             </w:pPr>
             <w:r>
-              <w:t xml:space="preserve">192.168.1.10</w:t>
-            </w:r>
-          </w:p>
-        </w:tc>
-        <w:tc>
-          <w:tcPr/>
-          <w:p>
-            <w:pPr>
-              <w:pStyle w:val="Compact"/>
-              <w:jc w:val="left"/>
-            </w:pPr>
-            <w:r>
               <w:rPr>
                 <w:i/>
                 <w:iCs/>
               </w:rPr>
-              <w:t xml:space="preserve">(kamera IP)</w:t>
-            </w:r>
-          </w:p>
-        </w:tc>
-        <w:tc>
-          <w:tcPr/>
-          <w:p>
-            <w:pPr>
-              <w:pStyle w:val="Compact"/>
-              <w:jc w:val="left"/>
-            </w:pPr>
-            <w:r>
-              <w:t xml:space="preserve">I1,I2,I7</w:t>
-            </w:r>
-          </w:p>
-        </w:tc>
-        <w:tc>
-          <w:tcPr/>
-          <w:p>
-            <w:pPr>
-              <w:pStyle w:val="Compact"/>
-              <w:jc w:val="center"/>
-            </w:pPr>
-            <w:r>
-              <w:t xml:space="preserve">KRITIS</w:t>
-            </w:r>
-          </w:p>
-        </w:tc>
-        <w:tc>
-          <w:tcPr/>
-          <w:p>
-            <w:pPr>
-              <w:pStyle w:val="Compact"/>
-              <w:jc w:val="center"/>
-            </w:pPr>
-            <w:r>
-              <w:t xml:space="preserve">96</w:t>
-            </w:r>
-          </w:p>
-        </w:tc>
-      </w:tr>
-      <w:tr>
-        <w:tc>
-          <w:tcPr/>
-          <w:p>
-            <w:pPr>
-              <w:pStyle w:val="Compact"/>
-              <w:jc w:val="left"/>
-            </w:pPr>
-            <w:r>
-              <w:t xml:space="preserve">192.168.1.20</w:t>
+              <w:t xml:space="preserve">Kamera IP</w:t>
             </w:r>
           </w:p>
         </w:tc>
@@ -11863,109 +11806,47 @@
                 <w:i/>
                 <w:iCs/>
               </w:rPr>
-              <w:t xml:space="preserve">(smart TV)</w:t>
-            </w:r>
-          </w:p>
-        </w:tc>
-        <w:tc>
-          <w:tcPr/>
-          <w:p>
-            <w:pPr>
-              <w:pStyle w:val="Compact"/>
-              <w:jc w:val="left"/>
-            </w:pPr>
-            <w:r>
-              <w:t xml:space="preserve">I3,I7</w:t>
-            </w:r>
-          </w:p>
-        </w:tc>
-        <w:tc>
-          <w:tcPr/>
-          <w:p>
-            <w:pPr>
-              <w:pStyle w:val="Compact"/>
-              <w:jc w:val="center"/>
-            </w:pPr>
-            <w:r>
-              <w:t xml:space="preserve">TINGGI</w:t>
-            </w:r>
-          </w:p>
-        </w:tc>
-        <w:tc>
-          <w:tcPr/>
-          <w:p>
-            <w:pPr>
-              <w:pStyle w:val="Compact"/>
-              <w:jc w:val="center"/>
-            </w:pPr>
-            <w:r>
-              <w:t xml:space="preserve">78</w:t>
-            </w:r>
-          </w:p>
-        </w:tc>
-      </w:tr>
-      <w:tr>
-        <w:tc>
-          <w:tcPr/>
-          <w:p>
-            <w:pPr>
-              <w:pStyle w:val="Compact"/>
-              <w:jc w:val="left"/>
-            </w:pPr>
-            <w:r>
-              <w:t xml:space="preserve">192.168.1.30</w:t>
-            </w:r>
-          </w:p>
-        </w:tc>
-        <w:tc>
-          <w:tcPr/>
-          <w:p>
-            <w:pPr>
-              <w:pStyle w:val="Compact"/>
-              <w:jc w:val="left"/>
+              <w:t xml:space="preserve">(isi)</w:t>
+            </w:r>
+          </w:p>
+        </w:tc>
+        <w:tc>
+          <w:tcPr/>
+          <w:p>
+            <w:pPr>
+              <w:pStyle w:val="Compact"/>
+              <w:jc w:val="left"/>
+            </w:pPr>
+            <w:r>
+              <w:t xml:space="preserve">I1,I2,I7</w:t>
+            </w:r>
+          </w:p>
+        </w:tc>
+        <w:tc>
+          <w:tcPr/>
+          <w:p>
+            <w:pPr>
+              <w:pStyle w:val="Compact"/>
+              <w:jc w:val="center"/>
+            </w:pPr>
+            <w:r>
+              <w:t xml:space="preserve">KRITIS</w:t>
+            </w:r>
+          </w:p>
+        </w:tc>
+        <w:tc>
+          <w:tcPr/>
+          <w:p>
+            <w:pPr>
+              <w:pStyle w:val="Compact"/>
+              <w:jc w:val="center"/>
             </w:pPr>
             <w:r>
               <w:rPr>
                 <w:i/>
                 <w:iCs/>
               </w:rPr>
-              <w:t xml:space="preserve">(smart plug)</w:t>
-            </w:r>
-          </w:p>
-        </w:tc>
-        <w:tc>
-          <w:tcPr/>
-          <w:p>
-            <w:pPr>
-              <w:pStyle w:val="Compact"/>
-              <w:jc w:val="left"/>
-            </w:pPr>
-            <w:r>
-              <w:t xml:space="preserve">I2</w:t>
-            </w:r>
-          </w:p>
-        </w:tc>
-        <w:tc>
-          <w:tcPr/>
-          <w:p>
-            <w:pPr>
-              <w:pStyle w:val="Compact"/>
-              <w:jc w:val="center"/>
-            </w:pPr>
-            <w:r>
-              <w:t xml:space="preserve">SEDANG</w:t>
-            </w:r>
-          </w:p>
-        </w:tc>
-        <w:tc>
-          <w:tcPr/>
-          <w:p>
-            <w:pPr>
-              <w:pStyle w:val="Compact"/>
-              <w:jc w:val="center"/>
-            </w:pPr>
-            <w:r>
-              <w:t xml:space="preserve">53</w:t>
+              <w:t xml:space="preserve">–</w:t>
             </w:r>
           </w:p>
         </w:tc>
@@ -11979,55 +11860,507 @@
               <w:jc w:val="left"/>
             </w:pPr>
             <w:r>
-              <w:t xml:space="preserve">…</w:t>
-            </w:r>
-          </w:p>
-        </w:tc>
-        <w:tc>
-          <w:tcPr/>
-          <w:p>
-            <w:pPr>
-              <w:pStyle w:val="Compact"/>
-              <w:jc w:val="left"/>
-            </w:pPr>
-            <w:r>
-              <w:t xml:space="preserve">…</w:t>
-            </w:r>
-          </w:p>
-        </w:tc>
-        <w:tc>
-          <w:tcPr/>
-          <w:p>
-            <w:pPr>
-              <w:pStyle w:val="Compact"/>
-              <w:jc w:val="left"/>
-            </w:pPr>
-            <w:r>
-              <w:t xml:space="preserve">…</w:t>
-            </w:r>
-          </w:p>
-        </w:tc>
-        <w:tc>
-          <w:tcPr/>
-          <w:p>
-            <w:pPr>
-              <w:pStyle w:val="Compact"/>
-              <w:jc w:val="center"/>
-            </w:pPr>
-            <w:r>
-              <w:t xml:space="preserve">…</w:t>
-            </w:r>
-          </w:p>
-        </w:tc>
-        <w:tc>
-          <w:tcPr/>
-          <w:p>
-            <w:pPr>
-              <w:pStyle w:val="Compact"/>
-              <w:jc w:val="center"/>
-            </w:pPr>
-            <w:r>
-              <w:t xml:space="preserve">…</w:t>
+              <w:rPr>
+                <w:i/>
+                <w:iCs/>
+              </w:rPr>
+              <w:t xml:space="preserve">Router</w:t>
+            </w:r>
+          </w:p>
+        </w:tc>
+        <w:tc>
+          <w:tcPr/>
+          <w:p>
+            <w:pPr>
+              <w:pStyle w:val="Compact"/>
+              <w:jc w:val="left"/>
+            </w:pPr>
+            <w:r>
+              <w:rPr>
+                <w:i/>
+                <w:iCs/>
+              </w:rPr>
+              <w:t xml:space="preserve">(isi)</w:t>
+            </w:r>
+          </w:p>
+        </w:tc>
+        <w:tc>
+          <w:tcPr/>
+          <w:p>
+            <w:pPr>
+              <w:pStyle w:val="Compact"/>
+              <w:jc w:val="left"/>
+            </w:pPr>
+            <w:r>
+              <w:t xml:space="preserve">I2,I3</w:t>
+            </w:r>
+          </w:p>
+        </w:tc>
+        <w:tc>
+          <w:tcPr/>
+          <w:p>
+            <w:pPr>
+              <w:pStyle w:val="Compact"/>
+              <w:jc w:val="center"/>
+            </w:pPr>
+            <w:r>
+              <w:t xml:space="preserve">TINGGI</w:t>
+            </w:r>
+          </w:p>
+        </w:tc>
+        <w:tc>
+          <w:tcPr/>
+          <w:p>
+            <w:pPr>
+              <w:pStyle w:val="Compact"/>
+              <w:jc w:val="center"/>
+            </w:pPr>
+            <w:r>
+              <w:rPr>
+                <w:i/>
+                <w:iCs/>
+              </w:rPr>
+              <w:t xml:space="preserve">–</w:t>
+            </w:r>
+          </w:p>
+        </w:tc>
+      </w:tr>
+      <w:tr>
+        <w:tc>
+          <w:tcPr/>
+          <w:p>
+            <w:pPr>
+              <w:pStyle w:val="Compact"/>
+              <w:jc w:val="left"/>
+            </w:pPr>
+            <w:r>
+              <w:rPr>
+                <w:i/>
+                <w:iCs/>
+              </w:rPr>
+              <w:t xml:space="preserve">Smart TV</w:t>
+            </w:r>
+          </w:p>
+        </w:tc>
+        <w:tc>
+          <w:tcPr/>
+          <w:p>
+            <w:pPr>
+              <w:pStyle w:val="Compact"/>
+              <w:jc w:val="left"/>
+            </w:pPr>
+            <w:r>
+              <w:rPr>
+                <w:i/>
+                <w:iCs/>
+              </w:rPr>
+              <w:t xml:space="preserve">(isi)</w:t>
+            </w:r>
+          </w:p>
+        </w:tc>
+        <w:tc>
+          <w:tcPr/>
+          <w:p>
+            <w:pPr>
+              <w:pStyle w:val="Compact"/>
+              <w:jc w:val="left"/>
+            </w:pPr>
+            <w:r>
+              <w:t xml:space="preserve">I3,I7</w:t>
+            </w:r>
+          </w:p>
+        </w:tc>
+        <w:tc>
+          <w:tcPr/>
+          <w:p>
+            <w:pPr>
+              <w:pStyle w:val="Compact"/>
+              <w:jc w:val="center"/>
+            </w:pPr>
+            <w:r>
+              <w:t xml:space="preserve">TINGGI</w:t>
+            </w:r>
+          </w:p>
+        </w:tc>
+        <w:tc>
+          <w:tcPr/>
+          <w:p>
+            <w:pPr>
+              <w:pStyle w:val="Compact"/>
+              <w:jc w:val="center"/>
+            </w:pPr>
+            <w:r>
+              <w:rPr>
+                <w:i/>
+                <w:iCs/>
+              </w:rPr>
+              <w:t xml:space="preserve">–</w:t>
+            </w:r>
+          </w:p>
+        </w:tc>
+      </w:tr>
+      <w:tr>
+        <w:tc>
+          <w:tcPr/>
+          <w:p>
+            <w:pPr>
+              <w:pStyle w:val="Compact"/>
+              <w:jc w:val="left"/>
+            </w:pPr>
+            <w:r>
+              <w:rPr>
+                <w:i/>
+                <w:iCs/>
+              </w:rPr>
+              <w:t xml:space="preserve">Printer jaringan</w:t>
+            </w:r>
+          </w:p>
+        </w:tc>
+        <w:tc>
+          <w:tcPr/>
+          <w:p>
+            <w:pPr>
+              <w:pStyle w:val="Compact"/>
+              <w:jc w:val="left"/>
+            </w:pPr>
+            <w:r>
+              <w:rPr>
+                <w:i/>
+                <w:iCs/>
+              </w:rPr>
+              <w:t xml:space="preserve">(isi)</w:t>
+            </w:r>
+          </w:p>
+        </w:tc>
+        <w:tc>
+          <w:tcPr/>
+          <w:p>
+            <w:pPr>
+              <w:pStyle w:val="Compact"/>
+              <w:jc w:val="left"/>
+            </w:pPr>
+            <w:r>
+              <w:t xml:space="preserve">I2</w:t>
+            </w:r>
+          </w:p>
+        </w:tc>
+        <w:tc>
+          <w:tcPr/>
+          <w:p>
+            <w:pPr>
+              <w:pStyle w:val="Compact"/>
+              <w:jc w:val="center"/>
+            </w:pPr>
+            <w:r>
+              <w:t xml:space="preserve">SEDANG</w:t>
+            </w:r>
+          </w:p>
+        </w:tc>
+        <w:tc>
+          <w:tcPr/>
+          <w:p>
+            <w:pPr>
+              <w:pStyle w:val="Compact"/>
+              <w:jc w:val="center"/>
+            </w:pPr>
+            <w:r>
+              <w:rPr>
+                <w:i/>
+                <w:iCs/>
+              </w:rPr>
+              <w:t xml:space="preserve">–</w:t>
+            </w:r>
+          </w:p>
+        </w:tc>
+      </w:tr>
+      <w:tr>
+        <w:tc>
+          <w:tcPr/>
+          <w:p>
+            <w:pPr>
+              <w:pStyle w:val="Compact"/>
+              <w:jc w:val="left"/>
+            </w:pPr>
+            <w:r>
+              <w:rPr>
+                <w:i/>
+                <w:iCs/>
+              </w:rPr>
+              <w:t xml:space="preserve">Smart plug</w:t>
+            </w:r>
+          </w:p>
+        </w:tc>
+        <w:tc>
+          <w:tcPr/>
+          <w:p>
+            <w:pPr>
+              <w:pStyle w:val="Compact"/>
+              <w:jc w:val="left"/>
+            </w:pPr>
+            <w:r>
+              <w:rPr>
+                <w:i/>
+                <w:iCs/>
+              </w:rPr>
+              <w:t xml:space="preserve">(isi)</w:t>
+            </w:r>
+          </w:p>
+        </w:tc>
+        <w:tc>
+          <w:tcPr/>
+          <w:p>
+            <w:pPr>
+              <w:pStyle w:val="Compact"/>
+              <w:jc w:val="left"/>
+            </w:pPr>
+            <w:r>
+              <w:t xml:space="preserve">I2</w:t>
+            </w:r>
+          </w:p>
+        </w:tc>
+        <w:tc>
+          <w:tcPr/>
+          <w:p>
+            <w:pPr>
+              <w:pStyle w:val="Compact"/>
+              <w:jc w:val="center"/>
+            </w:pPr>
+            <w:r>
+              <w:t xml:space="preserve">SEDANG</w:t>
+            </w:r>
+          </w:p>
+        </w:tc>
+        <w:tc>
+          <w:tcPr/>
+          <w:p>
+            <w:pPr>
+              <w:pStyle w:val="Compact"/>
+              <w:jc w:val="center"/>
+            </w:pPr>
+            <w:r>
+              <w:rPr>
+                <w:i/>
+                <w:iCs/>
+              </w:rPr>
+              <w:t xml:space="preserve">–</w:t>
+            </w:r>
+          </w:p>
+        </w:tc>
+      </w:tr>
+      <w:tr>
+        <w:tc>
+          <w:tcPr/>
+          <w:p>
+            <w:pPr>
+              <w:pStyle w:val="Compact"/>
+              <w:jc w:val="left"/>
+            </w:pPr>
+            <w:r>
+              <w:rPr>
+                <w:i/>
+                <w:iCs/>
+              </w:rPr>
+              <w:t xml:space="preserve">Smart speaker</w:t>
+            </w:r>
+          </w:p>
+        </w:tc>
+        <w:tc>
+          <w:tcPr/>
+          <w:p>
+            <w:pPr>
+              <w:pStyle w:val="Compact"/>
+              <w:jc w:val="left"/>
+            </w:pPr>
+            <w:r>
+              <w:rPr>
+                <w:i/>
+                <w:iCs/>
+              </w:rPr>
+              <w:t xml:space="preserve">(isi)</w:t>
+            </w:r>
+          </w:p>
+        </w:tc>
+        <w:tc>
+          <w:tcPr/>
+          <w:p>
+            <w:pPr>
+              <w:pStyle w:val="Compact"/>
+              <w:jc w:val="left"/>
+            </w:pPr>
+            <w:r>
+              <w:t xml:space="preserve">I2</w:t>
+            </w:r>
+          </w:p>
+        </w:tc>
+        <w:tc>
+          <w:tcPr/>
+          <w:p>
+            <w:pPr>
+              <w:pStyle w:val="Compact"/>
+              <w:jc w:val="center"/>
+            </w:pPr>
+            <w:r>
+              <w:t xml:space="preserve">SEDANG</w:t>
+            </w:r>
+          </w:p>
+        </w:tc>
+        <w:tc>
+          <w:tcPr/>
+          <w:p>
+            <w:pPr>
+              <w:pStyle w:val="Compact"/>
+              <w:jc w:val="center"/>
+            </w:pPr>
+            <w:r>
+              <w:rPr>
+                <w:i/>
+                <w:iCs/>
+              </w:rPr>
+              <w:t xml:space="preserve">–</w:t>
+            </w:r>
+          </w:p>
+        </w:tc>
+      </w:tr>
+      <w:tr>
+        <w:tc>
+          <w:tcPr/>
+          <w:p>
+            <w:pPr>
+              <w:pStyle w:val="Compact"/>
+              <w:jc w:val="left"/>
+            </w:pPr>
+            <w:r>
+              <w:rPr>
+                <w:i/>
+                <w:iCs/>
+              </w:rPr>
+              <w:t xml:space="preserve">Single-board comp.</w:t>
+            </w:r>
+          </w:p>
+        </w:tc>
+        <w:tc>
+          <w:tcPr/>
+          <w:p>
+            <w:pPr>
+              <w:pStyle w:val="Compact"/>
+              <w:jc w:val="left"/>
+            </w:pPr>
+            <w:r>
+              <w:rPr>
+                <w:i/>
+                <w:iCs/>
+              </w:rPr>
+              <w:t xml:space="preserve">(isi)</w:t>
+            </w:r>
+          </w:p>
+        </w:tc>
+        <w:tc>
+          <w:tcPr/>
+          <w:p>
+            <w:pPr>
+              <w:pStyle w:val="Compact"/>
+              <w:jc w:val="left"/>
+            </w:pPr>
+            <w:r>
+              <w:t xml:space="preserve">I2</w:t>
+            </w:r>
+          </w:p>
+        </w:tc>
+        <w:tc>
+          <w:tcPr/>
+          <w:p>
+            <w:pPr>
+              <w:pStyle w:val="Compact"/>
+              <w:jc w:val="center"/>
+            </w:pPr>
+            <w:r>
+              <w:t xml:space="preserve">RENDAH</w:t>
+            </w:r>
+          </w:p>
+        </w:tc>
+        <w:tc>
+          <w:tcPr/>
+          <w:p>
+            <w:pPr>
+              <w:pStyle w:val="Compact"/>
+              <w:jc w:val="center"/>
+            </w:pPr>
+            <w:r>
+              <w:rPr>
+                <w:i/>
+                <w:iCs/>
+              </w:rPr>
+              <w:t xml:space="preserve">–</w:t>
+            </w:r>
+          </w:p>
+        </w:tc>
+      </w:tr>
+      <w:tr>
+        <w:tc>
+          <w:tcPr/>
+          <w:p>
+            <w:pPr>
+              <w:pStyle w:val="Compact"/>
+              <w:jc w:val="left"/>
+            </w:pPr>
+            <w:r>
+              <w:rPr>
+                <w:i/>
+                <w:iCs/>
+              </w:rPr>
+              <w:t xml:space="preserve">Laptop pengguna</w:t>
+            </w:r>
+          </w:p>
+        </w:tc>
+        <w:tc>
+          <w:tcPr/>
+          <w:p>
+            <w:pPr>
+              <w:pStyle w:val="Compact"/>
+              <w:jc w:val="left"/>
+            </w:pPr>
+            <w:r>
+              <w:rPr>
+                <w:i/>
+                <w:iCs/>
+              </w:rPr>
+              <w:t xml:space="preserve">(isi)</w:t>
+            </w:r>
+          </w:p>
+        </w:tc>
+        <w:tc>
+          <w:tcPr/>
+          <w:p>
+            <w:pPr>
+              <w:pStyle w:val="Compact"/>
+              <w:jc w:val="left"/>
+            </w:pPr>
+            <w:r>
+              <w:t xml:space="preserve">—</w:t>
+            </w:r>
+          </w:p>
+        </w:tc>
+        <w:tc>
+          <w:tcPr/>
+          <w:p>
+            <w:pPr>
+              <w:pStyle w:val="Compact"/>
+              <w:jc w:val="center"/>
+            </w:pPr>
+            <w:r>
+              <w:t xml:space="preserve">AMAN</w:t>
+            </w:r>
+          </w:p>
+        </w:tc>
+        <w:tc>
+          <w:tcPr/>
+          <w:p>
+            <w:pPr>
+              <w:pStyle w:val="Compact"/>
+              <w:jc w:val="center"/>
+            </w:pPr>
+            <w:r>
+              <w:t xml:space="preserve">0</w:t>
             </w:r>
           </w:p>
         </w:tc>

</xml_diff>

<commit_message>
Paper: tambah tautan GitHub & mutakhirkan hasil pengujian (36/36)
- Tautan repositori https://github.com/gerrard046/HomeGuard kini tercantum
  di abstrak, kesimpulan, dan daftar pustaka ([b23]) pada kedua versi
  paper (main.tex modular & homeguard_overleaf.tex satu-berkas).
- Bagian Pengujian Unit diperbarui dari 12 menjadi 36 kasus uji pada
  enam modul (vulnmap, discovery, classify, portscan, scanner, tlscheck).
- HomeGuard_paper.docx di-regenerate dari sumber LaTeX terbaru.
- Catatan revisi diperbarui.

Co-Authored-By: Claude Fable 5 <noreply@anthropic.com>
Claude-Session: https://claude.ai/code/session_01BWwZeKsfQ3MY1AjKATXUZi
</commit_message>
<xml_diff>
--- a/paper/HomeGuard_paper.docx
+++ b/paper/HomeGuard_paper.docx
@@ -136,7 +136,27 @@
         <w:t xml:space="preserve"> </w:t>
       </w:r>
       <w:r>
-        <w:t xml:space="preserve">keamanan siber di tingkat rumah tangga.</w:t>
+        <w:t xml:space="preserve">keamanan siber di tingkat rumah tangga. Seluruh kode sumber aplikasi tersedia</w:t>
+      </w:r>
+      <w:r>
+        <w:t xml:space="preserve"> </w:t>
+      </w:r>
+      <w:r>
+        <w:t xml:space="preserve">secara terbuka di</w:t>
+      </w:r>
+      <w:r>
+        <w:t xml:space="preserve"> </w:t>
+      </w:r>
+      <w:hyperlink r:id="rId9">
+        <w:r>
+          <w:rPr>
+            <w:rStyle w:val="Hyperlink"/>
+          </w:rPr>
+          <w:t xml:space="preserve">https://github.com/gerrard046/HomeGuard</w:t>
+        </w:r>
+      </w:hyperlink>
+      <w:r>
+        <w:t xml:space="preserve">.</w:t>
       </w:r>
     </w:p>
     <w:sdt>
@@ -179,7 +199,7 @@
         <w:t xml:space="preserve">OWASP IoT Top 10, Jaringan Wi-Fi Domestik</w:t>
       </w:r>
     </w:p>
-    <w:bookmarkStart w:id="14" w:name="pendahuluan"/>
+    <w:bookmarkStart w:id="15" w:name="pendahuluan"/>
     <w:p>
       <w:pPr>
         <w:pStyle w:val="Heading1"/>
@@ -188,7 +208,7 @@
         <w:t xml:space="preserve">Pendahuluan</w:t>
       </w:r>
     </w:p>
-    <w:bookmarkStart w:id="9" w:name="latar-belakang"/>
+    <w:bookmarkStart w:id="10" w:name="latar-belakang"/>
     <w:p>
       <w:pPr>
         <w:pStyle w:val="Heading2"/>
@@ -737,8 +757,8 @@
         <w:t xml:space="preserve">kerentanan.</w:t>
       </w:r>
     </w:p>
-    <w:bookmarkEnd w:id="9"/>
-    <w:bookmarkStart w:id="10" w:name="rumusan-masalah"/>
+    <w:bookmarkEnd w:id="10"/>
+    <w:bookmarkStart w:id="11" w:name="rumusan-masalah"/>
     <w:p>
       <w:pPr>
         <w:pStyle w:val="Heading2"/>
@@ -810,8 +830,8 @@
         <w:t xml:space="preserve">kerentanan keamanan pada perangkat IoT di lingkungan jaringan rumah?</w:t>
       </w:r>
     </w:p>
-    <w:bookmarkEnd w:id="10"/>
-    <w:bookmarkStart w:id="11" w:name="tujuan-penelitian"/>
+    <w:bookmarkEnd w:id="11"/>
+    <w:bookmarkStart w:id="12" w:name="tujuan-penelitian"/>
     <w:p>
       <w:pPr>
         <w:pStyle w:val="Heading2"/>
@@ -889,8 +909,8 @@
         <w:t xml:space="preserve">lingkungan jaringan rumah yang sebenarnya (real-world testing).</w:t>
       </w:r>
     </w:p>
-    <w:bookmarkEnd w:id="11"/>
-    <w:bookmarkStart w:id="12" w:name="manfaat-penelitian"/>
+    <w:bookmarkEnd w:id="12"/>
+    <w:bookmarkStart w:id="13" w:name="manfaat-penelitian"/>
     <w:p>
       <w:pPr>
         <w:pStyle w:val="Heading2"/>
@@ -977,8 +997,8 @@
         <w:t xml:space="preserve">Top 10.</w:t>
       </w:r>
     </w:p>
-    <w:bookmarkEnd w:id="12"/>
-    <w:bookmarkStart w:id="13" w:name="batasan-masalah"/>
+    <w:bookmarkEnd w:id="13"/>
+    <w:bookmarkStart w:id="14" w:name="batasan-masalah"/>
     <w:p>
       <w:pPr>
         <w:pStyle w:val="Heading2"/>
@@ -1087,9 +1107,9 @@
         <w:t xml:space="preserve">Streamlit.</w:t>
       </w:r>
     </w:p>
-    <w:bookmarkEnd w:id="13"/>
     <w:bookmarkEnd w:id="14"/>
-    <w:bookmarkStart w:id="32" w:name="tinjauan-pustaka"/>
+    <w:bookmarkEnd w:id="15"/>
+    <w:bookmarkStart w:id="33" w:name="tinjauan-pustaka"/>
     <w:p>
       <w:pPr>
         <w:pStyle w:val="Heading1"/>
@@ -1098,7 +1118,7 @@
         <w:t xml:space="preserve">Tinjauan Pustaka</w:t>
       </w:r>
     </w:p>
-    <w:bookmarkStart w:id="15" w:name="Xce97fb2f3a7f4fb80972492a8d7c0e261ccbf49"/>
+    <w:bookmarkStart w:id="16" w:name="Xce97fb2f3a7f4fb80972492a8d7c0e261ccbf49"/>
     <w:p>
       <w:pPr>
         <w:pStyle w:val="Heading2"/>
@@ -1257,8 +1277,8 @@
         <w:t xml:space="preserve">yang tidak seragam — menciptakan permukaan serangan yang luas dan kompleks.</w:t>
       </w:r>
     </w:p>
-    <w:bookmarkEnd w:id="15"/>
-    <w:bookmarkStart w:id="20" w:name="Xbf3f99df2973280521bfa3c6dec70d42d351abc"/>
+    <w:bookmarkEnd w:id="16"/>
+    <w:bookmarkStart w:id="21" w:name="Xbf3f99df2973280521bfa3c6dec70d42d351abc"/>
     <w:p>
       <w:pPr>
         <w:pStyle w:val="Heading2"/>
@@ -1267,7 +1287,7 @@
         <w:t xml:space="preserve">Ancaman dan Kerentanan Keamanan pada Perangkat IoT</w:t>
       </w:r>
     </w:p>
-    <w:bookmarkStart w:id="16" w:name="taksonomi-ancaman-keamanan-iot"/>
+    <w:bookmarkStart w:id="17" w:name="taksonomi-ancaman-keamanan-iot"/>
     <w:p>
       <w:pPr>
         <w:pStyle w:val="Heading3"/>
@@ -1461,8 +1481,8 @@
         <w:t xml:space="preserve">domestik.</w:t>
       </w:r>
     </w:p>
-    <w:bookmarkEnd w:id="16"/>
-    <w:bookmarkStart w:id="17" w:name="kerangka-acuan-owasp-iot-top-10"/>
+    <w:bookmarkEnd w:id="17"/>
+    <w:bookmarkStart w:id="18" w:name="kerangka-acuan-owasp-iot-top-10"/>
     <w:p>
       <w:pPr>
         <w:pStyle w:val="Heading3"/>
@@ -1781,8 +1801,8 @@
         <w:t xml:space="preserve">risiko yang terstandarisasi.</w:t>
       </w:r>
     </w:p>
-    <w:bookmarkEnd w:id="17"/>
-    <w:bookmarkStart w:id="18" w:name="studi-kasus-mirai-botnet"/>
+    <w:bookmarkEnd w:id="18"/>
+    <w:bookmarkStart w:id="19" w:name="studi-kasus-mirai-botnet"/>
     <w:p>
       <w:pPr>
         <w:pStyle w:val="Heading3"/>
@@ -1904,8 +1924,8 @@
         <w:t xml:space="preserve">BASHLITE dengan akurasi di atas 99%.</w:t>
       </w:r>
     </w:p>
-    <w:bookmarkEnd w:id="18"/>
-    <w:bookmarkStart w:id="19" w:name="kerentanan-protokol-wi-fi"/>
+    <w:bookmarkEnd w:id="19"/>
+    <w:bookmarkStart w:id="20" w:name="kerentanan-protokol-wi-fi"/>
     <w:p>
       <w:pPr>
         <w:pStyle w:val="Heading3"/>
@@ -1964,9 +1984,9 @@
         <w:t xml:space="preserve">terhadap serangan side-channel dan downgrade.</w:t>
       </w:r>
     </w:p>
-    <w:bookmarkEnd w:id="19"/>
     <w:bookmarkEnd w:id="20"/>
-    <w:bookmarkStart w:id="24" w:name="X4483c5f75c60084541aa264a9ba9c1e68d2103f"/>
+    <w:bookmarkEnd w:id="21"/>
+    <w:bookmarkStart w:id="25" w:name="X4483c5f75c60084541aa264a9ba9c1e68d2103f"/>
     <w:p>
       <w:pPr>
         <w:pStyle w:val="Heading2"/>
@@ -1975,7 +1995,7 @@
         <w:t xml:space="preserve">Teknik Pemindaian dan Deteksi Kerentanan Jaringan</w:t>
       </w:r>
     </w:p>
-    <w:bookmarkStart w:id="21" w:name="prinsip-network-scanning"/>
+    <w:bookmarkStart w:id="22" w:name="prinsip-network-scanning"/>
     <w:p>
       <w:pPr>
         <w:pStyle w:val="Heading3"/>
@@ -2118,8 +2138,8 @@
         <w:t xml:space="preserve">secara opsional untuk memperkaya hasil pemindaian.</w:t>
       </w:r>
     </w:p>
-    <w:bookmarkEnd w:id="21"/>
-    <w:bookmarkStart w:id="22" w:name="device-fingerprinting-pada-perangkat-iot"/>
+    <w:bookmarkEnd w:id="22"/>
+    <w:bookmarkStart w:id="23" w:name="device-fingerprinting-pada-perangkat-iot"/>
     <w:p>
       <w:pPr>
         <w:pStyle w:val="Heading3"/>
@@ -2191,8 +2211,8 @@
         <w:t xml:space="preserve">pada port 554 mengindikasikan kamera IP, UPnP mengindikasikan smart device).</w:t>
       </w:r>
     </w:p>
-    <w:bookmarkEnd w:id="22"/>
-    <w:bookmarkStart w:id="23" w:name="metodologi-vulnerability-assessment"/>
+    <w:bookmarkEnd w:id="23"/>
+    <w:bookmarkStart w:id="24" w:name="metodologi-vulnerability-assessment"/>
     <w:p>
       <w:pPr>
         <w:pStyle w:val="Heading3"/>
@@ -2269,9 +2289,9 @@
         <w:t xml:space="preserve">ini.</w:t>
       </w:r>
     </w:p>
-    <w:bookmarkEnd w:id="23"/>
     <w:bookmarkEnd w:id="24"/>
-    <w:bookmarkStart w:id="28" w:name="kerangka-kerja-keamanan-iot"/>
+    <w:bookmarkEnd w:id="25"/>
+    <w:bookmarkStart w:id="29" w:name="kerangka-kerja-keamanan-iot"/>
     <w:p>
       <w:pPr>
         <w:pStyle w:val="Heading2"/>
@@ -2280,7 +2300,7 @@
         <w:t xml:space="preserve">Kerangka Kerja Keamanan IoT</w:t>
       </w:r>
     </w:p>
-    <w:bookmarkStart w:id="25" w:name="Xa5bedaa03ad423c3843041ff6bc975b88c15175"/>
+    <w:bookmarkStart w:id="26" w:name="Xa5bedaa03ad423c3843041ff6bc975b88c15175"/>
     <w:p>
       <w:pPr>
         <w:pStyle w:val="Heading3"/>
@@ -2333,8 +2353,8 @@
         <w:t xml:space="preserve">Top 10).</w:t>
       </w:r>
     </w:p>
-    <w:bookmarkEnd w:id="25"/>
-    <w:bookmarkStart w:id="26" w:name="defense-in-depth-untuk-jaringan-rumah"/>
+    <w:bookmarkEnd w:id="26"/>
+    <w:bookmarkStart w:id="27" w:name="defense-in-depth-untuk-jaringan-rumah"/>
     <w:p>
       <w:pPr>
         <w:pStyle w:val="Heading3"/>
@@ -2406,8 +2426,8 @@
         <w:t xml:space="preserve">keamanan jaringan dan perangkat IoT yang terhubung.</w:t>
       </w:r>
     </w:p>
-    <w:bookmarkEnd w:id="26"/>
-    <w:bookmarkStart w:id="27" w:name="arsitektur-zero-trust-untuk-iot"/>
+    <w:bookmarkEnd w:id="27"/>
+    <w:bookmarkStart w:id="28" w:name="arsitektur-zero-trust-untuk-iot"/>
     <w:p>
       <w:pPr>
         <w:pStyle w:val="Heading3"/>
@@ -2476,9 +2496,9 @@
         <w:t xml:space="preserve">yang difasilitasi oleh tools pemindai — menjadi prasyarat fundamental.</w:t>
       </w:r>
     </w:p>
-    <w:bookmarkEnd w:id="27"/>
     <w:bookmarkEnd w:id="28"/>
-    <w:bookmarkStart w:id="29" w:name="penelitian-terdahulu-yang-relevan"/>
+    <w:bookmarkEnd w:id="29"/>
+    <w:bookmarkStart w:id="30" w:name="penelitian-terdahulu-yang-relevan"/>
     <w:p>
       <w:pPr>
         <w:pStyle w:val="Heading2"/>
@@ -3426,8 +3446,8 @@
         </w:tc>
       </w:tr>
     </w:tbl>
-    <w:bookmarkEnd w:id="29"/>
-    <w:bookmarkStart w:id="31" w:name="X1ac2f6b1c95e582113a998e699b4094144c3f8c"/>
+    <w:bookmarkEnd w:id="30"/>
+    <w:bookmarkStart w:id="32" w:name="X1ac2f6b1c95e582113a998e699b4094144c3f8c"/>
     <w:p>
       <w:pPr>
         <w:pStyle w:val="Heading2"/>
@@ -4029,7 +4049,7 @@
         <w:t xml:space="preserve">berdasarkan kriteria yang relevan bagi pengguna rumahan.</w:t>
       </w:r>
     </w:p>
-    <w:bookmarkStart w:id="30" w:name="tab:diferensiasi"/>
+    <w:bookmarkStart w:id="31" w:name="tab:diferensiasi"/>
     <w:p>
       <w:pPr>
         <w:pStyle w:val="TableCaption"/>
@@ -4698,7 +4718,7 @@
         </w:tc>
       </w:tr>
     </w:tbl>
-    <w:bookmarkEnd w:id="30"/>
+    <w:bookmarkEnd w:id="31"/>
     <w:p>
       <w:pPr>
         <w:pStyle w:val="BodyText"/>
@@ -4750,9 +4770,9 @@
         <w:t xml:space="preserve">HomeGuard.</w:t>
       </w:r>
     </w:p>
-    <w:bookmarkEnd w:id="31"/>
     <w:bookmarkEnd w:id="32"/>
-    <w:bookmarkStart w:id="37" w:name="metodologi-penelitian"/>
+    <w:bookmarkEnd w:id="33"/>
+    <w:bookmarkStart w:id="38" w:name="metodologi-penelitian"/>
     <w:p>
       <w:pPr>
         <w:pStyle w:val="Heading1"/>
@@ -4761,7 +4781,7 @@
         <w:t xml:space="preserve">Metodologi Penelitian</w:t>
       </w:r>
     </w:p>
-    <w:bookmarkStart w:id="33" w:name="pendekatan-penelitian"/>
+    <w:bookmarkStart w:id="34" w:name="pendekatan-penelitian"/>
     <w:p>
       <w:pPr>
         <w:pStyle w:val="Heading2"/>
@@ -4853,8 +4873,8 @@
         <w:t xml:space="preserve">diintegrasikan ke dalam sistem utuh.</w:t>
       </w:r>
     </w:p>
-    <w:bookmarkEnd w:id="33"/>
-    <w:bookmarkStart w:id="34" w:name="tahapan-penelitian"/>
+    <w:bookmarkEnd w:id="34"/>
+    <w:bookmarkStart w:id="35" w:name="tahapan-penelitian"/>
     <w:p>
       <w:pPr>
         <w:pStyle w:val="Heading2"/>
@@ -5190,8 +5210,8 @@
         <w:t xml:space="preserve">.</w:t>
       </w:r>
     </w:p>
-    <w:bookmarkEnd w:id="34"/>
-    <w:bookmarkStart w:id="35" w:name="alat-dan-bahan"/>
+    <w:bookmarkEnd w:id="35"/>
+    <w:bookmarkStart w:id="36" w:name="alat-dan-bahan"/>
     <w:p>
       <w:pPr>
         <w:pStyle w:val="Heading2"/>
@@ -5330,8 +5350,8 @@
         <w:t xml:space="preserve">).</w:t>
       </w:r>
     </w:p>
-    <w:bookmarkEnd w:id="35"/>
-    <w:bookmarkStart w:id="36" w:name="prinsip-etika-penelitian"/>
+    <w:bookmarkEnd w:id="36"/>
+    <w:bookmarkStart w:id="37" w:name="prinsip-etika-penelitian"/>
     <w:p>
       <w:pPr>
         <w:pStyle w:val="Heading2"/>
@@ -5388,9 +5408,9 @@
         <w:t xml:space="preserve">pada antarmuka pengguna, dokumentasi, dan setiap laporan keluaran.</w:t>
       </w:r>
     </w:p>
-    <w:bookmarkEnd w:id="36"/>
     <w:bookmarkEnd w:id="37"/>
-    <w:bookmarkStart w:id="50" w:name="perancangan-dan-implementasi"/>
+    <w:bookmarkEnd w:id="38"/>
+    <w:bookmarkStart w:id="51" w:name="perancangan-dan-implementasi"/>
     <w:p>
       <w:pPr>
         <w:pStyle w:val="Heading1"/>
@@ -5399,7 +5419,7 @@
         <w:t xml:space="preserve">Perancangan dan Implementasi</w:t>
       </w:r>
     </w:p>
-    <w:bookmarkStart w:id="43" w:name="arsitektur-sistem"/>
+    <w:bookmarkStart w:id="44" w:name="arsitektur-sistem"/>
     <w:p>
       <w:pPr>
         <w:pStyle w:val="Heading2"/>
@@ -5455,7 +5475,7 @@
         <w:t xml:space="preserve">.</w:t>
       </w:r>
     </w:p>
-    <w:bookmarkStart w:id="41" w:name="fig:pipeline"/>
+    <w:bookmarkStart w:id="42" w:name="fig:pipeline"/>
     <w:p>
       <w:pPr>
         <w:pStyle w:val="CaptionedFigure"/>
@@ -5465,18 +5485,18 @@
           <wp:inline>
             <wp:extent cx="5334000" cy="1778898"/>
             <wp:effectExtent b="0" l="0" r="0" t="0"/>
-            <wp:docPr descr="" title="" id="39" name="Picture"/>
+            <wp:docPr descr="" title="" id="40" name="Picture"/>
             <a:graphic>
               <a:graphicData uri="http://schemas.openxmlformats.org/drawingml/2006/picture">
                 <pic:pic>
                   <pic:nvPicPr>
-                    <pic:cNvPr descr="diagram_pipeline.png" id="40" name="Picture"/>
+                    <pic:cNvPr descr="diagram_pipeline.png" id="41" name="Picture"/>
                     <pic:cNvPicPr>
                       <a:picLocks noChangeArrowheads="1" noChangeAspect="1"/>
                     </pic:cNvPicPr>
                   </pic:nvPicPr>
                   <pic:blipFill>
-                    <a:blip r:embed="rId38"/>
+                    <a:blip r:embed="rId39"/>
                     <a:stretch>
                       <a:fillRect/>
                     </a:stretch>
@@ -5527,7 +5547,7 @@
         <w:t xml:space="preserve">empat modul HomeGuard.</w:t>
       </w:r>
     </w:p>
-    <w:bookmarkEnd w:id="41"/>
+    <w:bookmarkEnd w:id="42"/>
     <w:p>
       <w:pPr>
         <w:pStyle w:val="BodyText"/>
@@ -5553,7 +5573,7 @@
         <w:t xml:space="preserve">.</w:t>
       </w:r>
     </w:p>
-    <w:bookmarkStart w:id="42" w:name="tab:modul"/>
+    <w:bookmarkStart w:id="43" w:name="tab:modul"/>
     <w:p>
       <w:pPr>
         <w:pStyle w:val="TableCaption"/>
@@ -5983,9 +6003,9 @@
         </w:tc>
       </w:tr>
     </w:tbl>
-    <w:bookmarkEnd w:id="42"/>
     <w:bookmarkEnd w:id="43"/>
-    <w:bookmarkStart w:id="44" w:name="modul-1-network-discovery"/>
+    <w:bookmarkEnd w:id="44"/>
+    <w:bookmarkStart w:id="45" w:name="modul-1-network-discovery"/>
     <w:p>
       <w:pPr>
         <w:pStyle w:val="Heading2"/>
@@ -6262,8 +6282,8 @@
         <w:t xml:space="preserve">notasi titik gaya Cisco).</w:t>
       </w:r>
     </w:p>
-    <w:bookmarkEnd w:id="44"/>
-    <w:bookmarkStart w:id="45" w:name="X435da6523009448b558dfb1e839014c7ba5fd24"/>
+    <w:bookmarkEnd w:id="45"/>
+    <w:bookmarkStart w:id="46" w:name="X435da6523009448b558dfb1e839014c7ba5fd24"/>
     <w:p>
       <w:pPr>
         <w:pStyle w:val="Heading2"/>
@@ -6546,8 +6566,8 @@
         <w:t xml:space="preserve">dengan prinsip portabilitas.</w:t>
       </w:r>
     </w:p>
-    <w:bookmarkEnd w:id="45"/>
-    <w:bookmarkStart w:id="48" w:name="X43c26ea41531a18919d2fc2b74fd3b5837d9ed3"/>
+    <w:bookmarkEnd w:id="46"/>
+    <w:bookmarkStart w:id="49" w:name="X43c26ea41531a18919d2fc2b74fd3b5837d9ed3"/>
     <w:p>
       <w:pPr>
         <w:pStyle w:val="Heading2"/>
@@ -6621,7 +6641,7 @@
         <w:t xml:space="preserve">penekanan khusus pada layanan Telnet yang dieksploitasi botnet Mirai.</w:t>
       </w:r>
     </w:p>
-    <w:bookmarkStart w:id="46" w:name="tab:katalog"/>
+    <w:bookmarkStart w:id="47" w:name="tab:katalog"/>
     <w:p>
       <w:pPr>
         <w:pStyle w:val="TableCaption"/>
@@ -7167,7 +7187,7 @@
         </w:tc>
       </w:tr>
     </w:tbl>
-    <w:bookmarkEnd w:id="46"/>
+    <w:bookmarkEnd w:id="47"/>
     <w:p>
       <w:pPr>
         <w:pStyle w:val="BodyText"/>
@@ -7672,7 +7692,7 @@
         <w:t xml:space="preserve">terbuka dinilai AMAN dengan skor 0.</w:t>
       </w:r>
     </w:p>
-    <w:bookmarkStart w:id="47" w:name="tab:severity"/>
+    <w:bookmarkStart w:id="48" w:name="tab:severity"/>
     <w:p>
       <w:pPr>
         <w:pStyle w:val="TableCaption"/>
@@ -7872,9 +7892,9 @@
         </w:tc>
       </w:tr>
     </w:tbl>
-    <w:bookmarkEnd w:id="47"/>
     <w:bookmarkEnd w:id="48"/>
-    <w:bookmarkStart w:id="49" w:name="antarmuka-pengguna"/>
+    <w:bookmarkEnd w:id="49"/>
+    <w:bookmarkStart w:id="50" w:name="antarmuka-pengguna"/>
     <w:p>
       <w:pPr>
         <w:pStyle w:val="Heading2"/>
@@ -8028,9 +8048,9 @@
         <w:t xml:space="preserve">referensi OWASP IoT Top 10.</w:t>
       </w:r>
     </w:p>
-    <w:bookmarkEnd w:id="49"/>
     <w:bookmarkEnd w:id="50"/>
-    <w:bookmarkStart w:id="57" w:name="pengujian-dan-hasil"/>
+    <w:bookmarkEnd w:id="51"/>
+    <w:bookmarkStart w:id="58" w:name="pengujian-dan-hasil"/>
     <w:p>
       <w:pPr>
         <w:pStyle w:val="Heading1"/>
@@ -8039,7 +8059,7 @@
         <w:t xml:space="preserve">Pengujian dan Hasil</w:t>
       </w:r>
     </w:p>
-    <w:bookmarkStart w:id="52" w:name="pengujian-unit"/>
+    <w:bookmarkStart w:id="53" w:name="pengujian-unit"/>
     <w:p>
       <w:pPr>
         <w:pStyle w:val="Heading2"/>
@@ -8068,13 +8088,13 @@
         <w:t xml:space="preserve"> </w:t>
       </w:r>
       <w:r>
-        <w:t xml:space="preserve">terhadap dua modul</w:t>
-      </w:r>
-      <w:r>
-        <w:t xml:space="preserve"> </w:t>
-      </w:r>
-      <w:r>
-        <w:t xml:space="preserve">inti, yaitu modul pemetaan kerentanan (</w:t>
+        <w:t xml:space="preserve">terhadap enam</w:t>
+      </w:r>
+      <w:r>
+        <w:t xml:space="preserve"> </w:t>
+      </w:r>
+      <w:r>
+        <w:t xml:space="preserve">modul inti, yaitu pemetaan kerentanan (</w:t>
       </w:r>
       <w:r>
         <w:rPr>
@@ -8083,13 +8103,13 @@
         <w:t xml:space="preserve">vulnmap</w:t>
       </w:r>
       <w:r>
-        <w:t xml:space="preserve">) dan modul</w:t>
-      </w:r>
-      <w:r>
-        <w:t xml:space="preserve"> </w:t>
-      </w:r>
-      <w:r>
-        <w:t xml:space="preserve">penemuan host (</w:t>
+        <w:t xml:space="preserve">), penemuan host</w:t>
+      </w:r>
+      <w:r>
+        <w:t xml:space="preserve"> </w:t>
+      </w:r>
+      <w:r>
+        <w:t xml:space="preserve">(</w:t>
       </w:r>
       <w:r>
         <w:rPr>
@@ -8098,13 +8118,61 @@
         <w:t xml:space="preserve">discovery</w:t>
       </w:r>
       <w:r>
-        <w:t xml:space="preserve">), dengan total 12 kasus uji. Seluruh</w:t>
-      </w:r>
-      <w:r>
-        <w:t xml:space="preserve"> </w:t>
-      </w:r>
-      <w:r>
-        <w:t xml:space="preserve">kasus uji</w:t>
+        <w:t xml:space="preserve">), klasifikasi perangkat (</w:t>
+      </w:r>
+      <w:r>
+        <w:rPr>
+          <w:rStyle w:val="VerbatimChar"/>
+        </w:rPr>
+        <w:t xml:space="preserve">classify</w:t>
+      </w:r>
+      <w:r>
+        <w:t xml:space="preserve">),</w:t>
+      </w:r>
+      <w:r>
+        <w:t xml:space="preserve"> </w:t>
+      </w:r>
+      <w:r>
+        <w:t xml:space="preserve">pemindaian port (</w:t>
+      </w:r>
+      <w:r>
+        <w:rPr>
+          <w:rStyle w:val="VerbatimChar"/>
+        </w:rPr>
+        <w:t xml:space="preserve">portscan</w:t>
+      </w:r>
+      <w:r>
+        <w:t xml:space="preserve">), orkestrasi pemindaian</w:t>
+      </w:r>
+      <w:r>
+        <w:t xml:space="preserve"> </w:t>
+      </w:r>
+      <w:r>
+        <w:t xml:space="preserve">(</w:t>
+      </w:r>
+      <w:r>
+        <w:rPr>
+          <w:rStyle w:val="VerbatimChar"/>
+        </w:rPr>
+        <w:t xml:space="preserve">scanner</w:t>
+      </w:r>
+      <w:r>
+        <w:t xml:space="preserve">), dan pemeriksaan TLS (</w:t>
+      </w:r>
+      <w:r>
+        <w:rPr>
+          <w:rStyle w:val="VerbatimChar"/>
+        </w:rPr>
+        <w:t xml:space="preserve">tlscheck</w:t>
+      </w:r>
+      <w:r>
+        <w:t xml:space="preserve">), dengan total</w:t>
+      </w:r>
+      <w:r>
+        <w:t xml:space="preserve"> </w:t>
+      </w:r>
+      <w:r>
+        <w:t xml:space="preserve">36 kasus uji. Seluruh kasus uji</w:t>
       </w:r>
       <w:r>
         <w:t xml:space="preserve"> </w:t>
@@ -8120,13 +8188,13 @@
         <w:t xml:space="preserve"> </w:t>
       </w:r>
       <w:r>
-        <w:t xml:space="preserve">(12/12), sebagaimana dirangkum pada</w:t>
-      </w:r>
-      <w:r>
-        <w:t xml:space="preserve"> </w:t>
-      </w:r>
-      <w:r>
-        <w:t xml:space="preserve">Tabel </w:t>
+        <w:t xml:space="preserve">(36/36); kasus-kasus uji</w:t>
+      </w:r>
+      <w:r>
+        <w:t xml:space="preserve"> </w:t>
+      </w:r>
+      <w:r>
+        <w:t xml:space="preserve">yang representatif dirangkum pada Tabel </w:t>
       </w:r>
       <w:hyperlink w:anchor="tab:unit">
         <w:r>
@@ -8137,13 +8205,19 @@
         </w:r>
       </w:hyperlink>
       <w:r>
-        <w:t xml:space="preserve">. Pengujian ini memvalidasi kebenaran logika pemetaan</w:t>
-      </w:r>
-      <w:r>
-        <w:t xml:space="preserve"> </w:t>
-      </w:r>
-      <w:r>
-        <w:t xml:space="preserve">OWASP, perhitungan skor, normalisasi MAC,</w:t>
+        <w:t xml:space="preserve">. Pengujian ini</w:t>
+      </w:r>
+      <w:r>
+        <w:t xml:space="preserve"> </w:t>
+      </w:r>
+      <w:r>
+        <w:t xml:space="preserve">memvalidasi antara lain kebenaran logika pemetaan OWASP, perhitungan</w:t>
+      </w:r>
+      <w:r>
+        <w:t xml:space="preserve"> </w:t>
+      </w:r>
+      <w:r>
+        <w:t xml:space="preserve">skor, normalisasi MAC,</w:t>
       </w:r>
       <w:r>
         <w:t xml:space="preserve"> </w:t>
@@ -8172,16 +8246,22 @@
         <w:t xml:space="preserve"> </w:t>
       </w:r>
       <w:r>
-        <w:t xml:space="preserve">tabel ARP, dan ekspansi CIDR.</w:t>
-      </w:r>
-    </w:p>
-    <w:bookmarkStart w:id="51" w:name="tab:unit"/>
+        <w:t xml:space="preserve">tabel</w:t>
+      </w:r>
+      <w:r>
+        <w:t xml:space="preserve"> </w:t>
+      </w:r>
+      <w:r>
+        <w:t xml:space="preserve">ARP, dan ekspansi CIDR.</w:t>
+      </w:r>
+    </w:p>
+    <w:bookmarkStart w:id="52" w:name="tab:unit"/>
     <w:p>
       <w:pPr>
         <w:pStyle w:val="TableCaption"/>
       </w:pPr>
       <w:r>
-        <w:t xml:space="preserve">Ringkasan Hasil Pengujian Unit (12/12 Lulus)</w:t>
+        <w:t xml:space="preserve">Ringkasan Kasus Uji Representatif (Total: 36/36 Lulus)</w:t>
       </w:r>
     </w:p>
     <w:tbl>
@@ -8189,7 +8269,7 @@
         <w:tblStyle w:val="Table"/>
         <w:tblW w:type="auto" w:w="0"/>
         <w:tblLook w:firstRow="1" w:lastRow="0" w:firstColumn="0" w:lastColumn="0" w:noHBand="0" w:noVBand="0" w:val="0020"/>
-        <w:tblCaption w:val="Ringkasan Hasil Pengujian Unit (12/12 Lulus)"/>
+        <w:tblCaption w:val="Ringkasan Kasus Uji Representatif (Total: 36/36 Lulus)"/>
       </w:tblPr>
       <w:tblGrid>
         <w:gridCol w:w="3960"/>
@@ -8718,9 +8798,9 @@
         </w:tc>
       </w:tr>
     </w:tbl>
-    <w:bookmarkEnd w:id="51"/>
     <w:bookmarkEnd w:id="52"/>
-    <w:bookmarkStart w:id="53" w:name="pengujian-fungsional-terkontrol"/>
+    <w:bookmarkEnd w:id="53"/>
+    <w:bookmarkStart w:id="54" w:name="pengujian-fungsional-terkontrol"/>
     <w:p>
       <w:pPr>
         <w:pStyle w:val="Heading2"/>
@@ -8824,8 +8904,8 @@
         <w:t xml:space="preserve">berfungsi sesuai rancangan.</w:t>
       </w:r>
     </w:p>
-    <w:bookmarkEnd w:id="53"/>
-    <w:bookmarkStart w:id="55" w:name="pengujian-pada-jaringan-rumah"/>
+    <w:bookmarkEnd w:id="54"/>
+    <w:bookmarkStart w:id="56" w:name="pengujian-pada-jaringan-rumah"/>
     <w:p>
       <w:pPr>
         <w:pStyle w:val="Heading2"/>
@@ -8892,7 +8972,7 @@
         <w:t xml:space="preserve">diisi dengan data perangkat IoT aktual hasil pengujian peneliti.)</w:t>
       </w:r>
     </w:p>
-    <w:bookmarkStart w:id="54" w:name="tab:hasil"/>
+    <w:bookmarkStart w:id="55" w:name="tab:hasil"/>
     <w:p>
       <w:pPr>
         <w:pStyle w:val="TableCaption"/>
@@ -9261,9 +9341,9 @@
         </w:tc>
       </w:tr>
     </w:tbl>
-    <w:bookmarkEnd w:id="54"/>
     <w:bookmarkEnd w:id="55"/>
-    <w:bookmarkStart w:id="56" w:name="pembahasan"/>
+    <w:bookmarkEnd w:id="56"/>
+    <w:bookmarkStart w:id="57" w:name="pembahasan"/>
     <w:p>
       <w:pPr>
         <w:pStyle w:val="Heading2"/>
@@ -9470,9 +9550,9 @@
         <w:t xml:space="preserve">terkorelasi dengan basis data CVE secara langsung.</w:t>
       </w:r>
     </w:p>
-    <w:bookmarkEnd w:id="56"/>
     <w:bookmarkEnd w:id="57"/>
-    <w:bookmarkStart w:id="60" w:name="kesimpulan-dan-saran"/>
+    <w:bookmarkEnd w:id="58"/>
+    <w:bookmarkStart w:id="61" w:name="kesimpulan-dan-saran"/>
     <w:p>
       <w:pPr>
         <w:pStyle w:val="Heading1"/>
@@ -9481,7 +9561,7 @@
         <w:t xml:space="preserve">Kesimpulan dan Saran</w:t>
       </w:r>
     </w:p>
-    <w:bookmarkStart w:id="58" w:name="kesimpulan"/>
+    <w:bookmarkStart w:id="59" w:name="kesimpulan"/>
     <w:p>
       <w:pPr>
         <w:pStyle w:val="Heading2"/>
@@ -9577,7 +9657,7 @@
         <w:t xml:space="preserve"> </w:t>
       </w:r>
       <w:r>
-        <w:t xml:space="preserve">mudah digunakan oleh pengguna rumahan. Pengujian unit (12/12 lulus) dan</w:t>
+        <w:t xml:space="preserve">mudah digunakan oleh pengguna rumahan. Pengujian unit (36/36 lulus) dan</w:t>
       </w:r>
       <w:r>
         <w:t xml:space="preserve"> </w:t>
@@ -9614,11 +9694,34 @@
         <w:t xml:space="preserve">actionable</w:t>
       </w:r>
       <w:r>
+        <w:t xml:space="preserve">. Seluruh kode sumber, kasus uji, dan</w:t>
+      </w:r>
+      <w:r>
+        <w:t xml:space="preserve"> </w:t>
+      </w:r>
+      <w:r>
+        <w:t xml:space="preserve">dokumentasi HomeGuard tersedia secara terbuka pada repositori GitHub:</w:t>
+      </w:r>
+      <w:r>
+        <w:t xml:space="preserve"> </w:t>
+      </w:r>
+      <w:hyperlink r:id="rId9">
+        <w:r>
+          <w:rPr>
+            <w:rStyle w:val="Hyperlink"/>
+          </w:rPr>
+          <w:t xml:space="preserve">https://github.com/gerrard046/HomeGuard</w:t>
+        </w:r>
+      </w:hyperlink>
+      <w:r>
+        <w:t xml:space="preserve"> </w:t>
+      </w:r>
+      <w:r>
         <w:t xml:space="preserve">.</w:t>
       </w:r>
     </w:p>
-    <w:bookmarkEnd w:id="58"/>
-    <w:bookmarkStart w:id="59" w:name="saran"/>
+    <w:bookmarkEnd w:id="59"/>
+    <w:bookmarkStart w:id="60" w:name="saran"/>
     <w:p>
       <w:pPr>
         <w:pStyle w:val="Heading2"/>
@@ -10286,9 +10389,38 @@
       <w:r>
         <w:t xml:space="preserve">, vol. 17, no. 3, pp. 12–22, Jul.–Sep. 2018.</w:t>
       </w:r>
-    </w:p>
-    <w:bookmarkEnd w:id="59"/>
+      <w:r>
+        <w:t xml:space="preserve"> </w:t>
+      </w:r>
+      <w:r>
+        <w:t xml:space="preserve">R. H. Marbun, R. G. R. Ramadhan, and R. Kresensia,</w:t>
+      </w:r>
+      <w:r>
+        <w:t xml:space="preserve"> </w:t>
+      </w:r>
+      <w:r>
+        <w:t xml:space="preserve">“HomeGuard: Aplikasi Pemindai Keamanan Jaringan Rumah,”</w:t>
+      </w:r>
+      <w:r>
+        <w:t xml:space="preserve"> </w:t>
+      </w:r>
+      <w:r>
+        <w:t xml:space="preserve">GitHub repository, 2026. [Online]. Available:</w:t>
+      </w:r>
+      <w:r>
+        <w:t xml:space="preserve"> </w:t>
+      </w:r>
+      <w:hyperlink r:id="rId9">
+        <w:r>
+          <w:rPr>
+            <w:rStyle w:val="Hyperlink"/>
+          </w:rPr>
+          <w:t xml:space="preserve">https://github.com/gerrard046/HomeGuard</w:t>
+        </w:r>
+      </w:hyperlink>
+    </w:p>
     <w:bookmarkEnd w:id="60"/>
+    <w:bookmarkEnd w:id="61"/>
     <w:sectPr>
       <w:footnotePr>
         <w:numRestart w:val="eachSect"/>

</xml_diff>